<commit_message>
Fertigstellung von Hardware Kapitel
</commit_message>
<xml_diff>
--- a/Dokumentation/Projektarbeit_Orange_Blue_Joystick_ma871cas_jo871sto.docx
+++ b/Dokumentation/Projektarbeit_Orange_Blue_Joystick_ma871cas_jo871sto.docx
@@ -11205,25 +11205,7 @@
           <w:szCs w:val="24"/>
           <w:lang w:eastAsia="de-DE"/>
         </w:rPr>
-        <w:t xml:space="preserve">zeigt einen Ausschnitt des mit </w:t>
-      </w:r>
-      <w:proofErr w:type="spellStart"/>
-      <w:r>
-        <w:rPr>
-          <w:rFonts w:ascii="Times New Roman" w:eastAsia="Times New Roman" w:hAnsi="Times New Roman" w:cs="Times New Roman"/>
-          <w:szCs w:val="24"/>
-          <w:lang w:eastAsia="de-DE"/>
-        </w:rPr>
-        <w:t>PuTTY</w:t>
-      </w:r>
-      <w:proofErr w:type="spellEnd"/>
-      <w:r>
-        <w:rPr>
-          <w:rFonts w:ascii="Times New Roman" w:eastAsia="Times New Roman" w:hAnsi="Times New Roman" w:cs="Times New Roman"/>
-          <w:szCs w:val="24"/>
-          <w:lang w:eastAsia="de-DE"/>
-        </w:rPr>
-        <w:t xml:space="preserve"> aufgezeichneten Kommunikationsverlaufs während einer zunehmenden Vorwärtsauslenkung des Fahrhebels.</w:t>
+        <w:t>zeigt einen Ausschnitt des mit PuTTY aufgezeichneten Kommunikationsverlaufs während einer zunehmenden Vorwärtsauslenkung des Fahrhebels.</w:t>
       </w:r>
     </w:p>
     <w:p>
@@ -11365,21 +11347,7 @@
         <w:rPr>
           <w:rFonts w:ascii="Times New Roman" w:hAnsi="Times New Roman" w:cs="Times New Roman"/>
         </w:rPr>
-        <w:t xml:space="preserve">Zwischen den Beschleunigungsframes sind die Antworten der Motorsteuerung zu erkennen. Nach dem Senden eines 0x25-Frames wird die RS485-Schnittstelle vom Sende- in den Empfangsbetrieb umgeschaltet. Die Motorsteuerung antwortet daraufhin mit einem eigenen Frame, bevor das Bedienmodul wieder das nächste Beschleunigungskommando sendet. Im dargestellten Ausschnitt sind dabei verschiedene Statusantworten mit Kennungen wie 0x27, 0x28, 0x29 oder 0x2D zu erkennen. Die Bedeutung dieser Antwortkennungen ist ebenfalls in der Bachelorarbeit dokumentiert. In dieser Tabelle sind jedoch nicht alle Kommandos festgehalten. Im Laufe der Projektarbeit haben wir bei dem Hersteller der Motoren </w:t>
-      </w:r>
-      <w:proofErr w:type="spellStart"/>
-      <w:r>
-        <w:rPr>
-          <w:rFonts w:ascii="Times New Roman" w:hAnsi="Times New Roman" w:cs="Times New Roman"/>
-        </w:rPr>
-        <w:t>ePropulsion</w:t>
-      </w:r>
-      <w:proofErr w:type="spellEnd"/>
-      <w:r>
-        <w:rPr>
-          <w:rFonts w:ascii="Times New Roman" w:hAnsi="Times New Roman" w:cs="Times New Roman"/>
-        </w:rPr>
-        <w:t xml:space="preserve"> eine vollständige Tabelle dieser Kommandos angefragt aber leider nie eine Antwort erhalten. </w:t>
+        <w:t xml:space="preserve">Zwischen den Beschleunigungsframes sind die Antworten der Motorsteuerung zu erkennen. Nach dem Senden eines 0x25-Frames wird die RS485-Schnittstelle vom Sende- in den Empfangsbetrieb umgeschaltet. Die Motorsteuerung antwortet daraufhin mit einem eigenen Frame, bevor das Bedienmodul wieder das nächste Beschleunigungskommando sendet. Im dargestellten Ausschnitt sind dabei verschiedene Statusantworten mit Kennungen wie 0x27, 0x28, 0x29 oder 0x2D zu erkennen. Die Bedeutung dieser Antwortkennungen ist ebenfalls in der Bachelorarbeit dokumentiert. In dieser Tabelle sind jedoch nicht alle Kommandos festgehalten. Im Laufe der Projektarbeit haben wir bei dem Hersteller der Motoren ePropulsion eine vollständige Tabelle dieser Kommandos angefragt aber leider nie eine Antwort erhalten. </w:t>
       </w:r>
     </w:p>
     <w:p>
@@ -11578,19 +11546,7 @@
         <w:pStyle w:val="StandardWeb"/>
       </w:pPr>
       <w:r>
-        <w:t>Die Hardware des überarbeiteten Kommunikationsmoduls wurde in mehrere Funktionsbereiche unterteilt</w:t>
-      </w:r>
-      <w:r>
-        <w:t xml:space="preserve">. </w:t>
-      </w:r>
-      <w:r>
-        <w:t>Im Mittelpunkt steht der Mikrocontroller STM32F303, der die Eingangssignale des Joysticks verarbeitet, die Kommunikation mit den Motorsteuerungen übernimmt und die weiteren Peripheriekomponenten ansteuert. Der STM32 wurde gewählt, da er die benötigten Schnittstellen</w:t>
-      </w:r>
-      <w:r>
-        <w:t>, wie UART oder I^2c,</w:t>
-      </w:r>
-      <w:r>
-        <w:t xml:space="preserve"> und ADC-Kanäle bereitstellt und gleichzeitig eine aktuelle sowie gut unterstützte Mikrocontrollerplattform für die weitere Entwicklung bietet. Ein Großteil der für die Umsetzung benötigten Standardbauteile und Steckverbinder wurde von Würth Elektronik zur Verfügung gestellt. Daher wurden, soweit technisch sinnvoll, Komponenten aus diesem Sortiment verwendet.</w:t>
+        <w:t>Die Hardware des überarbeiteten Kommunikationsmoduls wurde in mehrere Funktionsbereiche unterteilt. Im Mittelpunkt steht der Mikrocontroller STM32F303, der die Eingangssignale des Joysticks verarbeitet, die Kommunikation mit den Motorsteuerungen übernimmt und die weiteren Peripheriekomponenten ansteuert. Der STM32 wurde gewählt, da er die benötigten Schnittstellen, wie UART oder I^2c, und ADC-Kanäle bereitstellt und gleichzeitig eine aktuelle sowie gut unterstützte Mikrocontrollerplattform für die weitere Entwicklung bietet. Ein Großteil der für die Umsetzung benötigten Standardbauteile und Steckverbinder wurde von Würth Elektronik zur Verfügung gestellt. Daher wurden, soweit technisch sinnvoll, Komponenten aus diesem Sortiment verwendet.</w:t>
       </w:r>
     </w:p>
     <w:p>
@@ -11616,6 +11572,9 @@
         <w:jc w:val="center"/>
       </w:pPr>
       <w:r>
+        <w:rPr>
+          <w:noProof/>
+        </w:rPr>
         <w:drawing>
           <wp:inline distT="0" distB="0" distL="0" distR="0" wp14:anchorId="0D9258D2" wp14:editId="3DA5ACC1">
             <wp:extent cx="5233182" cy="3584363"/>
@@ -11728,6 +11687,9 @@
         <w:keepNext/>
       </w:pPr>
       <w:r>
+        <w:rPr>
+          <w:noProof/>
+        </w:rPr>
         <w:drawing>
           <wp:inline distT="0" distB="0" distL="0" distR="0" wp14:anchorId="2BBB2115" wp14:editId="07B559B4">
             <wp:extent cx="5760085" cy="3495675"/>
@@ -11799,13 +11761,7 @@
       </w:pPr>
       <w:r>
         <w:lastRenderedPageBreak/>
-        <w:t xml:space="preserve">Abbildung </w:t>
-      </w:r>
-      <w:r>
-        <w:t>3</w:t>
-      </w:r>
-      <w:r>
-        <w:t xml:space="preserve"> zeigt den entsprechenden Schaltplanausschnitt. Die digitalen Versorgungspins VDD werden mit 3,3 V versorgt. Zur lokalen Entkopplung sind an den Versorgungspins jeweils 100-nF-Kondensatoren gegen Masse vorgesehen. Zusätzlich befindet sich mit C14 ein 4,7-µF-Kondensator an der 3,3-V-Versorgung, der als zusätzlicher Puffer dient. Sämtliche VSS-Pins des Mikrocontrollers sind mit Masse verbunden.</w:t>
+        <w:t>Abbildung 3 zeigt den entsprechenden Schaltplanausschnitt. Die digitalen Versorgungspins VDD werden mit 3,3 V versorgt. Zur lokalen Entkopplung sind an den Versorgungspins jeweils 100-nF-Kondensatoren gegen Masse vorgesehen. Zusätzlich befindet sich mit C14 ein 4,7-µF-Kondensator an der 3,3-V-Versorgung, der als zusätzlicher Puffer dient. Sämtliche VSS-Pins des Mikrocontrollers sind mit Masse verbunden.</w:t>
       </w:r>
     </w:p>
     <w:p>
@@ -11813,21 +11769,7 @@
         <w:pStyle w:val="StandardWeb"/>
       </w:pPr>
       <w:r>
-        <w:t xml:space="preserve">Auch die analoge Versorgung des Mikrocontrollers wurde separat berücksichtigt. Der VDDA-Pin wird ebenfalls mit 3,3 V versorgt und über C15 mit 10 </w:t>
-      </w:r>
-      <w:proofErr w:type="spellStart"/>
-      <w:r>
-        <w:t>nF</w:t>
-      </w:r>
-      <w:proofErr w:type="spellEnd"/>
-      <w:r>
-        <w:t xml:space="preserve"> sowie C16 mit 1 µF gegen Masse entkoppelt. Der zugehörige VSSA-Pin ist mit Masse verbunden. Diese Beschaltung ist insbesondere für die Nutzung der ADC-Eingänge relevant, da über diese später die analogen Ausgangssignale des Joysticks eingelesen werden. Die Dimensionierung und Anordnung der Entkopplungskondensatoren </w:t>
-      </w:r>
-      <w:r>
-        <w:t>orientierten</w:t>
-      </w:r>
-      <w:r>
-        <w:t xml:space="preserve"> sich dabei an den Vorgaben des Herstellers.</w:t>
+        <w:t>Auch die analoge Versorgung des Mikrocontrollers wurde separat berücksichtigt. Der VDDA-Pin wird ebenfalls mit 3,3 V versorgt und über C15 mit 10 nF sowie C16 mit 1 µF gegen Masse entkoppelt. Der zugehörige VSSA-Pin ist mit Masse verbunden. Diese Beschaltung ist insbesondere für die Nutzung der ADC-Eingänge relevant, da über diese später die analogen Ausgangssignale des Joysticks eingelesen werden. Die Dimensionierung und Anordnung der Entkopplungskondensatoren orientierten sich dabei an den Vorgaben des Herstellers.</w:t>
       </w:r>
     </w:p>
     <w:p>
@@ -11835,15 +11777,7 @@
         <w:pStyle w:val="StandardWeb"/>
       </w:pPr>
       <w:r>
-        <w:t xml:space="preserve">Für die Takterzeugung wurde ein externer 16-MHz-Quarz vorgesehen. Dieser ist über die entsprechenden Oszillatorpins des Mikrocontrollers angeschlossen. Die beiden Lastkondensatoren C17 und C18 mit jeweils 22 </w:t>
-      </w:r>
-      <w:proofErr w:type="spellStart"/>
-      <w:r>
-        <w:t>pF</w:t>
-      </w:r>
-      <w:proofErr w:type="spellEnd"/>
-      <w:r>
-        <w:t xml:space="preserve"> ergänzen die Quarzbeschaltung. Der externe Takt dient als stabile Grundlage für den späteren Systemtakt des Mikrocontrollers und damit auch für die zeitkritische Kommunikation mit den Motorsteuerungen.</w:t>
+        <w:t>Für die Takterzeugung wurde ein externer 16-MHz-Quarz vorgesehen. Dieser ist über die entsprechenden Oszillatorpins des Mikrocontrollers angeschlossen. Die beiden Lastkondensatoren C17 und C18 mit jeweils 22 pF ergänzen die Quarzbeschaltung. Der externe Takt dient als stabile Grundlage für den späteren Systemtakt des Mikrocontrollers und damit auch für die zeitkritische Kommunikation mit den Motorsteuerungen.</w:t>
       </w:r>
     </w:p>
     <w:p>
@@ -11851,23 +11785,7 @@
         <w:pStyle w:val="StandardWeb"/>
       </w:pPr>
       <w:r>
-        <w:t xml:space="preserve">Der BOOT0-Pin wird über den Widerstand R13 mit 10 </w:t>
-      </w:r>
-      <w:proofErr w:type="spellStart"/>
-      <w:r>
-        <w:t>kΩ</w:t>
-      </w:r>
-      <w:proofErr w:type="spellEnd"/>
-      <w:r>
-        <w:t xml:space="preserve"> auf Masse gezogen. Dadurch liegt im normalen Betrieb ein definierter Low-Pegel an und der Mikrocontroller startet nach einem </w:t>
-      </w:r>
-      <w:proofErr w:type="spellStart"/>
-      <w:r>
-        <w:t>Reset</w:t>
-      </w:r>
-      <w:proofErr w:type="spellEnd"/>
-      <w:r>
-        <w:t xml:space="preserve"> aus dem internen Flash-Speicher. Ein unbeabsichtigtes Starten in einen anderen Boot-Modus wird damit verhindert.</w:t>
+        <w:t>Der BOOT0-Pin wird über den Widerstand R13 mit 10 kΩ auf Masse gezogen. Dadurch liegt im normalen Betrieb ein definierter Low-Pegel an und der Mikrocontroller startet nach einem Reset aus dem internen Flash-Speicher. Ein unbeabsichtigtes Starten in einen anderen Boot-Modus wird damit verhindert.</w:t>
       </w:r>
     </w:p>
     <w:p>
@@ -11875,31 +11793,7 @@
         <w:pStyle w:val="StandardWeb"/>
       </w:pPr>
       <w:r>
-        <w:t>Für einen manuellen Hardware-</w:t>
-      </w:r>
-      <w:proofErr w:type="spellStart"/>
-      <w:r>
-        <w:t>Reset</w:t>
-      </w:r>
-      <w:proofErr w:type="spellEnd"/>
-      <w:r>
-        <w:t xml:space="preserve"> ist der NRST-Pin über den Taster SW1 mit Masse verbunden. Zusätzlich ist C19 mit 100 </w:t>
-      </w:r>
-      <w:proofErr w:type="spellStart"/>
-      <w:r>
-        <w:t>nF</w:t>
-      </w:r>
-      <w:proofErr w:type="spellEnd"/>
-      <w:r>
-        <w:t xml:space="preserve"> an der </w:t>
-      </w:r>
-      <w:proofErr w:type="spellStart"/>
-      <w:r>
-        <w:t>Reset</w:t>
-      </w:r>
-      <w:proofErr w:type="spellEnd"/>
-      <w:r>
-        <w:t>-Leitung vorgesehen. Durch Betätigen des Tasters wird der NRST-Pin auf Low gezogen und der Mikrocontroller in einen definierten Ausgangszustand zurückgesetzt.</w:t>
+        <w:t>Für einen manuellen Hardware-Reset ist der NRST-Pin über den Taster SW1 mit Masse verbunden. Zusätzlich ist C19 mit 100 nF an der Reset-Leitung vorgesehen. Durch Betätigen des Tasters wird der NRST-Pin auf Low gezogen und der Mikrocontroller in einen definierten Ausgangszustand zurückgesetzt.</w:t>
       </w:r>
     </w:p>
     <w:p>
@@ -11939,10 +11833,7 @@
         <w:pStyle w:val="StandardWeb"/>
       </w:pPr>
       <w:r>
-        <w:t>Da beide Motoranschlüsse eine Versorgung bereitstellen, kann über den Wahlschalter SW3 ausgewählt werden, von welchem Motor die Platine gespeist wird. Die LEDs D5 und D6 zeigen an, ob am jeweiligen Anschluss eine Versorgungsspannung anliegt. Dadurch kann bereits bei der Inbetriebnahme schnell überprüft werden, o</w:t>
-      </w:r>
-      <w:r>
-        <w:t xml:space="preserve">b eine Spannung an beiden Eingängen anliegt. </w:t>
+        <w:t xml:space="preserve">Da beide Motoranschlüsse eine Versorgung bereitstellen, kann über den Wahlschalter SW3 ausgewählt werden, von welchem Motor die Platine gespeist wird. Die LEDs D5 und D6 zeigen an, ob am jeweiligen Anschluss eine Versorgungsspannung anliegt. Dadurch kann bereits bei der Inbetriebnahme schnell überprüft werden, ob eine Spannung an beiden Eingängen anliegt. </w:t>
       </w:r>
     </w:p>
     <w:p>
@@ -11969,13 +11860,7 @@
         <w:t>VCC_5V</w:t>
       </w:r>
       <w:r>
-        <w:t xml:space="preserve"> auf der Platine weitergeführt. Zur Stabilisierung dieser Spannung sind die Kondensatoren C11 mit 100 µF und C12 mit 10 µF vorgesehen. C11 dient als Puffer für langsamere oder kurzzeitige Spannungseinbrüche und Laständerungen. C12 ergänzt die Pufferung </w:t>
-      </w:r>
-      <w:r>
-        <w:t>bei schnellen auftretenden Störungen</w:t>
-      </w:r>
-      <w:r>
-        <w:t>. Gegenüber der bestehenden Hardware wurde bewusst auf eine deutlich größere Pufferkapazität verzichtet, da bei der Analyse keine Notwendigkeit für eine so große Kapazität festgestellt werden konnte.</w:t>
+        <w:t xml:space="preserve"> auf der Platine weitergeführt. Zur Stabilisierung dieser Spannung sind die Kondensatoren C11 mit 100 µF und C12 mit 10 µF vorgesehen. C11 dient als Puffer für langsamere oder kurzzeitige Spannungseinbrüche und Laständerungen. C12 ergänzt die Pufferung bei schnellen auftretenden Störungen. Gegenüber der bestehenden Hardware wurde bewusst auf eine deutlich größere Pufferkapazität verzichtet, da bei der Analyse keine Notwendigkeit für eine so große Kapazität festgestellt werden konnte.</w:t>
       </w:r>
     </w:p>
     <w:p>
@@ -11983,24 +11868,7 @@
         <w:pStyle w:val="StandardWeb"/>
       </w:pPr>
       <w:r>
-        <w:t xml:space="preserve">Da der neue Mikrocontroller und ein </w:t>
-      </w:r>
-      <w:r>
-        <w:t>Großt</w:t>
-      </w:r>
-      <w:r>
-        <w:t xml:space="preserve">eil der weiteren Logik mit 3,3 V betrieben werden, muss aus den vorhandenen 5 V zusätzlich eine 3,3-V-Versorgung erzeugt werden. Dafür wird der Low-Dropout-Regler TLV1117LV33 verwendet. Der LDO reduziert die Eingangsspannung von 5 V auf eine konstante Ausgangsspannung von 3,3 V. Die Spannungsdifferenz wird dabei im Regler in Wärme umgesetzt. Aufgrund </w:t>
-      </w:r>
-      <w:proofErr w:type="gramStart"/>
-      <w:r>
-        <w:t>der vergleichsweise</w:t>
-      </w:r>
-      <w:proofErr w:type="gramEnd"/>
-      <w:r>
-        <w:t xml:space="preserve"> geringen Leistungsaufnahme des Kommunikationsmoduls ist diese einfache Form der Spannungswandlung für die Anwendung ausreichend.</w:t>
-      </w:r>
-      <w:r>
-        <w:t xml:space="preserve"> Außerdem wurde beim Platinen Routing und Layout darauf geachtet, dass eine größere Zone um den LDO gelegt wurde, um die Wärmeabfuhr zu optimieren. </w:t>
+        <w:t xml:space="preserve">Da der neue Mikrocontroller und ein Großteil der weiteren Logik mit 3,3 V betrieben werden, muss aus den vorhandenen 5 V zusätzlich eine 3,3-V-Versorgung erzeugt werden. Dafür wird der Low-Dropout-Regler TLV1117LV33 verwendet. Der LDO reduziert die Eingangsspannung von 5 V auf eine konstante Ausgangsspannung von 3,3 V. Die Spannungsdifferenz wird dabei im Regler in Wärme umgesetzt. Aufgrund der vergleichsweise geringen Leistungsaufnahme des Kommunikationsmoduls ist diese einfache Form der Spannungswandlung für die Anwendung ausreichend. Außerdem wurde beim Platinen Routing und Layout darauf geachtet, dass eine größere Zone um den LDO gelegt wurde, um die Wärmeabfuhr zu optimieren. </w:t>
       </w:r>
     </w:p>
     <w:p>
@@ -12008,19 +11876,7 @@
         <w:pStyle w:val="StandardWeb"/>
       </w:pPr>
       <w:r>
-        <w:t>Am Eingang und Ausgang des Spannungsreglers befinden sich mit C7 und C6 jeweils 1-µF-Kondensatoren</w:t>
-      </w:r>
-      <w:r>
-        <w:t>, die Werte stammten aus dem Datenblatt von Texas Industries</w:t>
-      </w:r>
-      <w:r>
-        <w:t>. Die</w:t>
-      </w:r>
-      <w:r>
-        <w:t xml:space="preserve"> beiden Kondensatoren</w:t>
-      </w:r>
-      <w:r>
-        <w:t xml:space="preserve"> dienen der Stabilisierung des Reglers und unterstützen ein sauberes Ein- und Ausschwingverhalten. Die erzeugten 3,3 V werden anschließend als Versorgungsschiene </w:t>
+        <w:t xml:space="preserve">Am Eingang und Ausgang des Spannungsreglers befinden sich mit C7 und C6 jeweils 1-µF-Kondensatoren, die Werte stammten aus dem Datenblatt von Texas Industries. Die beiden Kondensatoren dienen der Stabilisierung des Reglers und unterstützen ein sauberes Ein- und Ausschwingverhalten. Die erzeugten 3,3 V werden anschließend als Versorgungsschiene </w:t>
       </w:r>
       <w:r>
         <w:rPr>
@@ -12060,13 +11916,7 @@
         <w:pStyle w:val="StandardWeb"/>
       </w:pPr>
       <w:r>
-        <w:t xml:space="preserve">Abbildung </w:t>
-      </w:r>
-      <w:r>
-        <w:t>4</w:t>
-      </w:r>
-      <w:r>
-        <w:t xml:space="preserve"> zeigt den vollständigen Aufbau der Spannungsversorgung von den Motoranschlüssen J3 und J4 über Wahlschalter und Feinsicherung bis zur Erzeugung der 3,3-V-Versorgung.</w:t>
+        <w:t>Abbildung 4 zeigt den vollständigen Aufbau der Spannungsversorgung von den Motoranschlüssen J3 und J4 über Wahlschalter und Feinsicherung bis zur Erzeugung der 3,3-V-Versorgung.</w:t>
       </w:r>
     </w:p>
     <w:p>
@@ -12074,6 +11924,9 @@
         <w:keepNext/>
       </w:pPr>
       <w:r>
+        <w:rPr>
+          <w:noProof/>
+        </w:rPr>
         <w:drawing>
           <wp:inline distT="0" distB="0" distL="0" distR="0" wp14:anchorId="7CF5FC86" wp14:editId="71C18346">
             <wp:extent cx="5760085" cy="3300730"/>
@@ -12163,6 +12016,9 @@
         <w:jc w:val="center"/>
       </w:pPr>
       <w:r>
+        <w:rPr>
+          <w:noProof/>
+        </w:rPr>
         <w:lastRenderedPageBreak/>
         <w:drawing>
           <wp:inline distT="0" distB="0" distL="0" distR="0" wp14:anchorId="36B06FCA" wp14:editId="29BD5F57">
@@ -12924,49 +12780,7 @@
         <w:rPr>
           <w:rFonts w:ascii="Times New Roman" w:eastAsiaTheme="majorEastAsia" w:hAnsi="Times New Roman" w:cs="Times New Roman"/>
         </w:rPr>
-        <w:t xml:space="preserve">Für den unteren Widerstand wurde ein verfügbarer Wert von 8,2 </w:t>
-      </w:r>
-      <w:proofErr w:type="spellStart"/>
-      <w:r>
-        <w:rPr>
-          <w:rFonts w:ascii="Times New Roman" w:eastAsiaTheme="majorEastAsia" w:hAnsi="Times New Roman" w:cs="Times New Roman"/>
-        </w:rPr>
-        <w:t>kΩ</w:t>
-      </w:r>
-      <w:proofErr w:type="spellEnd"/>
-      <w:r>
-        <w:rPr>
-          <w:rFonts w:ascii="Times New Roman" w:eastAsiaTheme="majorEastAsia" w:hAnsi="Times New Roman" w:cs="Times New Roman"/>
-        </w:rPr>
-        <w:t xml:space="preserve"> gewählt. Daraus ergibt sich für den oberen Widerstand ein rechnerischer Wert von ungefähr 4,8 </w:t>
-      </w:r>
-      <w:proofErr w:type="spellStart"/>
-      <w:r>
-        <w:rPr>
-          <w:rFonts w:ascii="Times New Roman" w:eastAsiaTheme="majorEastAsia" w:hAnsi="Times New Roman" w:cs="Times New Roman"/>
-        </w:rPr>
-        <w:t>kΩ</w:t>
-      </w:r>
-      <w:proofErr w:type="spellEnd"/>
-      <w:r>
-        <w:rPr>
-          <w:rFonts w:ascii="Times New Roman" w:eastAsiaTheme="majorEastAsia" w:hAnsi="Times New Roman" w:cs="Times New Roman"/>
-        </w:rPr>
-        <w:t xml:space="preserve">. Als nächstliegender verfügbarer Standardwert wurde 4,7 </w:t>
-      </w:r>
-      <w:proofErr w:type="spellStart"/>
-      <w:r>
-        <w:rPr>
-          <w:rFonts w:ascii="Times New Roman" w:eastAsiaTheme="majorEastAsia" w:hAnsi="Times New Roman" w:cs="Times New Roman"/>
-        </w:rPr>
-        <w:t>kΩ</w:t>
-      </w:r>
-      <w:proofErr w:type="spellEnd"/>
-      <w:r>
-        <w:rPr>
-          <w:rFonts w:ascii="Times New Roman" w:eastAsiaTheme="majorEastAsia" w:hAnsi="Times New Roman" w:cs="Times New Roman"/>
-        </w:rPr>
-        <w:t xml:space="preserve"> verwendet. </w:t>
+        <w:t xml:space="preserve">Für den unteren Widerstand wurde ein verfügbarer Wert von 8,2 kΩ gewählt. Daraus ergibt sich für den oberen Widerstand ein rechnerischer Wert von ungefähr 4,8 kΩ. Als nächstliegender verfügbarer Standardwert wurde 4,7 kΩ verwendet. </w:t>
       </w:r>
     </w:p>
     <w:p>
@@ -13045,35 +12859,33 @@
         <w:rPr>
           <w:rFonts w:ascii="Times New Roman" w:eastAsiaTheme="majorEastAsia" w:hAnsi="Times New Roman" w:cs="Times New Roman"/>
         </w:rPr>
-        <w:t xml:space="preserve">Mit den tatsächlich eingesetzten Widerständen von 4,7 </w:t>
-      </w:r>
-      <w:proofErr w:type="spellStart"/>
-      <w:r>
+        <w:t>Mit den tatsächlich eingesetzten Widerständen von 4,7 kΩ und 8,2 kΩ ergibt sich bei einer Eingangsspannung von 5 V eine maximale ADC-Spannung von etwa 3,18 V. Damit bleibt weiterhin ein ausreichender Abstand zur 3,3-V-Grenze des Mikrocontrollers.</w:t>
+      </w:r>
+    </w:p>
+    <w:p>
+      <w:pPr>
         <w:rPr>
           <w:rFonts w:ascii="Times New Roman" w:eastAsiaTheme="majorEastAsia" w:hAnsi="Times New Roman" w:cs="Times New Roman"/>
         </w:rPr>
-        <w:t>kΩ</w:t>
-      </w:r>
-      <w:proofErr w:type="spellEnd"/>
+      </w:pPr>
       <w:r>
         <w:rPr>
           <w:rFonts w:ascii="Times New Roman" w:eastAsiaTheme="majorEastAsia" w:hAnsi="Times New Roman" w:cs="Times New Roman"/>
         </w:rPr>
-        <w:t xml:space="preserve"> und 8,2 </w:t>
-      </w:r>
-      <w:proofErr w:type="spellStart"/>
-      <w:r>
+        <w:t>Parallel zum unteren Widerstand des jeweiligen Spannungsteilers befindet sich ein Kondensator mit 10 nF. Zusammen mit den Widerständen bildet dieser einen einfachen Tiefpass und reduziert hochfrequente Störungen auf den analogen Joysticksignalen. Dadurch werden die am ADC anliegenden Spannungswerte stabilisiert und die spätere Auswertung in der Software weniger empfindlich gegenüber kurzen Störimpulsen.</w:t>
+      </w:r>
+    </w:p>
+    <w:p>
+      <w:pPr>
         <w:rPr>
           <w:rFonts w:ascii="Times New Roman" w:eastAsiaTheme="majorEastAsia" w:hAnsi="Times New Roman" w:cs="Times New Roman"/>
         </w:rPr>
-        <w:t>kΩ</w:t>
-      </w:r>
-      <w:proofErr w:type="spellEnd"/>
+      </w:pPr>
       <w:r>
         <w:rPr>
           <w:rFonts w:ascii="Times New Roman" w:eastAsiaTheme="majorEastAsia" w:hAnsi="Times New Roman" w:cs="Times New Roman"/>
         </w:rPr>
-        <w:t xml:space="preserve"> ergibt sich bei einer Eingangsspannung von 5 V eine maximale ADC-Spannung von etwa 3,18 V. Damit bleibt weiterhin ein ausreichender Abstand zur 3,3-V-Grenze des Mikrocontrollers.</w:t>
+        <w:t>Die beiden Joysticktaster werden ebenfalls über den vorhandenen Steckverbinder auf die Platine geführt und über GPIO-Eingänge des STM32 ausgewertet. Für die drei analogen Achsen wurden zusätzlich Testpunkte vorgesehen. Dadurch können die am Mikrocontroller anliegenden Spannungen während der Inbetriebnahme direkt gemessen und die Funktion der Spannungsteiler sowie der Joysticksensoren überprüft werden.</w:t>
       </w:r>
     </w:p>
     <w:p>
@@ -13086,73 +12898,19 @@
         <w:rPr>
           <w:rFonts w:ascii="Times New Roman" w:eastAsiaTheme="majorEastAsia" w:hAnsi="Times New Roman" w:cs="Times New Roman"/>
         </w:rPr>
-        <w:t xml:space="preserve">Parallel zum unteren Widerstand des jeweiligen Spannungsteilers befindet sich ein Kondensator mit 10 </w:t>
-      </w:r>
-      <w:proofErr w:type="spellStart"/>
+        <w:t xml:space="preserve">Abbildung </w:t>
+      </w:r>
       <w:r>
         <w:rPr>
           <w:rFonts w:ascii="Times New Roman" w:eastAsiaTheme="majorEastAsia" w:hAnsi="Times New Roman" w:cs="Times New Roman"/>
         </w:rPr>
-        <w:t>nF</w:t>
-      </w:r>
-      <w:proofErr w:type="spellEnd"/>
+        <w:t>6</w:t>
+      </w:r>
       <w:r>
         <w:rPr>
           <w:rFonts w:ascii="Times New Roman" w:eastAsiaTheme="majorEastAsia" w:hAnsi="Times New Roman" w:cs="Times New Roman"/>
         </w:rPr>
-        <w:t>. Zusammen mit den Widerständen bildet dieser einen einfachen Tiefpass und reduziert hochfrequente Störungen auf den analogen Joysticksignalen. Dadurch werden die am ADC anliegenden Spannungswerte stabilisiert und die spätere Auswertung in der Software weniger empfindlich gegenüber kurzen Störimpulsen.</w:t>
-      </w:r>
-    </w:p>
-    <w:p>
-      <w:pPr>
-        <w:rPr>
-          <w:rFonts w:ascii="Times New Roman" w:eastAsiaTheme="majorEastAsia" w:hAnsi="Times New Roman" w:cs="Times New Roman"/>
-        </w:rPr>
-      </w:pPr>
-      <w:r>
-        <w:rPr>
-          <w:rFonts w:ascii="Times New Roman" w:eastAsiaTheme="majorEastAsia" w:hAnsi="Times New Roman" w:cs="Times New Roman"/>
-        </w:rPr>
-        <w:t>Die beiden Joysticktaster werden ebenfalls über den vorhandenen Steckverbinder auf die Platine geführt und über GPIO-Eingänge des STM32 ausgewertet. Für die drei analogen Achsen wurden zusätzlich Testpunkte vorgesehen. Dadurch können die am Mikrocontroller anliegenden Spannungen während der Inbetriebnahme direkt gemessen und die Funktion der Spannungsteiler sowie der Joysticksensoren überprüft werden.</w:t>
-      </w:r>
-    </w:p>
-    <w:p>
-      <w:pPr>
-        <w:rPr>
-          <w:rFonts w:ascii="Times New Roman" w:eastAsiaTheme="majorEastAsia" w:hAnsi="Times New Roman" w:cs="Times New Roman"/>
-        </w:rPr>
-      </w:pPr>
-      <w:r>
-        <w:rPr>
-          <w:rFonts w:ascii="Times New Roman" w:eastAsiaTheme="majorEastAsia" w:hAnsi="Times New Roman" w:cs="Times New Roman"/>
-        </w:rPr>
-        <w:t xml:space="preserve">Abbildung </w:t>
-      </w:r>
-      <w:r>
-        <w:rPr>
-          <w:rFonts w:ascii="Times New Roman" w:eastAsiaTheme="majorEastAsia" w:hAnsi="Times New Roman" w:cs="Times New Roman"/>
-        </w:rPr>
-        <w:t>6</w:t>
-      </w:r>
-      <w:r>
-        <w:rPr>
-          <w:rFonts w:ascii="Times New Roman" w:eastAsiaTheme="majorEastAsia" w:hAnsi="Times New Roman" w:cs="Times New Roman"/>
-        </w:rPr>
-        <w:t xml:space="preserve"> zeigt die vollständige Anbindung des Joysticks einschließlich der drei Spannungsteiler, der Filterkondensatoren, der </w:t>
-      </w:r>
-      <w:proofErr w:type="spellStart"/>
-      <w:r>
-        <w:rPr>
-          <w:rFonts w:ascii="Times New Roman" w:eastAsiaTheme="majorEastAsia" w:hAnsi="Times New Roman" w:cs="Times New Roman"/>
-        </w:rPr>
-        <w:t>Tasteranschlüsse</w:t>
-      </w:r>
-      <w:proofErr w:type="spellEnd"/>
-      <w:r>
-        <w:rPr>
-          <w:rFonts w:ascii="Times New Roman" w:eastAsiaTheme="majorEastAsia" w:hAnsi="Times New Roman" w:cs="Times New Roman"/>
-        </w:rPr>
-        <w:t xml:space="preserve"> und der vorgesehenen Testpunkte.</w:t>
+        <w:t xml:space="preserve"> zeigt die vollständige Anbindung des Joysticks einschließlich der drei Spannungsteiler, der Filterkondensatoren, der Tasteranschlüsse und der vorgesehenen Testpunkte.</w:t>
       </w:r>
     </w:p>
     <w:p>
@@ -13173,16 +12931,18 @@
       <w:pPr>
         <w:keepNext/>
         <w:spacing w:line="259" w:lineRule="auto"/>
+        <w:jc w:val="center"/>
       </w:pPr>
       <w:r>
         <w:rPr>
           <w:rFonts w:ascii="Times New Roman" w:eastAsiaTheme="majorEastAsia" w:hAnsi="Times New Roman" w:cs="Times New Roman"/>
+          <w:noProof/>
         </w:rPr>
         <w:lastRenderedPageBreak/>
         <w:drawing>
-          <wp:inline distT="0" distB="0" distL="0" distR="0" wp14:anchorId="07FE9B9F" wp14:editId="4DA4E778">
-            <wp:extent cx="4349974" cy="3397425"/>
-            <wp:effectExtent l="0" t="0" r="0" b="0"/>
+          <wp:inline distT="0" distB="0" distL="0" distR="0" wp14:anchorId="07FE9B9F" wp14:editId="56F025CA">
+            <wp:extent cx="3600530" cy="2812093"/>
+            <wp:effectExtent l="0" t="0" r="0" b="7620"/>
             <wp:docPr id="879871620" name="Grafik 1"/>
             <wp:cNvGraphicFramePr>
               <a:graphicFrameLocks xmlns:a="http://schemas.openxmlformats.org/drawingml/2006/main" noChangeAspect="1"/>
@@ -13203,7 +12963,7 @@
                   <pic:spPr>
                     <a:xfrm>
                       <a:off x="0" y="0"/>
-                      <a:ext cx="4349974" cy="3397425"/>
+                      <a:ext cx="3607739" cy="2817724"/>
                     </a:xfrm>
                     <a:prstGeom prst="rect">
                       <a:avLst/>
@@ -13236,77 +12996,679 @@
         <w:t>, Joystickansteuerung</w:t>
       </w:r>
     </w:p>
+    <w:p>
+      <w:pPr>
+        <w:pStyle w:val="berschrift2"/>
+        <w:rPr>
+          <w:rFonts w:ascii="Times New Roman" w:hAnsi="Times New Roman" w:cs="Times New Roman"/>
+        </w:rPr>
+      </w:pPr>
+      <w:bookmarkStart w:id="14" w:name="_Toc238643456"/>
+      <w:r>
+        <w:rPr>
+          <w:rFonts w:ascii="Times New Roman" w:hAnsi="Times New Roman" w:cs="Times New Roman"/>
+        </w:rPr>
+        <w:t>Programmierschnittstelle</w:t>
+      </w:r>
+      <w:bookmarkEnd w:id="14"/>
+    </w:p>
+    <w:p>
+      <w:pPr>
+        <w:pStyle w:val="StandardWeb"/>
+      </w:pPr>
+      <w:r>
+        <w:t>Für die Programmierung und das Debugging des STM32 wurde ein bereits vorhandener ST-LINK/V2 verwendet. Als Schnittstelle wurde SWD gewählt, da hierfür nur wenige Signalleitungen benötigt werden und sich die Verbindung dadurch einfacher umsetzen lässt als beispielsweise mit JTAG. Gleichzeitig bietet SWD alle für die Entwicklung benötigten Funktionen zum Programmieren und Debuggen des Mikrocontrollers.</w:t>
+      </w:r>
+    </w:p>
+    <w:p>
+      <w:pPr>
+        <w:pStyle w:val="StandardWeb"/>
+      </w:pPr>
+      <w:r>
+        <w:t>Die Verbindung zum ST-LINK erfolgt über den Steck</w:t>
+      </w:r>
+      <w:r>
+        <w:t>er</w:t>
+      </w:r>
+      <w:r>
+        <w:t xml:space="preserve"> J5. Dabei werden insbesondere die Signale SWDIO, SWCLK und NRST sowie 3,3 V und GND herausgeführt. Zusätzlich ist die SWO-Leitung vorgesehen. Für den Anschluss wurde ein einfacher Steckverbinder aus dem Sortiment von Würth Elektronik verwendet.</w:t>
+      </w:r>
+      <w:r>
+        <w:t xml:space="preserve"> Die Abbildung 7 zeigt den sehr simplen Aufbau. </w:t>
+      </w:r>
+    </w:p>
+    <w:p>
+      <w:pPr>
+        <w:pStyle w:val="StandardWeb"/>
+        <w:keepNext/>
+        <w:jc w:val="center"/>
+      </w:pPr>
+      <w:r>
+        <w:drawing>
+          <wp:inline distT="0" distB="0" distL="0" distR="0" wp14:anchorId="17F8D91B" wp14:editId="0212F8C0">
+            <wp:extent cx="3125244" cy="1793974"/>
+            <wp:effectExtent l="0" t="0" r="0" b="0"/>
+            <wp:docPr id="2029848238" name="Grafik 1"/>
+            <wp:cNvGraphicFramePr>
+              <a:graphicFrameLocks xmlns:a="http://schemas.openxmlformats.org/drawingml/2006/main" noChangeAspect="1"/>
+            </wp:cNvGraphicFramePr>
+            <a:graphic xmlns:a="http://schemas.openxmlformats.org/drawingml/2006/main">
+              <a:graphicData uri="http://schemas.openxmlformats.org/drawingml/2006/picture">
+                <pic:pic xmlns:pic="http://schemas.openxmlformats.org/drawingml/2006/picture">
+                  <pic:nvPicPr>
+                    <pic:cNvPr id="2029848238" name=""/>
+                    <pic:cNvPicPr/>
+                  </pic:nvPicPr>
+                  <pic:blipFill>
+                    <a:blip r:embed="rId17"/>
+                    <a:stretch>
+                      <a:fillRect/>
+                    </a:stretch>
+                  </pic:blipFill>
+                  <pic:spPr>
+                    <a:xfrm>
+                      <a:off x="0" y="0"/>
+                      <a:ext cx="3132779" cy="1798299"/>
+                    </a:xfrm>
+                    <a:prstGeom prst="rect">
+                      <a:avLst/>
+                    </a:prstGeom>
+                  </pic:spPr>
+                </pic:pic>
+              </a:graphicData>
+            </a:graphic>
+          </wp:inline>
+        </w:drawing>
+      </w:r>
+    </w:p>
+    <w:p>
+      <w:pPr>
+        <w:pStyle w:val="Beschriftung"/>
+        <w:jc w:val="center"/>
+      </w:pPr>
+      <w:r>
+        <w:t xml:space="preserve">Abbildung </w:t>
+      </w:r>
+      <w:fldSimple w:instr=" SEQ Abbildung \* ARABIC ">
+        <w:r>
+          <w:rPr>
+            <w:noProof/>
+          </w:rPr>
+          <w:t>7</w:t>
+        </w:r>
+      </w:fldSimple>
+      <w:r>
+        <w:t>, Programmierschnittstelle SWD</w:t>
+      </w:r>
+    </w:p>
+    <w:p>
+      <w:pPr>
+        <w:pStyle w:val="StandardWeb"/>
+      </w:pPr>
+      <w:r>
+        <w:t>Durch die herausgeführte Programmierschnittstelle kann der Mikrocontroller direkt auf der bestückten Platine programmiert und während der Softwareentwicklung debuggt werden, ohne dass zusätzliche Hardwareänderungen notwendig sind.</w:t>
+      </w:r>
+    </w:p>
+    <w:p>
+      <w:pPr>
+        <w:pStyle w:val="StandardWeb"/>
+      </w:pPr>
+      <w:r>
+        <w:br w:type="page"/>
+      </w:r>
+    </w:p>
+    <w:p>
+      <w:pPr>
+        <w:pStyle w:val="berschrift2"/>
+        <w:rPr>
+          <w:rFonts w:ascii="Times New Roman" w:hAnsi="Times New Roman" w:cs="Times New Roman"/>
+        </w:rPr>
+      </w:pPr>
+      <w:bookmarkStart w:id="15" w:name="_Toc238643457"/>
+      <w:r>
+        <w:rPr>
+          <w:rFonts w:ascii="Times New Roman" w:hAnsi="Times New Roman" w:cs="Times New Roman"/>
+        </w:rPr>
+        <w:lastRenderedPageBreak/>
+        <w:t>Displayanschluss</w:t>
+      </w:r>
+      <w:bookmarkEnd w:id="15"/>
+    </w:p>
+    <w:p>
+      <w:pPr>
+        <w:pStyle w:val="StandardWeb"/>
+      </w:pPr>
+      <w:bookmarkStart w:id="16" w:name="_Toc238643458"/>
+      <w:r>
+        <w:t>Für die Anzeige der Betriebs- und Statusinformationen wird ein 4×20-Zeichen-Display verwendet. Im Gegensatz zum ursprünglichen Kommunikationsmodul wurde bei der neuen Umsetzung ein Display mit bereits integriertem I²C-Adapter ausgewählt. Dadurch konnte auf einen zusätzlichen Portexpander auf der Platine verzichtet werden, da die Umsetzung der I²C-Signale auf die Displayansteuerung direkt am Display erfolgt.</w:t>
+      </w:r>
+    </w:p>
+    <w:p>
+      <w:pPr>
+        <w:pStyle w:val="StandardWeb"/>
+      </w:pPr>
+      <w:r>
+        <w:t>Für die Verbindung werden daher lediglich vier Leitungen benötigt: 3,3 V, GND sowie die beiden I²C-Signale SDA und SCL. Diese werden über den Steckverbinder J1 von der Platine zum Display geführt. Die für den I²C-Bus erforderlichen Pull-up-Widerstände sind bereits auf dem verwendeten Adaptermodul vorhanden und mussten deshalb nicht zusätzlich auf der Platine vorgesehen werden.</w:t>
+      </w:r>
+    </w:p>
+    <w:p>
+      <w:pPr>
+        <w:pStyle w:val="StandardWeb"/>
+        <w:keepNext/>
+        <w:jc w:val="center"/>
+      </w:pPr>
+      <w:r>
+        <w:drawing>
+          <wp:inline distT="0" distB="0" distL="0" distR="0" wp14:anchorId="4C15C46B" wp14:editId="7A1D0A32">
+            <wp:extent cx="4286470" cy="2038455"/>
+            <wp:effectExtent l="0" t="0" r="0" b="0"/>
+            <wp:docPr id="1207698816" name="Grafik 1"/>
+            <wp:cNvGraphicFramePr>
+              <a:graphicFrameLocks xmlns:a="http://schemas.openxmlformats.org/drawingml/2006/main" noChangeAspect="1"/>
+            </wp:cNvGraphicFramePr>
+            <a:graphic xmlns:a="http://schemas.openxmlformats.org/drawingml/2006/main">
+              <a:graphicData uri="http://schemas.openxmlformats.org/drawingml/2006/picture">
+                <pic:pic xmlns:pic="http://schemas.openxmlformats.org/drawingml/2006/picture">
+                  <pic:nvPicPr>
+                    <pic:cNvPr id="1207698816" name=""/>
+                    <pic:cNvPicPr/>
+                  </pic:nvPicPr>
+                  <pic:blipFill>
+                    <a:blip r:embed="rId18"/>
+                    <a:stretch>
+                      <a:fillRect/>
+                    </a:stretch>
+                  </pic:blipFill>
+                  <pic:spPr>
+                    <a:xfrm>
+                      <a:off x="0" y="0"/>
+                      <a:ext cx="4286470" cy="2038455"/>
+                    </a:xfrm>
+                    <a:prstGeom prst="rect">
+                      <a:avLst/>
+                    </a:prstGeom>
+                  </pic:spPr>
+                </pic:pic>
+              </a:graphicData>
+            </a:graphic>
+          </wp:inline>
+        </w:drawing>
+      </w:r>
+    </w:p>
+    <w:p>
+      <w:pPr>
+        <w:pStyle w:val="Beschriftung"/>
+        <w:jc w:val="center"/>
+      </w:pPr>
+      <w:r>
+        <w:t xml:space="preserve">Abbildung </w:t>
+      </w:r>
+      <w:fldSimple w:instr=" SEQ Abbildung \* ARABIC ">
+        <w:r>
+          <w:rPr>
+            <w:noProof/>
+          </w:rPr>
+          <w:t>8</w:t>
+        </w:r>
+      </w:fldSimple>
+      <w:r>
+        <w:t>, Displayanschluss</w:t>
+      </w:r>
+    </w:p>
+    <w:p>
+      <w:pPr>
+        <w:pStyle w:val="StandardWeb"/>
+      </w:pPr>
+      <w:r>
+        <w:t>Durch diese Lösung konnte die Displayanbindung gegenüber dem ursprünglichen Aufbau vereinfacht und die Anzahl der benötigten Bauteile auf der Platine reduziert werden. Die auf dem Display dargestellten Informationen und deren softwareseitige Ansteuerung werden im entsprechenden Softwarekapitel näher beschrieben.</w:t>
+      </w:r>
+    </w:p>
+    <w:p>
+      <w:pPr>
+        <w:pStyle w:val="StandardWeb"/>
+      </w:pPr>
+      <w:r>
+        <w:t xml:space="preserve">Nachdem damit alle wesentlichen Schaltungsteile und Schnittstellen beschrieben wurden, wird im folgenden Abschnitt deren Umsetzung im Leiterplattenlayout betrachtet. Dabei </w:t>
+      </w:r>
+      <w:r>
+        <w:t>steht</w:t>
+      </w:r>
+      <w:r>
+        <w:t xml:space="preserve"> insbesondere die Platzierung der Bauteile, die Leiterbahnführung und der Aufbau der Masseflächen im Mittelpunkt.</w:t>
+      </w:r>
+    </w:p>
+    <w:p>
+      <w:pPr>
+        <w:spacing w:line="259" w:lineRule="auto"/>
+        <w:rPr>
+          <w:rFonts w:ascii="Times New Roman" w:eastAsia="Times New Roman" w:hAnsi="Times New Roman" w:cs="Times New Roman"/>
+          <w:szCs w:val="24"/>
+          <w:lang w:eastAsia="de-DE"/>
+        </w:rPr>
+      </w:pPr>
+      <w:r>
+        <w:br w:type="page"/>
+      </w:r>
+    </w:p>
+    <w:p>
+      <w:pPr>
+        <w:pStyle w:val="berschrift2"/>
+        <w:rPr>
+          <w:rFonts w:ascii="Times New Roman" w:hAnsi="Times New Roman" w:cs="Times New Roman"/>
+        </w:rPr>
+      </w:pPr>
+      <w:r>
+        <w:rPr>
+          <w:rFonts w:ascii="Times New Roman" w:hAnsi="Times New Roman" w:cs="Times New Roman"/>
+        </w:rPr>
+        <w:lastRenderedPageBreak/>
+        <w:t>Platinen Layout und Routing</w:t>
+      </w:r>
+      <w:bookmarkEnd w:id="16"/>
+    </w:p>
+    <w:p>
+      <w:pPr>
+        <w:pStyle w:val="StandardWeb"/>
+      </w:pPr>
+      <w:r>
+        <w:t xml:space="preserve">Nach Fertigstellung des Schaltplans wurde das </w:t>
+      </w:r>
+      <w:r>
+        <w:t>PCB-L</w:t>
+      </w:r>
+      <w:r>
+        <w:t>ayout in KiCad erstellt. Für die Umsetzung wurde eine zweilagige Leiterplatte mit den Kupferlagen F.Cu und B.Cu gewählt. Da die Schaltung aus einer überschaubaren Anzahl von Bauteilen und Signalen besteht, konnten sämtliche Verbindungen auf diesen beiden Lagen realisiert werden. Ein vierlagiger Aufbau hätte für die vorliegende Anwendung keinen wesentlichen zusätzlichen Nutzen geboten und gleichzeitig die Kosten erhöht. Die Leiterplatte besitzt eine Gesamtdicke von ungefähr 1,6 mm und eine Kupferstärke von 35 µm je Lage.</w:t>
+      </w:r>
+    </w:p>
+    <w:p>
+      <w:pPr>
+        <w:pStyle w:val="StandardWeb"/>
+      </w:pPr>
+      <w:r>
+        <w:t xml:space="preserve">Alle Bauteile befinden sich auf der Oberseite der Leiterplatte. Im Zentrum der Platine wurde der Mikrocontroller U1 angeordnet, sodass die Verbindungen zu den unterschiedlichen Funktionsgruppen in mehrere Richtungen geführt werden können. Die zugehörigen Kondensatoren, Widerstände und der Quarz befinden sich in der näheren Umgebung des Mikrocontrollers. Durch diese Anordnung können insbesondere die Verbindungen des Quarzes und der Versorgungspins </w:t>
+      </w:r>
+      <w:r>
+        <w:t>kurzgehalten</w:t>
+      </w:r>
+      <w:r>
+        <w:t xml:space="preserve"> werden.</w:t>
+      </w:r>
+    </w:p>
+    <w:p>
+      <w:pPr>
+        <w:pStyle w:val="StandardWeb"/>
+      </w:pPr>
+      <w:r>
+        <w:t>Die Steckverbinder wurden überwiegend am Rand der Leiterplatte platziert. Der Anschluss des Displays befindet sich an der oberen Seite, während der Joystick über den seitlich angeordneten D-Sub-Steckverbinder angeschlossen wird. Die Anschlüsse für die beiden Motorsteuerungen wurden gemeinsam mit den jeweiligen RS485-Transceivern im unteren Bereich der Platine angeordnet. Dadurch liegen die Transceiver U2 und U3 in der Nähe der zugehörigen Steckverbinder J3 und J4. Die Leitungswege zwischen den Transceivern und den externen Anschlüssen bleiben damit vergleichsweise kurz. Die Programmier- und Debugschnittstelle sowie zahlreiche Testpunkte sind am rechten beziehungsweise linken Platinenrand angeordnet und bleiben dadurch auch bei einer bestückten Leiterplatte gut zugänglich.</w:t>
+      </w:r>
+    </w:p>
+    <w:p>
+      <w:pPr>
+        <w:pStyle w:val="StandardWeb"/>
+      </w:pPr>
+      <w:r>
+        <w:t xml:space="preserve">Für die Masseführung wurde sowohl auf der Oberseite als auch auf der Unterseite eine großflächige, mit GND verbundene Kupferzone angelegt. Diese Flächen stellen über weite Bereiche der Platine eine niederohmige Masseverbindung bereit und reduzieren die Anzahl separat zu verlegender Masseleitungen. Gleichzeitig ermöglichen sie kurze Rückstrompfade für die Signale. Die beiden Masseflächen sind über </w:t>
+      </w:r>
+      <w:r>
+        <w:t xml:space="preserve">eine Vielzahl an </w:t>
+      </w:r>
+      <w:r>
+        <w:t>GND-Vias miteinander verbunden. Diese Durchkontaktierungen verteilen die Masseverbindung über die Platine und verhindern, dass die beiden Kupferflächen nur an wenigen einzelnen Stellen miteinander verbunden sind. Im Bereich der drei Befestigungsbohrungen wurden auf beiden Kupferlagen Sperrflächen vorgesehen, sodass Leiterbahnen, Vias und Kupferzonen ausreichend Abstand zu den Bohrungen halten.</w:t>
+      </w:r>
+    </w:p>
+    <w:p>
+      <w:pPr>
+        <w:pStyle w:val="StandardWeb"/>
+      </w:pPr>
+      <w:r>
+        <w:t>Bei der Dimensionierung der Leiterbahnen wurde zwischen Signal- und Versorgungsleitungen unterschieden. Für die meisten Kommunikations-, Steuer- und Analogsignale wurde eine Breite von 0,2 mm verwendet. Dazu gehören unter anderem die UART- und RS485-Steuersignale, die SWD-Programmiersignale, die I²C-Leitungen des Displays sowie die analogen Joysticksignale. Da über diese Verbindungen nur geringe Ströme fließen, ist die gewählte Breite für ihre Funktion ausreichend und ermöglicht zugleich ein platzsparendes Routing.</w:t>
+      </w:r>
+    </w:p>
+    <w:p>
+      <w:pPr>
+        <w:spacing w:line="259" w:lineRule="auto"/>
+        <w:rPr>
+          <w:rFonts w:ascii="Times New Roman" w:eastAsia="Times New Roman" w:hAnsi="Times New Roman" w:cs="Times New Roman"/>
+          <w:szCs w:val="24"/>
+          <w:lang w:eastAsia="de-DE"/>
+        </w:rPr>
+      </w:pPr>
+      <w:r>
+        <w:br w:type="page"/>
+      </w:r>
+    </w:p>
+    <w:p>
+      <w:pPr>
+        <w:pStyle w:val="StandardWeb"/>
+      </w:pPr>
+      <w:r>
+        <w:lastRenderedPageBreak/>
+        <w:t xml:space="preserve">Die Versorgungsleitungen wurden dagegen breiter ausgeführt. Für die 5-V-Versorgung kommt überwiegend eine Leiterbahnbreite von 0,5 mm zum Einsatz. Die 3,3-V-Versorgung wurde abhängig vom jeweiligen Abschnitt mit Breiten zwischen 0,3 mm und 0,75 mm geroutet. In der Nähe des Spannungsreglers wurde zusätzlich eine eigene 3,3-V-Kupferfläche angelegt. </w:t>
+      </w:r>
+    </w:p>
+    <w:p>
+      <w:pPr>
+        <w:pStyle w:val="StandardWeb"/>
+      </w:pPr>
+      <w:r>
+        <w:t>Der überwiegende Teil der Verbindungen wurde auf der Oberseite geführt. Die Unterseite wird ergänzend genutzt, wenn sich Leiterbahnen auf der Oberseite nicht ohne Kreuzungen oder größere Umwege verlegen lassen. Der Wechsel zwischen beiden Lagen erfolgt über Durchkontaktierungen mit einem Durchmesser von 0,7 mm und einer Bohrung von 0,3 mm. Auf diese Weise konnten die notwendigen Verbindungen realisiert werden, ohne einen komplexeren Lagenaufbau einsetzen zu müssen.</w:t>
+      </w:r>
+    </w:p>
+    <w:p>
+      <w:pPr>
+        <w:pStyle w:val="StandardWeb"/>
+        <w:keepNext/>
+        <w:jc w:val="center"/>
+      </w:pPr>
+      <w:r>
+        <w:drawing>
+          <wp:inline distT="0" distB="0" distL="0" distR="0" wp14:anchorId="318A4B05" wp14:editId="216CD8F5">
+            <wp:extent cx="4311872" cy="4311872"/>
+            <wp:effectExtent l="0" t="0" r="0" b="0"/>
+            <wp:docPr id="202703554" name="Grafik 1"/>
+            <wp:cNvGraphicFramePr>
+              <a:graphicFrameLocks xmlns:a="http://schemas.openxmlformats.org/drawingml/2006/main" noChangeAspect="1"/>
+            </wp:cNvGraphicFramePr>
+            <a:graphic xmlns:a="http://schemas.openxmlformats.org/drawingml/2006/main">
+              <a:graphicData uri="http://schemas.openxmlformats.org/drawingml/2006/picture">
+                <pic:pic xmlns:pic="http://schemas.openxmlformats.org/drawingml/2006/picture">
+                  <pic:nvPicPr>
+                    <pic:cNvPr id="202703554" name=""/>
+                    <pic:cNvPicPr/>
+                  </pic:nvPicPr>
+                  <pic:blipFill>
+                    <a:blip r:embed="rId19"/>
+                    <a:stretch>
+                      <a:fillRect/>
+                    </a:stretch>
+                  </pic:blipFill>
+                  <pic:spPr>
+                    <a:xfrm>
+                      <a:off x="0" y="0"/>
+                      <a:ext cx="4311872" cy="4311872"/>
+                    </a:xfrm>
+                    <a:prstGeom prst="rect">
+                      <a:avLst/>
+                    </a:prstGeom>
+                  </pic:spPr>
+                </pic:pic>
+              </a:graphicData>
+            </a:graphic>
+          </wp:inline>
+        </w:drawing>
+      </w:r>
+    </w:p>
+    <w:p>
+      <w:pPr>
+        <w:pStyle w:val="Beschriftung"/>
+        <w:jc w:val="center"/>
+      </w:pPr>
+      <w:r>
+        <w:t xml:space="preserve">Abbildung </w:t>
+      </w:r>
+      <w:fldSimple w:instr=" SEQ Abbildung \* ARABIC ">
+        <w:r>
+          <w:rPr>
+            <w:noProof/>
+          </w:rPr>
+          <w:t>9</w:t>
+        </w:r>
+      </w:fldSimple>
+      <w:r>
+        <w:t>, Routing F.Cu</w:t>
+      </w:r>
+    </w:p>
+    <w:p>
+      <w:pPr>
+        <w:spacing w:line="259" w:lineRule="auto"/>
+      </w:pPr>
+      <w:r>
+        <w:br w:type="page"/>
+      </w:r>
+    </w:p>
+    <w:p>
+      <w:pPr>
+        <w:pStyle w:val="StandardWeb"/>
+        <w:keepNext/>
+        <w:jc w:val="center"/>
+      </w:pPr>
+      <w:r>
+        <w:lastRenderedPageBreak/>
+        <w:drawing>
+          <wp:inline distT="0" distB="0" distL="0" distR="0" wp14:anchorId="32B5310E" wp14:editId="6C27B103">
+            <wp:extent cx="4254719" cy="4273770"/>
+            <wp:effectExtent l="0" t="0" r="0" b="0"/>
+            <wp:docPr id="90637127" name="Grafik 1"/>
+            <wp:cNvGraphicFramePr>
+              <a:graphicFrameLocks xmlns:a="http://schemas.openxmlformats.org/drawingml/2006/main" noChangeAspect="1"/>
+            </wp:cNvGraphicFramePr>
+            <a:graphic xmlns:a="http://schemas.openxmlformats.org/drawingml/2006/main">
+              <a:graphicData uri="http://schemas.openxmlformats.org/drawingml/2006/picture">
+                <pic:pic xmlns:pic="http://schemas.openxmlformats.org/drawingml/2006/picture">
+                  <pic:nvPicPr>
+                    <pic:cNvPr id="90637127" name=""/>
+                    <pic:cNvPicPr/>
+                  </pic:nvPicPr>
+                  <pic:blipFill>
+                    <a:blip r:embed="rId20"/>
+                    <a:stretch>
+                      <a:fillRect/>
+                    </a:stretch>
+                  </pic:blipFill>
+                  <pic:spPr>
+                    <a:xfrm>
+                      <a:off x="0" y="0"/>
+                      <a:ext cx="4254719" cy="4273770"/>
+                    </a:xfrm>
+                    <a:prstGeom prst="rect">
+                      <a:avLst/>
+                    </a:prstGeom>
+                  </pic:spPr>
+                </pic:pic>
+              </a:graphicData>
+            </a:graphic>
+          </wp:inline>
+        </w:drawing>
+      </w:r>
+    </w:p>
+    <w:p>
+      <w:pPr>
+        <w:pStyle w:val="Beschriftung"/>
+        <w:jc w:val="center"/>
+      </w:pPr>
+      <w:r>
+        <w:t xml:space="preserve">Abbildung </w:t>
+      </w:r>
+      <w:fldSimple w:instr=" SEQ Abbildung \* ARABIC ">
+        <w:r>
+          <w:rPr>
+            <w:noProof/>
+          </w:rPr>
+          <w:t>10</w:t>
+        </w:r>
+      </w:fldSimple>
+      <w:r>
+        <w:t>, Routing B.Cu</w:t>
+      </w:r>
+    </w:p>
+    <w:p>
+      <w:pPr>
+        <w:pStyle w:val="StandardWeb"/>
+        <w:jc w:val="center"/>
+      </w:pPr>
+    </w:p>
+    <w:p>
+      <w:pPr>
+        <w:pStyle w:val="berschrift2"/>
+        <w:rPr>
+          <w:rFonts w:ascii="Times New Roman" w:hAnsi="Times New Roman" w:cs="Times New Roman"/>
+        </w:rPr>
+      </w:pPr>
+      <w:r>
+        <w:rPr>
+          <w:rFonts w:ascii="Times New Roman" w:hAnsi="Times New Roman" w:cs="Times New Roman"/>
+        </w:rPr>
+        <w:t xml:space="preserve"> </w:t>
+      </w:r>
+      <w:bookmarkStart w:id="17" w:name="_Toc238643459"/>
+      <w:r>
+        <w:rPr>
+          <w:rFonts w:ascii="Times New Roman" w:hAnsi="Times New Roman" w:cs="Times New Roman"/>
+        </w:rPr>
+        <w:t>Bestückung der Platine</w:t>
+      </w:r>
+      <w:bookmarkEnd w:id="17"/>
+    </w:p>
+    <w:p>
+      <w:pPr>
+        <w:pStyle w:val="StandardWeb"/>
+      </w:pPr>
+      <w:r>
+        <w:t xml:space="preserve">Da auf der Leiterplatte überwiegend SMD-Bauteile eingesetzt werden, </w:t>
+      </w:r>
+      <w:r>
+        <w:t xml:space="preserve">haben wir die meisten Bauteile mit dem </w:t>
+      </w:r>
+      <w:r>
+        <w:t>Reflow-Verfahren</w:t>
+      </w:r>
+      <w:r>
+        <w:t xml:space="preserve"> gelötet</w:t>
+      </w:r>
+      <w:r>
+        <w:t xml:space="preserve">. Zunächst wurde die Lötpaste mithilfe eines Stencils auf die vorgesehenen Lötflächen aufgetragen. Anschließend wurden die Bauteile auf der Platine positioniert und gemeinsam in einem Reflow-Ofen </w:t>
+      </w:r>
+      <w:r>
+        <w:t>erhitzt</w:t>
+      </w:r>
+      <w:r>
+        <w:t>. Das verwendete Temperaturprofil orientierte sich an den Vorgaben der Lötpaste und an der maximal zulässigen Temperatur des empfindlichsten Bauteils, in diesem Fall des Mikrocontrollers. Dadurch sollte eine ausreichende Erwärmung der Lötstellen erreicht werden, ohne die Bauteile thermisch zu überlasten.</w:t>
+      </w:r>
+    </w:p>
+    <w:p>
+      <w:pPr>
+        <w:pStyle w:val="StandardWeb"/>
+      </w:pPr>
+      <w:r>
+        <w:t>Die Steckverbinder wurden nicht im Reflow-Verfahren verarbeitet, sondern nachträglich von Hand eingelötet</w:t>
+      </w:r>
+      <w:r>
+        <w:t>, da sie die hohen Temperaturen nicht ausgehalten hätten</w:t>
+      </w:r>
+      <w:r>
+        <w:t>. Anschließend wurden die Bestückung und insbesondere die Lötstellen des Mikrocontrollers visuell kontrolliert.</w:t>
+      </w:r>
+    </w:p>
+    <w:p>
+      <w:pPr>
+        <w:spacing w:line="259" w:lineRule="auto"/>
+        <w:rPr>
+          <w:rFonts w:ascii="Times New Roman" w:eastAsia="Times New Roman" w:hAnsi="Times New Roman" w:cs="Times New Roman"/>
+          <w:szCs w:val="24"/>
+          <w:lang w:eastAsia="de-DE"/>
+        </w:rPr>
+      </w:pPr>
+      <w:r>
+        <w:br w:type="page"/>
+      </w:r>
+    </w:p>
+    <w:p>
+      <w:pPr>
+        <w:pStyle w:val="StandardWeb"/>
+      </w:pPr>
+      <w:r>
+        <w:lastRenderedPageBreak/>
+        <w:t xml:space="preserve">Beim ersten Bestückungsversuch konnte der Mikrocontroller aufgrund seines geringen Pinabstands nicht ausreichend genau positioniert werden. Da sich das Bauteil anschließend nicht mehr beschädigungsfrei entfernen ließ, wurde diese Platine nicht weiterverwendet. Beim zweiten Versuch wurde daher besonders auf die Ausrichtung des Mikrocontrollers zu den Lötflächen geachtet. Dadurch konnte die Platine erfolgreich bestückt werden. </w:t>
+      </w:r>
+      <w:r>
+        <w:t xml:space="preserve">In Der Abbildung 11 ist die fertig bestückte Platine zu sehen. </w:t>
+      </w:r>
+    </w:p>
+    <w:p>
+      <w:pPr>
+        <w:pStyle w:val="StandardWeb"/>
+        <w:keepNext/>
+        <w:jc w:val="center"/>
+      </w:pPr>
+      <w:r>
+        <w:rPr>
+          <w:noProof/>
+        </w:rPr>
+        <w:drawing>
+          <wp:inline distT="0" distB="0" distL="0" distR="0" wp14:anchorId="40377886" wp14:editId="50D4133E">
+            <wp:extent cx="4673428" cy="5171632"/>
+            <wp:effectExtent l="0" t="0" r="0" b="0"/>
+            <wp:docPr id="2016340909" name="Grafik 122"/>
+            <wp:cNvGraphicFramePr>
+              <a:graphicFrameLocks xmlns:a="http://schemas.openxmlformats.org/drawingml/2006/main" noChangeAspect="1"/>
+            </wp:cNvGraphicFramePr>
+            <a:graphic xmlns:a="http://schemas.openxmlformats.org/drawingml/2006/main">
+              <a:graphicData uri="http://schemas.openxmlformats.org/drawingml/2006/picture">
+                <pic:pic xmlns:pic="http://schemas.openxmlformats.org/drawingml/2006/picture">
+                  <pic:nvPicPr>
+                    <pic:cNvPr id="2016340909" name="Grafik 2016340909"/>
+                    <pic:cNvPicPr/>
+                  </pic:nvPicPr>
+                  <pic:blipFill>
+                    <a:blip r:embed="rId21">
+                      <a:extLst>
+                        <a:ext uri="{28A0092B-C50C-407E-A947-70E740481C1C}">
+                          <a14:useLocalDpi xmlns:a14="http://schemas.microsoft.com/office/drawing/2010/main" val="0"/>
+                        </a:ext>
+                      </a:extLst>
+                    </a:blip>
+                    <a:stretch>
+                      <a:fillRect/>
+                    </a:stretch>
+                  </pic:blipFill>
+                  <pic:spPr>
+                    <a:xfrm>
+                      <a:off x="0" y="0"/>
+                      <a:ext cx="4678283" cy="5177005"/>
+                    </a:xfrm>
+                    <a:prstGeom prst="rect">
+                      <a:avLst/>
+                    </a:prstGeom>
+                  </pic:spPr>
+                </pic:pic>
+              </a:graphicData>
+            </a:graphic>
+          </wp:inline>
+        </w:drawing>
+      </w:r>
+    </w:p>
+    <w:p>
+      <w:pPr>
+        <w:pStyle w:val="Beschriftung"/>
+        <w:jc w:val="center"/>
+      </w:pPr>
+      <w:r>
+        <w:t xml:space="preserve">Abbildung </w:t>
+      </w:r>
+      <w:fldSimple w:instr=" SEQ Abbildung \* ARABIC ">
+        <w:r>
+          <w:rPr>
+            <w:noProof/>
+          </w:rPr>
+          <w:t>11</w:t>
+        </w:r>
+      </w:fldSimple>
+      <w:r>
+        <w:t>, Bestückte Platine</w:t>
+      </w:r>
+    </w:p>
+    <w:p>
+      <w:pPr>
+        <w:pStyle w:val="StandardWeb"/>
+      </w:pPr>
+      <w:r>
+        <w:t xml:space="preserve">Nach der erfolgreichen Bestückung und Prüfung der Leiterplatte wurde das Kommunikationsmodul schrittweise mit dem Display und den weiteren Komponenten zusammengebaut und anschließend im vorgesehenen Gehäuse befestigt. </w:t>
+      </w:r>
+      <w:r>
+        <w:t xml:space="preserve">Das Vorgehen wird in Kapitel 5 näher beschrieben. </w:t>
+      </w:r>
+    </w:p>
     <w:p/>
-    <w:p>
-      <w:pPr>
-        <w:pStyle w:val="berschrift2"/>
-        <w:rPr>
-          <w:rFonts w:ascii="Times New Roman" w:hAnsi="Times New Roman" w:cs="Times New Roman"/>
-        </w:rPr>
-      </w:pPr>
-      <w:bookmarkStart w:id="14" w:name="_Toc238643456"/>
-      <w:r>
-        <w:rPr>
-          <w:rFonts w:ascii="Times New Roman" w:hAnsi="Times New Roman" w:cs="Times New Roman"/>
-        </w:rPr>
-        <w:t>Programmierschnittstelle</w:t>
-      </w:r>
-      <w:bookmarkEnd w:id="14"/>
-    </w:p>
-    <w:p>
-      <w:pPr>
-        <w:pStyle w:val="berschrift2"/>
-        <w:rPr>
-          <w:rFonts w:ascii="Times New Roman" w:hAnsi="Times New Roman" w:cs="Times New Roman"/>
-        </w:rPr>
-      </w:pPr>
-      <w:bookmarkStart w:id="15" w:name="_Toc238643457"/>
-      <w:r>
-        <w:rPr>
-          <w:rFonts w:ascii="Times New Roman" w:hAnsi="Times New Roman" w:cs="Times New Roman"/>
-        </w:rPr>
-        <w:t>Displayanschluss</w:t>
-      </w:r>
-      <w:bookmarkEnd w:id="15"/>
-    </w:p>
-    <w:p>
-      <w:pPr>
-        <w:pStyle w:val="berschrift2"/>
-        <w:rPr>
-          <w:rFonts w:ascii="Times New Roman" w:hAnsi="Times New Roman" w:cs="Times New Roman"/>
-        </w:rPr>
-      </w:pPr>
-      <w:bookmarkStart w:id="16" w:name="_Toc238643458"/>
-      <w:r>
-        <w:rPr>
-          <w:rFonts w:ascii="Times New Roman" w:hAnsi="Times New Roman" w:cs="Times New Roman"/>
-        </w:rPr>
-        <w:t>Platinen Layout und Routing</w:t>
-      </w:r>
-      <w:bookmarkEnd w:id="16"/>
-    </w:p>
-    <w:p>
-      <w:pPr>
-        <w:pStyle w:val="berschrift2"/>
-        <w:rPr>
-          <w:rFonts w:ascii="Times New Roman" w:hAnsi="Times New Roman" w:cs="Times New Roman"/>
-        </w:rPr>
-      </w:pPr>
-      <w:r>
-        <w:rPr>
-          <w:rFonts w:ascii="Times New Roman" w:hAnsi="Times New Roman" w:cs="Times New Roman"/>
-        </w:rPr>
-        <w:t xml:space="preserve"> </w:t>
-      </w:r>
-      <w:bookmarkStart w:id="17" w:name="_Toc238643459"/>
-      <w:r>
-        <w:rPr>
-          <w:rFonts w:ascii="Times New Roman" w:hAnsi="Times New Roman" w:cs="Times New Roman"/>
-        </w:rPr>
-        <w:t>Bestückung der Platine</w:t>
-      </w:r>
-      <w:bookmarkEnd w:id="17"/>
-    </w:p>
     <w:p>
       <w:pPr>
         <w:spacing w:line="259" w:lineRule="auto"/>
@@ -13376,23 +13738,7 @@
         <w:pStyle w:val="StandardWeb"/>
       </w:pPr>
       <w:r>
-        <w:t xml:space="preserve">Die Kommunikation mit den beiden Motorsteuerungen erfolgt über zwei voneinander getrennte UART-Schnittstellen mit jeweils 38,4 </w:t>
-      </w:r>
-      <w:proofErr w:type="spellStart"/>
-      <w:r>
-        <w:t>kBd</w:t>
-      </w:r>
-      <w:proofErr w:type="spellEnd"/>
-      <w:r>
-        <w:t xml:space="preserve">. Die UART-Signale werden mithilfe zweier RS485-Transceiver in differentielle RS485-Signale umgesetzt. Alle 30 </w:t>
-      </w:r>
-      <w:proofErr w:type="spellStart"/>
-      <w:r>
-        <w:t>ms</w:t>
-      </w:r>
-      <w:proofErr w:type="spellEnd"/>
-      <w:r>
-        <w:t xml:space="preserve"> wird an jeden Motor ein fünf Byte langes Steuertelegramm übertragen. Gleichzeitig empfängt das Kommunikationsmodul Statusinformationen wie Drehzahl, Leistung, Batteriespannung, Akkustand, Geschwindigkeit, Motortemperatur und Motorfehler.</w:t>
+        <w:t>Die Kommunikation mit den beiden Motorsteuerungen erfolgt über zwei voneinander getrennte UART-Schnittstellen mit jeweils 38,4 kBd. Die UART-Signale werden mithilfe zweier RS485-Transceiver in differentielle RS485-Signale umgesetzt. Alle 30 ms wird an jeden Motor ein fünf Byte langes Steuertelegramm übertragen. Gleichzeitig empfängt das Kommunikationsmodul Statusinformationen wie Drehzahl, Leistung, Batteriespannung, Akkustand, Geschwindigkeit, Motortemperatur und Motorfehler.</w:t>
       </w:r>
     </w:p>
     <w:p>
@@ -13530,7 +13876,6 @@
                 <w:rFonts w:ascii="Times New Roman" w:hAnsi="Times New Roman" w:cs="Times New Roman"/>
               </w:rPr>
             </w:pPr>
-            <w:proofErr w:type="spellStart"/>
             <w:r>
               <w:rPr>
                 <w:rStyle w:val="HTMLCode"/>
@@ -13538,7 +13883,6 @@
               </w:rPr>
               <w:t>main.c</w:t>
             </w:r>
-            <w:proofErr w:type="spellEnd"/>
           </w:p>
         </w:tc>
         <w:tc>
@@ -13576,21 +13920,12 @@
                 <w:rFonts w:ascii="Times New Roman" w:hAnsi="Times New Roman" w:cs="Times New Roman"/>
               </w:rPr>
             </w:pPr>
-            <w:proofErr w:type="spellStart"/>
             <w:r>
               <w:rPr>
                 <w:rStyle w:val="HTMLCode"/>
                 <w:rFonts w:ascii="Times New Roman" w:eastAsiaTheme="minorHAnsi" w:hAnsi="Times New Roman" w:cs="Times New Roman"/>
               </w:rPr>
-              <w:t>communication_module.c</w:t>
-            </w:r>
-            <w:proofErr w:type="spellEnd"/>
-            <w:r>
-              <w:rPr>
-                <w:rStyle w:val="HTMLCode"/>
-                <w:rFonts w:ascii="Times New Roman" w:eastAsiaTheme="minorHAnsi" w:hAnsi="Times New Roman" w:cs="Times New Roman"/>
-              </w:rPr>
-              <w:t>/.h</w:t>
+              <w:t>communication_module.c/.h</w:t>
             </w:r>
           </w:p>
         </w:tc>
@@ -13629,21 +13964,12 @@
                 <w:rFonts w:ascii="Times New Roman" w:hAnsi="Times New Roman" w:cs="Times New Roman"/>
               </w:rPr>
             </w:pPr>
-            <w:proofErr w:type="spellStart"/>
             <w:r>
               <w:rPr>
                 <w:rStyle w:val="HTMLCode"/>
                 <w:rFonts w:ascii="Times New Roman" w:eastAsiaTheme="minorHAnsi" w:hAnsi="Times New Roman" w:cs="Times New Roman"/>
               </w:rPr>
-              <w:t>joystick.c</w:t>
-            </w:r>
-            <w:proofErr w:type="spellEnd"/>
-            <w:r>
-              <w:rPr>
-                <w:rStyle w:val="HTMLCode"/>
-                <w:rFonts w:ascii="Times New Roman" w:eastAsiaTheme="minorHAnsi" w:hAnsi="Times New Roman" w:cs="Times New Roman"/>
-              </w:rPr>
-              <w:t>/.h</w:t>
+              <w:t>joystick.c/.h</w:t>
             </w:r>
           </w:p>
         </w:tc>
@@ -13706,21 +14032,7 @@
               <w:rPr>
                 <w:rFonts w:ascii="Times New Roman" w:hAnsi="Times New Roman" w:cs="Times New Roman"/>
               </w:rPr>
-              <w:t xml:space="preserve">Senden und </w:t>
-            </w:r>
-            <w:proofErr w:type="spellStart"/>
-            <w:r>
-              <w:rPr>
-                <w:rFonts w:ascii="Times New Roman" w:hAnsi="Times New Roman" w:cs="Times New Roman"/>
-              </w:rPr>
-              <w:t>Empfangen</w:t>
-            </w:r>
-            <w:proofErr w:type="spellEnd"/>
-            <w:r>
-              <w:rPr>
-                <w:rFonts w:ascii="Times New Roman" w:hAnsi="Times New Roman" w:cs="Times New Roman"/>
-              </w:rPr>
-              <w:t xml:space="preserve"> der RS485-Motortelegramme</w:t>
+              <w:t>Senden und Empfangen der RS485-Motortelegramme</w:t>
             </w:r>
           </w:p>
         </w:tc>
@@ -13788,13 +14100,8 @@
         </w:r>
       </w:fldSimple>
       <w:r>
-        <w:t xml:space="preserve">, </w:t>
-      </w:r>
-      <w:proofErr w:type="gramStart"/>
-      <w:r>
-        <w:t>Software Unterteilung</w:t>
-      </w:r>
-      <w:proofErr w:type="gramEnd"/>
+        <w:t>, Software Unterteilung</w:t>
+      </w:r>
     </w:p>
     <w:p>
       <w:pPr>
@@ -13802,37 +14109,13 @@
         <w:keepNext/>
       </w:pPr>
       <w:r>
-        <w:t xml:space="preserve">Die übrigen Dateien wurden mithilfe von STM32CubeMX automatisch erzeugt. Die zugehörige Konfigurationsdatei </w:t>
-      </w:r>
-      <w:proofErr w:type="spellStart"/>
-      <w:r>
-        <w:t>Software_Joystick_Modul.ioc</w:t>
-      </w:r>
-      <w:proofErr w:type="spellEnd"/>
-      <w:r>
-        <w:t xml:space="preserve"> enthält unter anderem die Pinbelegung sowie die Einstellungen von Takt, ADC, DMA, UART, I²C und Interrupts.</w:t>
+        <w:t>Die übrigen Dateien wurden mithilfe von STM32CubeMX automatisch erzeugt. Die zugehörige Konfigurationsdatei Software_Joystick_Modul.ioc enthält unter anderem die Pinbelegung sowie die Einstellungen von Takt, ADC, DMA, UART, I²C und Interrupts.</w:t>
       </w:r>
       <w:r>
         <w:br/>
       </w:r>
       <w:r>
-        <w:t xml:space="preserve">Die selbst entwickelten Programmteile befinden sich überwiegend im Verzeichnis </w:t>
-      </w:r>
-      <w:proofErr w:type="spellStart"/>
-      <w:r>
-        <w:t>Application</w:t>
-      </w:r>
-      <w:proofErr w:type="spellEnd"/>
-      <w:r>
-        <w:t xml:space="preserve"> und sind dadurch von den automatisch generierten Initialisierungsdateien getrennt. Werden die Hardwareeinstellungen später in STM32CubeMX verändert und der Code erneut generiert, bleiben die Dateien im Verzeichnis </w:t>
-      </w:r>
-      <w:proofErr w:type="spellStart"/>
-      <w:r>
-        <w:t>Application</w:t>
-      </w:r>
-      <w:proofErr w:type="spellEnd"/>
-      <w:r>
-        <w:t xml:space="preserve"> erhalten. Eigene Änderungen innerhalb generierter Dateien sollten dagegen ausschließlich in den dafür</w:t>
+        <w:t>Die selbst entwickelten Programmteile befinden sich überwiegend im Verzeichnis Application und sind dadurch von den automatisch generierten Initialisierungsdateien getrennt. Werden die Hardwareeinstellungen später in STM32CubeMX verändert und der Code erneut generiert, bleiben die Dateien im Verzeichnis Application erhalten. Eigene Änderungen innerhalb generierter Dateien sollten dagegen ausschließlich in den dafür</w:t>
       </w:r>
       <w:r>
         <w:t xml:space="preserve"> v</w:t>
@@ -13867,7 +14150,7 @@
                     <pic:cNvPicPr/>
                   </pic:nvPicPr>
                   <pic:blipFill rotWithShape="1">
-                    <a:blip r:embed="rId17"/>
+                    <a:blip r:embed="rId22"/>
                     <a:srcRect t="3112"/>
                     <a:stretch>
                       <a:fillRect/>
@@ -13913,29 +14196,12 @@
           <w:rPr>
             <w:noProof/>
           </w:rPr>
-          <w:t>7</w:t>
+          <w:t>12</w:t>
         </w:r>
       </w:fldSimple>
       <w:r>
-        <w:t xml:space="preserve">, </w:t>
-      </w:r>
-      <w:proofErr w:type="gramStart"/>
-      <w:r>
-        <w:t>Pin Layout</w:t>
-      </w:r>
-      <w:proofErr w:type="gramEnd"/>
-    </w:p>
-    <w:p>
-      <w:pPr>
-        <w:spacing w:line="259" w:lineRule="auto"/>
-        <w:rPr>
-          <w:rFonts w:ascii="Times New Roman" w:eastAsiaTheme="majorEastAsia" w:hAnsi="Times New Roman" w:cs="Times New Roman"/>
-          <w:b/>
-          <w:color w:val="000000" w:themeColor="text1"/>
-          <w:sz w:val="32"/>
-          <w:szCs w:val="26"/>
-        </w:rPr>
-      </w:pPr>
+        <w:t>, Pin Layout</w:t>
+      </w:r>
     </w:p>
     <w:p>
       <w:pPr>
@@ -13954,6 +14220,7 @@
         <w:rPr>
           <w:rFonts w:ascii="Times New Roman" w:hAnsi="Times New Roman" w:cs="Times New Roman"/>
         </w:rPr>
+        <w:lastRenderedPageBreak/>
         <w:t>4.3 Initialisierung und Hauptprogramm</w:t>
       </w:r>
       <w:bookmarkEnd w:id="21"/>
@@ -14058,37 +14325,12 @@
       <w:r>
         <w:t xml:space="preserve">Nach der Hardwareinitialisierung wird </w:t>
       </w:r>
-      <w:proofErr w:type="spellStart"/>
       <w:r>
         <w:rPr>
           <w:rStyle w:val="HTMLCode"/>
           <w:rFonts w:ascii="Times New Roman" w:hAnsi="Times New Roman" w:cs="Times New Roman"/>
         </w:rPr>
-        <w:t>communication_module_</w:t>
-      </w:r>
-      <w:proofErr w:type="gramStart"/>
-      <w:r>
-        <w:rPr>
-          <w:rStyle w:val="HTMLCode"/>
-          <w:rFonts w:ascii="Times New Roman" w:hAnsi="Times New Roman" w:cs="Times New Roman"/>
-        </w:rPr>
-        <w:t>init</w:t>
-      </w:r>
-      <w:proofErr w:type="spellEnd"/>
-      <w:r>
-        <w:rPr>
-          <w:rStyle w:val="HTMLCode"/>
-          <w:rFonts w:ascii="Times New Roman" w:hAnsi="Times New Roman" w:cs="Times New Roman"/>
-        </w:rPr>
-        <w:t>(</w:t>
-      </w:r>
-      <w:proofErr w:type="gramEnd"/>
-      <w:r>
-        <w:rPr>
-          <w:rStyle w:val="HTMLCode"/>
-          <w:rFonts w:ascii="Times New Roman" w:hAnsi="Times New Roman" w:cs="Times New Roman"/>
-        </w:rPr>
-        <w:t>)</w:t>
+        <w:t>communication_module_init()</w:t>
       </w:r>
       <w:r>
         <w:t xml:space="preserve"> aufgerufen. Diese Funktion initialisiert die Motorzustände, startet den ADC mit DMA, liest die Taster ein und initialisiert das Display.</w:t>
@@ -14130,7 +14372,7 @@
                     <pic:cNvPicPr/>
                   </pic:nvPicPr>
                   <pic:blipFill>
-                    <a:blip r:embed="rId18"/>
+                    <a:blip r:embed="rId23"/>
                     <a:stretch>
                       <a:fillRect/>
                     </a:stretch>
@@ -14164,19 +14406,11 @@
           <w:rPr>
             <w:noProof/>
           </w:rPr>
-          <w:t>8</w:t>
+          <w:t>13</w:t>
         </w:r>
       </w:fldSimple>
       <w:r>
-        <w:t>, While-Schleife (</w:t>
-      </w:r>
-      <w:proofErr w:type="spellStart"/>
-      <w:r>
-        <w:t>main.c</w:t>
-      </w:r>
-      <w:proofErr w:type="spellEnd"/>
-      <w:r>
-        <w:t>)</w:t>
+        <w:t>, While-Schleife (main.c)</w:t>
       </w:r>
     </w:p>
     <w:p/>
@@ -14187,48 +14421,15 @@
       <w:r>
         <w:t xml:space="preserve">Die Funktion </w:t>
       </w:r>
-      <w:proofErr w:type="spellStart"/>
       <w:r>
         <w:rPr>
           <w:rStyle w:val="HTMLCode"/>
           <w:rFonts w:ascii="Times New Roman" w:hAnsi="Times New Roman" w:cs="Times New Roman"/>
         </w:rPr>
-        <w:t>communication_module_</w:t>
-      </w:r>
-      <w:proofErr w:type="gramStart"/>
-      <w:r>
-        <w:rPr>
-          <w:rStyle w:val="HTMLCode"/>
-          <w:rFonts w:ascii="Times New Roman" w:hAnsi="Times New Roman" w:cs="Times New Roman"/>
-        </w:rPr>
-        <w:t>process</w:t>
-      </w:r>
-      <w:proofErr w:type="spellEnd"/>
-      <w:r>
-        <w:rPr>
-          <w:rStyle w:val="HTMLCode"/>
-          <w:rFonts w:ascii="Times New Roman" w:hAnsi="Times New Roman" w:cs="Times New Roman"/>
-        </w:rPr>
-        <w:t>(</w:t>
-      </w:r>
-      <w:proofErr w:type="gramEnd"/>
-      <w:r>
-        <w:rPr>
-          <w:rStyle w:val="HTMLCode"/>
-          <w:rFonts w:ascii="Times New Roman" w:hAnsi="Times New Roman" w:cs="Times New Roman"/>
-        </w:rPr>
-        <w:t>)</w:t>
-      </w:r>
-      <w:r>
-        <w:t xml:space="preserve"> bildet damit die zentrale Ablaufsteuerung. Sie wertet empfangene Motorframes aus und führt alle 30 </w:t>
-      </w:r>
-      <w:proofErr w:type="spellStart"/>
-      <w:r>
-        <w:t>ms</w:t>
-      </w:r>
-      <w:proofErr w:type="spellEnd"/>
-      <w:r>
-        <w:t xml:space="preserve"> folgende Schritte aus:</w:t>
+        <w:t>communication_module_process()</w:t>
+      </w:r>
+      <w:r>
+        <w:t xml:space="preserve"> bildet damit die zentrale Ablaufsteuerung. Sie wertet empfangene Motorframes aus und führt alle 30 ms folgende Schritte aus:</w:t>
       </w:r>
     </w:p>
     <w:p>
@@ -14251,13 +14452,8 @@
           <w:numId w:val="31"/>
         </w:numPr>
       </w:pPr>
-      <w:proofErr w:type="spellStart"/>
-      <w:r>
-        <w:t>Tasteraktionen</w:t>
-      </w:r>
-      <w:proofErr w:type="spellEnd"/>
-      <w:r>
-        <w:t xml:space="preserve"> auswerten</w:t>
+      <w:r>
+        <w:t>Tasteraktionen auswerten</w:t>
       </w:r>
     </w:p>
     <w:p>
@@ -14310,8 +14506,16 @@
     </w:p>
     <w:p>
       <w:pPr>
-        <w:pStyle w:val="StandardWeb"/>
-      </w:pPr>
+        <w:spacing w:line="259" w:lineRule="auto"/>
+        <w:rPr>
+          <w:rFonts w:ascii="Times New Roman" w:eastAsia="Times New Roman" w:hAnsi="Times New Roman" w:cs="Times New Roman"/>
+          <w:szCs w:val="24"/>
+          <w:lang w:eastAsia="de-DE"/>
+        </w:rPr>
+      </w:pPr>
+      <w:r>
+        <w:br w:type="page"/>
+      </w:r>
     </w:p>
     <w:p>
       <w:pPr>
@@ -14331,103 +14535,7 @@
           <w:lang w:eastAsia="de-DE"/>
         </w:rPr>
         <w:lastRenderedPageBreak/>
-        <w:t xml:space="preserve">Für die zyklische Ablaufsteuerung wird </w:t>
-      </w:r>
-      <w:proofErr w:type="spellStart"/>
-      <w:r>
-        <w:rPr>
-          <w:rFonts w:ascii="Times New Roman" w:eastAsia="Times New Roman" w:hAnsi="Times New Roman" w:cs="Times New Roman"/>
-          <w:szCs w:val="24"/>
-          <w:lang w:eastAsia="de-DE"/>
-        </w:rPr>
-        <w:t>HAL_</w:t>
-      </w:r>
-      <w:proofErr w:type="gramStart"/>
-      <w:r>
-        <w:rPr>
-          <w:rFonts w:ascii="Times New Roman" w:eastAsia="Times New Roman" w:hAnsi="Times New Roman" w:cs="Times New Roman"/>
-          <w:szCs w:val="24"/>
-          <w:lang w:eastAsia="de-DE"/>
-        </w:rPr>
-        <w:t>GetTick</w:t>
-      </w:r>
-      <w:proofErr w:type="spellEnd"/>
-      <w:r>
-        <w:rPr>
-          <w:rFonts w:ascii="Times New Roman" w:eastAsia="Times New Roman" w:hAnsi="Times New Roman" w:cs="Times New Roman"/>
-          <w:szCs w:val="24"/>
-          <w:lang w:eastAsia="de-DE"/>
-        </w:rPr>
-        <w:t>(</w:t>
-      </w:r>
-      <w:proofErr w:type="gramEnd"/>
-      <w:r>
-        <w:rPr>
-          <w:rFonts w:ascii="Times New Roman" w:eastAsia="Times New Roman" w:hAnsi="Times New Roman" w:cs="Times New Roman"/>
-          <w:szCs w:val="24"/>
-          <w:lang w:eastAsia="de-DE"/>
-        </w:rPr>
-        <w:t xml:space="preserve">) verwendet. Dadurch werden für das 30-ms-Steuerintervall keine festen Wartezeiten mit </w:t>
-      </w:r>
-      <w:proofErr w:type="spellStart"/>
-      <w:r>
-        <w:rPr>
-          <w:rFonts w:ascii="Times New Roman" w:eastAsia="Times New Roman" w:hAnsi="Times New Roman" w:cs="Times New Roman"/>
-          <w:szCs w:val="24"/>
-          <w:lang w:eastAsia="de-DE"/>
-        </w:rPr>
-        <w:t>HAL_</w:t>
-      </w:r>
-      <w:proofErr w:type="gramStart"/>
-      <w:r>
-        <w:rPr>
-          <w:rFonts w:ascii="Times New Roman" w:eastAsia="Times New Roman" w:hAnsi="Times New Roman" w:cs="Times New Roman"/>
-          <w:szCs w:val="24"/>
-          <w:lang w:eastAsia="de-DE"/>
-        </w:rPr>
-        <w:t>Delay</w:t>
-      </w:r>
-      <w:proofErr w:type="spellEnd"/>
-      <w:r>
-        <w:rPr>
-          <w:rFonts w:ascii="Times New Roman" w:eastAsia="Times New Roman" w:hAnsi="Times New Roman" w:cs="Times New Roman"/>
-          <w:szCs w:val="24"/>
-          <w:lang w:eastAsia="de-DE"/>
-        </w:rPr>
-        <w:t>(</w:t>
-      </w:r>
-      <w:proofErr w:type="gramEnd"/>
-      <w:r>
-        <w:rPr>
-          <w:rFonts w:ascii="Times New Roman" w:eastAsia="Times New Roman" w:hAnsi="Times New Roman" w:cs="Times New Roman"/>
-          <w:szCs w:val="24"/>
-          <w:lang w:eastAsia="de-DE"/>
-        </w:rPr>
-        <w:t xml:space="preserve">) benötigt. Die einzelnen UART- und I²C-Übertragungen werden jedoch weiterhin blockierend ausgeführt. Bei den 30 </w:t>
-      </w:r>
-      <w:proofErr w:type="spellStart"/>
-      <w:r>
-        <w:rPr>
-          <w:rFonts w:ascii="Times New Roman" w:eastAsia="Times New Roman" w:hAnsi="Times New Roman" w:cs="Times New Roman"/>
-          <w:szCs w:val="24"/>
-          <w:lang w:eastAsia="de-DE"/>
-        </w:rPr>
-        <w:t>ms</w:t>
-      </w:r>
-      <w:proofErr w:type="spellEnd"/>
-      <w:r>
-        <w:rPr>
-          <w:rFonts w:ascii="Times New Roman" w:eastAsia="Times New Roman" w:hAnsi="Times New Roman" w:cs="Times New Roman"/>
-          <w:szCs w:val="24"/>
-          <w:lang w:eastAsia="de-DE"/>
-        </w:rPr>
-        <w:t xml:space="preserve"> handelt es sich daher um das angestrebte Übertragungsintervall und nicht um eine harte Echtzeitgarantie.</w:t>
-      </w:r>
-      <w:r>
-        <w:rPr>
-          <w:rFonts w:ascii="Times New Roman" w:hAnsi="Times New Roman" w:cs="Times New Roman"/>
-        </w:rPr>
-        <w:br w:type="page"/>
+        <w:t>Für die zyklische Ablaufsteuerung wird HAL_GetTick() verwendet. Dadurch werden für das 30-ms-Steuerintervall keine festen Wartezeiten mit HAL_Delay() benötigt. Die einzelnen UART- und I²C-Übertragungen werden jedoch weiterhin blockierend ausgeführt. Bei den 30 ms handelt es sich daher um das angestrebte Übertragungsintervall und nicht um eine harte Echtzeitgarantie.</w:t>
       </w:r>
     </w:p>
     <w:p>
@@ -14447,7 +14555,6 @@
         <w:rPr>
           <w:rFonts w:ascii="Times New Roman" w:hAnsi="Times New Roman" w:cs="Times New Roman"/>
         </w:rPr>
-        <w:lastRenderedPageBreak/>
         <w:t>4.4 Einlesen des Joysticks</w:t>
       </w:r>
       <w:bookmarkEnd w:id="22"/>
@@ -14533,7 +14640,6 @@
                 <w:bCs/>
               </w:rPr>
             </w:pPr>
-            <w:proofErr w:type="spellStart"/>
             <w:r>
               <w:rPr>
                 <w:rFonts w:ascii="Times New Roman" w:hAnsi="Times New Roman" w:cs="Times New Roman"/>
@@ -14542,7 +14648,6 @@
               </w:rPr>
               <w:t>Mikrocontrollerpin</w:t>
             </w:r>
-            <w:proofErr w:type="spellEnd"/>
           </w:p>
         </w:tc>
         <w:tc>
@@ -14777,7 +14882,6 @@
         <w:t>, ADC-Funktionen</w:t>
       </w:r>
     </w:p>
-    <w:p/>
     <w:p>
       <w:pPr>
         <w:pStyle w:val="StandardWeb"/>
@@ -14793,7 +14897,6 @@
       <w:r>
         <w:t xml:space="preserve">Die Ergebnisse werden über DMA direkt in das Array </w:t>
       </w:r>
-      <w:proofErr w:type="spellStart"/>
       <w:r>
         <w:rPr>
           <w:rStyle w:val="HTMLCode"/>
@@ -14801,7 +14904,6 @@
         </w:rPr>
         <w:t>joystick_adc_values</w:t>
       </w:r>
-      <w:proofErr w:type="spellEnd"/>
       <w:r>
         <w:t xml:space="preserve"> geschrieben:</w:t>
       </w:r>
@@ -14834,7 +14936,7 @@
                     <pic:cNvPicPr/>
                   </pic:nvPicPr>
                   <pic:blipFill rotWithShape="1">
-                    <a:blip r:embed="rId19"/>
+                    <a:blip r:embed="rId24"/>
                     <a:srcRect t="1" b="9565"/>
                     <a:stretch>
                       <a:fillRect/>
@@ -14872,19 +14974,11 @@
           <w:lang w:val="en-GB"/>
         </w:rPr>
       </w:pPr>
-      <w:proofErr w:type="spellStart"/>
       <w:r>
         <w:rPr>
           <w:lang w:val="en-GB"/>
         </w:rPr>
-        <w:t>Abbildung</w:t>
-      </w:r>
-      <w:proofErr w:type="spellEnd"/>
-      <w:r>
-        <w:rPr>
-          <w:lang w:val="en-GB"/>
-        </w:rPr>
-        <w:t xml:space="preserve"> </w:t>
+        <w:t xml:space="preserve">Abbildung </w:t>
       </w:r>
       <w:r>
         <w:fldChar w:fldCharType="begin"/>
@@ -14903,7 +14997,7 @@
           <w:noProof/>
           <w:lang w:val="en-GB"/>
         </w:rPr>
-        <w:t>9</w:t>
+        <w:t>14</w:t>
       </w:r>
       <w:r>
         <w:fldChar w:fldCharType="end"/>
@@ -14912,21 +15006,7 @@
         <w:rPr>
           <w:lang w:val="en-GB"/>
         </w:rPr>
-        <w:t>, Array ADC-Values (</w:t>
-      </w:r>
-      <w:proofErr w:type="spellStart"/>
-      <w:r>
-        <w:rPr>
-          <w:lang w:val="en-GB"/>
-        </w:rPr>
-        <w:t>joystick.h</w:t>
-      </w:r>
-      <w:proofErr w:type="spellEnd"/>
-      <w:r>
-        <w:rPr>
-          <w:lang w:val="en-GB"/>
-        </w:rPr>
-        <w:t>)</w:t>
+        <w:t>, Array ADC-Values (joystick.h)</w:t>
       </w:r>
     </w:p>
     <w:p>
@@ -14972,7 +15052,7 @@
                     <pic:cNvPicPr/>
                   </pic:nvPicPr>
                   <pic:blipFill>
-                    <a:blip r:embed="rId20"/>
+                    <a:blip r:embed="rId25"/>
                     <a:stretch>
                       <a:fillRect/>
                     </a:stretch>
@@ -15006,19 +15086,11 @@
           <w:rPr>
             <w:noProof/>
           </w:rPr>
-          <w:t>10</w:t>
+          <w:t>15</w:t>
         </w:r>
       </w:fldSimple>
       <w:r>
-        <w:t>, ADC-Konfiguration (</w:t>
-      </w:r>
-      <w:proofErr w:type="spellStart"/>
-      <w:r>
-        <w:t>joystick.c</w:t>
-      </w:r>
-      <w:proofErr w:type="spellEnd"/>
-      <w:r>
-        <w:t>)</w:t>
+        <w:t>, ADC-Konfiguration (joystick.c)</w:t>
       </w:r>
     </w:p>
     <w:p/>
@@ -15037,37 +15109,12 @@
       <w:r>
         <w:t xml:space="preserve">Vor dem Start der Messung wird der ADC kalibriert. Anschließend startet </w:t>
       </w:r>
-      <w:proofErr w:type="spellStart"/>
       <w:r>
         <w:rPr>
           <w:rStyle w:val="HTMLCode"/>
           <w:rFonts w:ascii="Times New Roman" w:hAnsi="Times New Roman" w:cs="Times New Roman"/>
         </w:rPr>
-        <w:t>HAL_ADC_Start_</w:t>
-      </w:r>
-      <w:proofErr w:type="gramStart"/>
-      <w:r>
-        <w:rPr>
-          <w:rStyle w:val="HTMLCode"/>
-          <w:rFonts w:ascii="Times New Roman" w:hAnsi="Times New Roman" w:cs="Times New Roman"/>
-        </w:rPr>
-        <w:t>DMA</w:t>
-      </w:r>
-      <w:proofErr w:type="spellEnd"/>
-      <w:r>
-        <w:rPr>
-          <w:rStyle w:val="HTMLCode"/>
-          <w:rFonts w:ascii="Times New Roman" w:hAnsi="Times New Roman" w:cs="Times New Roman"/>
-        </w:rPr>
-        <w:t>(</w:t>
-      </w:r>
-      <w:proofErr w:type="gramEnd"/>
-      <w:r>
-        <w:rPr>
-          <w:rStyle w:val="HTMLCode"/>
-          <w:rFonts w:ascii="Times New Roman" w:hAnsi="Times New Roman" w:cs="Times New Roman"/>
-        </w:rPr>
-        <w:t>)</w:t>
+        <w:t>HAL_ADC_Start_DMA()</w:t>
       </w:r>
       <w:r>
         <w:t xml:space="preserve"> die kontinuierliche Erfassung.</w:t>
@@ -15077,22 +15124,7 @@
       <w:pPr>
         <w:pStyle w:val="StandardWeb"/>
       </w:pPr>
-    </w:p>
-    <w:p>
-      <w:pPr>
-        <w:spacing w:line="259" w:lineRule="auto"/>
-        <w:rPr>
-          <w:rFonts w:ascii="Times New Roman" w:eastAsiaTheme="majorEastAsia" w:hAnsi="Times New Roman" w:cs="Times New Roman"/>
-          <w:b/>
-          <w:color w:val="000000" w:themeColor="text1"/>
-          <w:sz w:val="28"/>
-          <w:szCs w:val="24"/>
-        </w:rPr>
-      </w:pPr>
-      <w:r>
-        <w:rPr>
-          <w:rFonts w:ascii="Times New Roman" w:hAnsi="Times New Roman" w:cs="Times New Roman"/>
-        </w:rPr>
+      <w:r>
         <w:br w:type="page"/>
       </w:r>
     </w:p>
@@ -15131,37 +15163,12 @@
       <w:r>
         <w:t xml:space="preserve"> als Motorsteuerwerte verwendet werden. Sie werden daher durch die Funktion </w:t>
       </w:r>
-      <w:proofErr w:type="spellStart"/>
       <w:r>
         <w:rPr>
           <w:rStyle w:val="HTMLCode"/>
           <w:rFonts w:ascii="Times New Roman" w:hAnsi="Times New Roman" w:cs="Times New Roman"/>
         </w:rPr>
-        <w:t>scale_</w:t>
-      </w:r>
-      <w:proofErr w:type="gramStart"/>
-      <w:r>
-        <w:rPr>
-          <w:rStyle w:val="HTMLCode"/>
-          <w:rFonts w:ascii="Times New Roman" w:hAnsi="Times New Roman" w:cs="Times New Roman"/>
-        </w:rPr>
-        <w:t>axis</w:t>
-      </w:r>
-      <w:proofErr w:type="spellEnd"/>
-      <w:r>
-        <w:rPr>
-          <w:rStyle w:val="HTMLCode"/>
-          <w:rFonts w:ascii="Times New Roman" w:hAnsi="Times New Roman" w:cs="Times New Roman"/>
-        </w:rPr>
-        <w:t>(</w:t>
-      </w:r>
-      <w:proofErr w:type="gramEnd"/>
-      <w:r>
-        <w:rPr>
-          <w:rStyle w:val="HTMLCode"/>
-          <w:rFonts w:ascii="Times New Roman" w:hAnsi="Times New Roman" w:cs="Times New Roman"/>
-        </w:rPr>
-        <w:t>)</w:t>
+        <w:t>scale_axis()</w:t>
       </w:r>
       <w:r>
         <w:t xml:space="preserve"> auf den Bereich −127 bis +127 umgerechnet.</w:t>
@@ -15201,7 +15208,7 @@
                     <pic:cNvPicPr/>
                   </pic:nvPicPr>
                   <pic:blipFill>
-                    <a:blip r:embed="rId21"/>
+                    <a:blip r:embed="rId26"/>
                     <a:stretch>
                       <a:fillRect/>
                     </a:stretch>
@@ -15235,20 +15242,15 @@
           <w:rPr>
             <w:noProof/>
           </w:rPr>
-          <w:t>11</w:t>
+          <w:t>16</w:t>
         </w:r>
       </w:fldSimple>
       <w:r>
-        <w:t>, ADC-Kalibrierwerte (</w:t>
-      </w:r>
-      <w:proofErr w:type="spellStart"/>
-      <w:r>
-        <w:t>joystick.</w:t>
+        <w:t>, ADC-Kalibrierwerte (joystick.</w:t>
       </w:r>
       <w:r>
         <w:t>h</w:t>
       </w:r>
-      <w:proofErr w:type="spellEnd"/>
       <w:r>
         <w:t>)</w:t>
       </w:r>
@@ -15422,15 +15424,7 @@
         <w:pStyle w:val="StandardWeb"/>
       </w:pPr>
       <w:r>
-        <w:t xml:space="preserve">Zusätzlich wird eine </w:t>
-      </w:r>
-      <w:proofErr w:type="spellStart"/>
-      <w:r>
-        <w:t>Totzone</w:t>
-      </w:r>
-      <w:proofErr w:type="spellEnd"/>
-      <w:r>
-        <w:t xml:space="preserve"> von ±15 verwendet:</w:t>
+        <w:t>Zusätzlich wird eine Totzone von ±15 verwendet:</w:t>
       </w:r>
     </w:p>
     <w:p>
@@ -15482,7 +15476,6 @@
           <w:rFonts w:ascii="Times New Roman" w:hAnsi="Times New Roman" w:cs="Times New Roman"/>
         </w:rPr>
       </w:pPr>
-      <w:proofErr w:type="spellStart"/>
       <w:r>
         <w:rPr>
           <w:rStyle w:val="HTMLCode"/>
@@ -15490,7 +15483,6 @@
         </w:rPr>
         <w:t>con_x</w:t>
       </w:r>
-      <w:proofErr w:type="spellEnd"/>
     </w:p>
     <w:p>
       <w:pPr>
@@ -15501,7 +15493,6 @@
           <w:rFonts w:ascii="Times New Roman" w:hAnsi="Times New Roman" w:cs="Times New Roman"/>
         </w:rPr>
       </w:pPr>
-      <w:proofErr w:type="spellStart"/>
       <w:r>
         <w:rPr>
           <w:rStyle w:val="HTMLCode"/>
@@ -15509,7 +15500,6 @@
         </w:rPr>
         <w:t>con_y</w:t>
       </w:r>
-      <w:proofErr w:type="spellEnd"/>
     </w:p>
     <w:p>
       <w:pPr>
@@ -15519,7 +15509,6 @@
           <w:rFonts w:ascii="Times New Roman" w:hAnsi="Times New Roman" w:cs="Times New Roman"/>
         </w:rPr>
       </w:pPr>
-      <w:proofErr w:type="spellStart"/>
       <w:r>
         <w:rPr>
           <w:rStyle w:val="HTMLCode"/>
@@ -15527,7 +15516,6 @@
         </w:rPr>
         <w:t>con_z</w:t>
       </w:r>
-      <w:proofErr w:type="spellEnd"/>
     </w:p>
     <w:p>
       <w:pPr>
@@ -15556,15 +15544,7 @@
         <w:pStyle w:val="StandardWeb"/>
       </w:pPr>
       <w:r>
-        <w:t>Die beiden Taster werden als digitale Eingänge mit internen Pull-</w:t>
-      </w:r>
-      <w:proofErr w:type="spellStart"/>
-      <w:r>
-        <w:t>up</w:t>
-      </w:r>
-      <w:proofErr w:type="spellEnd"/>
-      <w:r>
-        <w:t>-Widerständen verwendet. Im nicht gedrückten Zustand liegt am Eingang ein High-Pegel an. Beim Drücken wird der Eingang mit Masse verbunden. Die Taster sind daher aktiv-low.</w:t>
+        <w:t>Die beiden Taster werden als digitale Eingänge mit internen Pull-up-Widerständen verwendet. Im nicht gedrückten Zustand liegt am Eingang ein High-Pegel an. Beim Drücken wird der Eingang mit Masse verbunden. Die Taster sind daher aktiv-low.</w:t>
       </w:r>
     </w:p>
     <w:p>
@@ -15627,23 +15607,7 @@
         <w:pStyle w:val="StandardWeb"/>
       </w:pPr>
       <w:r>
-        <w:t xml:space="preserve">Die Umschaltung erfolgt nur bei einer neuen Tastenbetätigung. Ein dauerhaft gedrückter Taster löst somit nicht fortlaufend weitere Umschaltungen aus. Für Taster 2 ist zusätzlich eine </w:t>
-      </w:r>
-      <w:proofErr w:type="spellStart"/>
-      <w:r>
-        <w:t>Entprellzeit</w:t>
-      </w:r>
-      <w:proofErr w:type="spellEnd"/>
-      <w:r>
-        <w:t xml:space="preserve"> von 150 </w:t>
-      </w:r>
-      <w:proofErr w:type="spellStart"/>
-      <w:r>
-        <w:t>ms</w:t>
-      </w:r>
-      <w:proofErr w:type="spellEnd"/>
-      <w:r>
-        <w:t xml:space="preserve"> vorgesehen.</w:t>
+        <w:t>Die Umschaltung erfolgt nur bei einer neuen Tastenbetätigung. Ein dauerhaft gedrückter Taster löst somit nicht fortlaufend weitere Umschaltungen aus. Für Taster 2 ist zusätzlich eine Entprellzeit von 150 ms vorgesehen.</w:t>
       </w:r>
     </w:p>
     <w:p>
@@ -15756,21 +15720,12 @@
           <w:rFonts w:ascii="Times New Roman" w:hAnsi="Times New Roman" w:cs="Times New Roman"/>
         </w:rPr>
       </w:pPr>
-      <w:proofErr w:type="spellStart"/>
       <w:r>
         <w:rPr>
           <w:rStyle w:val="HTMLCode"/>
           <w:rFonts w:ascii="Times New Roman" w:hAnsi="Times New Roman" w:cs="Times New Roman"/>
         </w:rPr>
-        <w:t>con_y</w:t>
-      </w:r>
-      <w:proofErr w:type="spellEnd"/>
-      <w:r>
-        <w:rPr>
-          <w:rStyle w:val="HTMLCode"/>
-          <w:rFonts w:ascii="Times New Roman" w:hAnsi="Times New Roman" w:cs="Times New Roman"/>
-        </w:rPr>
-        <w:t xml:space="preserve"> &gt; 0: Vorwärtsfahrt</w:t>
+        <w:t>con_y &gt; 0: Vorwärtsfahrt</w:t>
       </w:r>
     </w:p>
     <w:p>
@@ -15782,21 +15737,12 @@
           <w:rFonts w:ascii="Times New Roman" w:hAnsi="Times New Roman" w:cs="Times New Roman"/>
         </w:rPr>
       </w:pPr>
-      <w:proofErr w:type="spellStart"/>
       <w:r>
         <w:rPr>
           <w:rStyle w:val="HTMLCode"/>
           <w:rFonts w:ascii="Times New Roman" w:hAnsi="Times New Roman" w:cs="Times New Roman"/>
         </w:rPr>
-        <w:t>con_y</w:t>
-      </w:r>
-      <w:proofErr w:type="spellEnd"/>
-      <w:r>
-        <w:rPr>
-          <w:rStyle w:val="HTMLCode"/>
-          <w:rFonts w:ascii="Times New Roman" w:hAnsi="Times New Roman" w:cs="Times New Roman"/>
-        </w:rPr>
-        <w:t xml:space="preserve"> &lt; 0: Rückwärtsfahrt</w:t>
+        <w:t>con_y &lt; 0: Rückwärtsfahrt</w:t>
       </w:r>
     </w:p>
     <w:p>
@@ -15808,21 +15754,12 @@
           <w:rFonts w:ascii="Times New Roman" w:hAnsi="Times New Roman" w:cs="Times New Roman"/>
         </w:rPr>
       </w:pPr>
-      <w:proofErr w:type="spellStart"/>
       <w:r>
         <w:rPr>
           <w:rStyle w:val="HTMLCode"/>
           <w:rFonts w:ascii="Times New Roman" w:hAnsi="Times New Roman" w:cs="Times New Roman"/>
         </w:rPr>
-        <w:t>con_y</w:t>
-      </w:r>
-      <w:proofErr w:type="spellEnd"/>
-      <w:r>
-        <w:rPr>
-          <w:rStyle w:val="HTMLCode"/>
-          <w:rFonts w:ascii="Times New Roman" w:hAnsi="Times New Roman" w:cs="Times New Roman"/>
-        </w:rPr>
-        <w:t xml:space="preserve"> = 0: Stillstand</w:t>
+        <w:t>con_y = 0: Stillstand</w:t>
       </w:r>
     </w:p>
     <w:p>
@@ -15851,21 +15788,12 @@
           <w:rFonts w:ascii="Times New Roman" w:hAnsi="Times New Roman" w:cs="Times New Roman"/>
         </w:rPr>
       </w:pPr>
-      <w:proofErr w:type="spellStart"/>
       <w:r>
         <w:rPr>
           <w:rStyle w:val="HTMLCode"/>
           <w:rFonts w:ascii="Times New Roman" w:hAnsi="Times New Roman" w:cs="Times New Roman"/>
         </w:rPr>
-        <w:t>con_x</w:t>
-      </w:r>
-      <w:proofErr w:type="spellEnd"/>
-      <w:r>
-        <w:rPr>
-          <w:rStyle w:val="HTMLCode"/>
-          <w:rFonts w:ascii="Times New Roman" w:hAnsi="Times New Roman" w:cs="Times New Roman"/>
-        </w:rPr>
-        <w:t xml:space="preserve"> &gt; 0: Rechtskurve</w:t>
+        <w:t>con_x &gt; 0: Rechtskurve</w:t>
       </w:r>
     </w:p>
     <w:p>
@@ -15877,21 +15805,12 @@
           <w:rFonts w:ascii="Times New Roman" w:hAnsi="Times New Roman" w:cs="Times New Roman"/>
         </w:rPr>
       </w:pPr>
-      <w:proofErr w:type="spellStart"/>
       <w:r>
         <w:rPr>
           <w:rStyle w:val="HTMLCode"/>
           <w:rFonts w:ascii="Times New Roman" w:hAnsi="Times New Roman" w:cs="Times New Roman"/>
         </w:rPr>
-        <w:t>con_x</w:t>
-      </w:r>
-      <w:proofErr w:type="spellEnd"/>
-      <w:r>
-        <w:rPr>
-          <w:rStyle w:val="HTMLCode"/>
-          <w:rFonts w:ascii="Times New Roman" w:hAnsi="Times New Roman" w:cs="Times New Roman"/>
-        </w:rPr>
-        <w:t xml:space="preserve"> &lt; 0: Linkskurve</w:t>
+        <w:t>con_x &lt; 0: Linkskurve</w:t>
       </w:r>
     </w:p>
     <w:p>
@@ -15903,21 +15822,12 @@
           <w:rFonts w:ascii="Times New Roman" w:hAnsi="Times New Roman" w:cs="Times New Roman"/>
         </w:rPr>
       </w:pPr>
-      <w:proofErr w:type="spellStart"/>
       <w:r>
         <w:rPr>
           <w:rStyle w:val="HTMLCode"/>
           <w:rFonts w:ascii="Times New Roman" w:hAnsi="Times New Roman" w:cs="Times New Roman"/>
         </w:rPr>
-        <w:t>con_x</w:t>
-      </w:r>
-      <w:proofErr w:type="spellEnd"/>
-      <w:r>
-        <w:rPr>
-          <w:rStyle w:val="HTMLCode"/>
-          <w:rFonts w:ascii="Times New Roman" w:hAnsi="Times New Roman" w:cs="Times New Roman"/>
-        </w:rPr>
-        <w:t xml:space="preserve"> = 0: Geradeausfahrt</w:t>
+        <w:t>con_x = 0: Geradeausfahrt</w:t>
       </w:r>
     </w:p>
     <w:p>
@@ -15953,18 +15863,8 @@
           <w:rFonts w:ascii="Times New Roman" w:hAnsi="Times New Roman" w:cs="Times New Roman"/>
           <w:lang w:val="en-GB"/>
         </w:rPr>
-        <w:t xml:space="preserve">Motor A = </w:t>
-      </w:r>
-      <w:proofErr w:type="spellStart"/>
-      <w:r>
-        <w:rPr>
-          <w:rStyle w:val="HTMLCode"/>
-          <w:rFonts w:ascii="Times New Roman" w:hAnsi="Times New Roman" w:cs="Times New Roman"/>
-          <w:lang w:val="en-GB"/>
-        </w:rPr>
-        <w:t>con_y</w:t>
-      </w:r>
-      <w:proofErr w:type="spellEnd"/>
+        <w:t>Motor A = con_y</w:t>
+      </w:r>
     </w:p>
     <w:p>
       <w:pPr>
@@ -15982,18 +15882,8 @@
           <w:rFonts w:ascii="Times New Roman" w:hAnsi="Times New Roman" w:cs="Times New Roman"/>
           <w:lang w:val="en-GB"/>
         </w:rPr>
-        <w:t xml:space="preserve">Motor B = </w:t>
-      </w:r>
-      <w:proofErr w:type="spellStart"/>
-      <w:r>
-        <w:rPr>
-          <w:rStyle w:val="HTMLCode"/>
-          <w:rFonts w:ascii="Times New Roman" w:hAnsi="Times New Roman" w:cs="Times New Roman"/>
-          <w:lang w:val="en-GB"/>
-        </w:rPr>
-        <w:t>con_y</w:t>
-      </w:r>
-      <w:proofErr w:type="spellEnd"/>
+        <w:t>Motor B = con_y</w:t>
+      </w:r>
     </w:p>
     <w:p>
       <w:pPr>
@@ -16536,7 +16426,7 @@
                     <pic:cNvPicPr/>
                   </pic:nvPicPr>
                   <pic:blipFill>
-                    <a:blip r:embed="rId22"/>
+                    <a:blip r:embed="rId27"/>
                     <a:stretch>
                       <a:fillRect/>
                     </a:stretch>
@@ -16570,19 +16460,11 @@
           <w:rPr>
             <w:noProof/>
           </w:rPr>
-          <w:t>12</w:t>
+          <w:t>17</w:t>
         </w:r>
       </w:fldSimple>
       <w:r>
-        <w:t>, Drehmodus (</w:t>
-      </w:r>
-      <w:proofErr w:type="spellStart"/>
-      <w:r>
-        <w:t>communication_module.c</w:t>
-      </w:r>
-      <w:proofErr w:type="spellEnd"/>
-      <w:r>
-        <w:t>)</w:t>
+        <w:t>, Drehmodus (communication_module.c)</w:t>
       </w:r>
     </w:p>
     <w:p/>
@@ -16797,53 +16679,8 @@
         <w:br/>
       </w:r>
       <w:r>
-        <w:t xml:space="preserve">Der grundlegende Aufbau der fünf Byte langen Datenframes sowie die Berechnung der Prüfsumme wurden bereits in Kapitel 2.3 anhand der aufgezeichneten Motorkommunikation beschrieben. Die Software setzt diesen Aufbau in den Funktionen </w:t>
-      </w:r>
-      <w:proofErr w:type="spellStart"/>
-      <w:r>
-        <w:t>send_frame_</w:t>
-      </w:r>
-      <w:proofErr w:type="gramStart"/>
-      <w:r>
-        <w:t>A</w:t>
-      </w:r>
-      <w:proofErr w:type="spellEnd"/>
-      <w:r>
-        <w:t>(</w:t>
-      </w:r>
-      <w:proofErr w:type="gramEnd"/>
-      <w:r>
-        <w:t xml:space="preserve">) und </w:t>
-      </w:r>
-      <w:proofErr w:type="spellStart"/>
-      <w:r>
-        <w:t>send_frame_</w:t>
-      </w:r>
-      <w:proofErr w:type="gramStart"/>
-      <w:r>
-        <w:t>B</w:t>
-      </w:r>
-      <w:proofErr w:type="spellEnd"/>
-      <w:r>
-        <w:t>(</w:t>
-      </w:r>
-      <w:proofErr w:type="gramEnd"/>
-      <w:r>
-        <w:t>) um. Dort werden Adresse, Befehl und Datenbytes in den Sendepuffer eingetragen und anschließend die Prüfsumme gebildet.</w:t>
-      </w:r>
-    </w:p>
-    <w:p>
-      <w:pPr>
-        <w:pStyle w:val="berschrift3"/>
-        <w:numPr>
-          <w:ilvl w:val="0"/>
-          <w:numId w:val="0"/>
-        </w:numPr>
-        <w:ind w:left="720" w:hanging="720"/>
-        <w:rPr>
-          <w:rFonts w:ascii="Times New Roman" w:hAnsi="Times New Roman" w:cs="Times New Roman"/>
-        </w:rPr>
-      </w:pPr>
+        <w:t>Der grundlegende Aufbau der fünf Byte langen Datenframes sowie die Berechnung der Prüfsumme wurden bereits in Kapitel 2.3 anhand der aufgezeichneten Motorkommunikation beschrieben. Die Software setzt diesen Aufbau in den Funktionen send_frame_A() und send_frame_B() um. Dort werden Adresse, Befehl und Datenbytes in den Sendepuffer eingetragen und anschließend die Prüfsumme gebildet.</w:t>
+      </w:r>
     </w:p>
     <w:p/>
     <w:p>
@@ -16973,7 +16810,7 @@
                     <pic:cNvPicPr/>
                   </pic:nvPicPr>
                   <pic:blipFill>
-                    <a:blip r:embed="rId23"/>
+                    <a:blip r:embed="rId28"/>
                     <a:stretch>
                       <a:fillRect/>
                     </a:stretch>
@@ -17010,7 +16847,7 @@
           <w:rPr>
             <w:noProof/>
           </w:rPr>
-          <w:t>13</w:t>
+          <w:t>18</w:t>
         </w:r>
       </w:fldSimple>
       <w:r>
@@ -17057,15 +16894,7 @@
         <w:t>0x25</w:t>
       </w:r>
       <w:r>
-        <w:t xml:space="preserve"> verwendet. Ein Motorwert von null wird als Richtung null und Betrag null übertragen. Die Steuertelegramme werden für beide Motoren alle 30 </w:t>
-      </w:r>
-      <w:proofErr w:type="spellStart"/>
-      <w:r>
-        <w:t>ms</w:t>
-      </w:r>
-      <w:proofErr w:type="spellEnd"/>
-      <w:r>
-        <w:t xml:space="preserve"> neu gesendet.</w:t>
+        <w:t xml:space="preserve"> verwendet. Ein Motorwert von null wird als Richtung null und Betrag null übertragen. Die Steuertelegramme werden für beide Motoren alle 30 ms neu gesendet.</w:t>
       </w:r>
     </w:p>
     <w:p>
@@ -17417,15 +17246,7 @@
         <w:t>0x23</w:t>
       </w:r>
       <w:r>
-        <w:t xml:space="preserve"> gesendet. Sobald danach ein normales Statusframe empfangen wird, gilt </w:t>
-      </w:r>
-      <w:proofErr w:type="gramStart"/>
-      <w:r>
-        <w:t>der Motor</w:t>
-      </w:r>
-      <w:proofErr w:type="gramEnd"/>
-      <w:r>
-        <w:t xml:space="preserve"> als betriebsbereit und der Zustand wird auf </w:t>
+        <w:t xml:space="preserve"> gesendet. Sobald danach ein normales Statusframe empfangen wird, gilt der Motor als betriebsbereit und der Zustand wird auf </w:t>
       </w:r>
       <w:r>
         <w:rPr>
@@ -17471,23 +17292,7 @@
         <w:pStyle w:val="StandardWeb"/>
       </w:pPr>
       <w:r>
-        <w:t xml:space="preserve">Erhält die Software im Zustand WAIT_VOLTAGE keine entsprechende Bereitschaftsmeldung, verbleibt der Motor in diesem Zustand und es wird kein Fahrbefehl mit einem von null verschiedenen Leistungswert übertragen. Bei der Fehlersuche kann daher über </w:t>
-      </w:r>
-      <w:proofErr w:type="spellStart"/>
-      <w:r>
-        <w:t>motor_state_A</w:t>
-      </w:r>
-      <w:proofErr w:type="spellEnd"/>
-      <w:r>
-        <w:t xml:space="preserve"> und </w:t>
-      </w:r>
-      <w:proofErr w:type="spellStart"/>
-      <w:r>
-        <w:t>motor_state_B</w:t>
-      </w:r>
-      <w:proofErr w:type="spellEnd"/>
-      <w:r>
-        <w:t xml:space="preserve"> geprüft werden, an welcher Stelle der Startsequenz sich die jeweilige Motorsteuerung befindet.</w:t>
+        <w:t>Erhält die Software im Zustand WAIT_VOLTAGE keine entsprechende Bereitschaftsmeldung, verbleibt der Motor in diesem Zustand und es wird kein Fahrbefehl mit einem von null verschiedenen Leistungswert übertragen. Bei der Fehlersuche kann daher über motor_state_A und motor_state_B geprüft werden, an welcher Stelle der Startsequenz sich die jeweilige Motorsteuerung befindet.</w:t>
       </w:r>
     </w:p>
     <w:p>
@@ -17557,11 +17362,6 @@
         </w:rPr>
         <w:t>3 = FAULT</w:t>
       </w:r>
-    </w:p>
-    <w:p>
-      <w:pPr>
-        <w:pStyle w:val="StandardWeb"/>
-      </w:pPr>
     </w:p>
     <w:p>
       <w:pPr>
@@ -17574,6 +17374,9 @@
           <w:szCs w:val="24"/>
         </w:rPr>
       </w:pPr>
+      <w:r>
+        <w:br w:type="page"/>
+      </w:r>
     </w:p>
     <w:p>
       <w:pPr>
@@ -17616,11 +17419,9 @@
       <w:r>
         <w:t xml:space="preserve">Der Empfang erfolgt </w:t>
       </w:r>
-      <w:proofErr w:type="spellStart"/>
-      <w:r>
-        <w:t>interruptgesteuert</w:t>
-      </w:r>
-      <w:proofErr w:type="spellEnd"/>
+      <w:r>
+        <w:t>Interrupt gesteuert</w:t>
+      </w:r>
       <w:r>
         <w:t xml:space="preserve"> und byteweise. Für Motor A wird USART1 und für Motor B USART3 verwendet. Nach jedem empfangenen Byte wird die HAL-Callback-Funktion aufgerufen.</w:t>
       </w:r>
@@ -17671,7 +17472,7 @@
                     <pic:cNvPicPr/>
                   </pic:nvPicPr>
                   <pic:blipFill>
-                    <a:blip r:embed="rId24"/>
+                    <a:blip r:embed="rId29"/>
                     <a:stretch>
                       <a:fillRect/>
                     </a:stretch>
@@ -17700,19 +17501,11 @@
           <w:lang w:val="en-GB"/>
         </w:rPr>
       </w:pPr>
-      <w:proofErr w:type="spellStart"/>
       <w:r>
         <w:rPr>
           <w:lang w:val="en-GB"/>
         </w:rPr>
-        <w:t>Abbildung</w:t>
-      </w:r>
-      <w:proofErr w:type="spellEnd"/>
-      <w:r>
-        <w:rPr>
-          <w:lang w:val="en-GB"/>
-        </w:rPr>
-        <w:t xml:space="preserve"> </w:t>
+        <w:t xml:space="preserve">Abbildung </w:t>
       </w:r>
       <w:r>
         <w:fldChar w:fldCharType="begin"/>
@@ -17731,7 +17524,7 @@
           <w:noProof/>
           <w:lang w:val="en-GB"/>
         </w:rPr>
-        <w:t>14</w:t>
+        <w:t>19</w:t>
       </w:r>
       <w:r>
         <w:fldChar w:fldCharType="end"/>
@@ -17758,7 +17551,6 @@
       <w:r>
         <w:t xml:space="preserve">Sobald ein vollständiges Frame vorliegt, wird das Kennzeichen </w:t>
       </w:r>
-      <w:proofErr w:type="spellStart"/>
       <w:r>
         <w:rPr>
           <w:rStyle w:val="HTMLCode"/>
@@ -17766,11 +17558,9 @@
         </w:rPr>
         <w:t>frame_ready_A</w:t>
       </w:r>
-      <w:proofErr w:type="spellEnd"/>
       <w:r>
         <w:t xml:space="preserve"> beziehungsweise </w:t>
       </w:r>
-      <w:proofErr w:type="spellStart"/>
       <w:r>
         <w:rPr>
           <w:rStyle w:val="HTMLCode"/>
@@ -17778,7 +17568,6 @@
         </w:rPr>
         <w:t>frame_ready_B</w:t>
       </w:r>
-      <w:proofErr w:type="spellEnd"/>
       <w:r>
         <w:t xml:space="preserve"> gesetzt. Die eigentliche Auswertung findet anschließend in der Hauptschleife statt. Zuerst wird die Prüfsumme kontrolliert. Nur gültige Frames werden weiterverarbeitet. Für Diagnosezwecke zählt die Software sowohl gültige Frames als auch Prüfsummenfehler.</w:t>
       </w:r>
@@ -17788,23 +17577,7 @@
         <w:pStyle w:val="StandardWeb"/>
       </w:pPr>
       <w:r>
-        <w:t xml:space="preserve">Die HAL-Funktion </w:t>
-      </w:r>
-      <w:proofErr w:type="spellStart"/>
-      <w:r>
-        <w:t>HAL_UART_</w:t>
-      </w:r>
-      <w:proofErr w:type="gramStart"/>
-      <w:r>
-        <w:t>RxCpltCallback</w:t>
-      </w:r>
-      <w:proofErr w:type="spellEnd"/>
-      <w:r>
-        <w:t>(</w:t>
-      </w:r>
-      <w:proofErr w:type="gramEnd"/>
-      <w:r>
-        <w:t>) wird nach jedem vollständig empfangenen Byte aufgerufen. Sie leitet den Aufruf zunächst an das Kommunikationsmodul und anschließend an das RS485-Modul weiter. Dort wird anhand des übergebenen UART-Handles unterschieden, ob das Byte zu Motor A oder Motor B gehört.</w:t>
+        <w:t>Die HAL-Funktion HAL_UART_RxCpltCallback() wird nach jedem vollständig empfangenen Byte aufgerufen. Sie leitet den Aufruf zunächst an das Kommunikationsmodul und anschließend an das RS485-Modul weiter. Dort wird anhand des übergebenen UART-Handles unterschieden, ob das Byte zu Motor A oder Motor B gehört.</w:t>
       </w:r>
     </w:p>
     <w:p>
@@ -17986,16 +17759,8 @@
               <w:rPr>
                 <w:rFonts w:ascii="Times New Roman" w:hAnsi="Times New Roman" w:cs="Times New Roman"/>
               </w:rPr>
-              <w:t xml:space="preserve">1 </w:t>
-            </w:r>
-            <w:proofErr w:type="spellStart"/>
-            <w:r>
-              <w:rPr>
-                <w:rFonts w:ascii="Times New Roman" w:hAnsi="Times New Roman" w:cs="Times New Roman"/>
-              </w:rPr>
-              <w:t>rpm</w:t>
-            </w:r>
-            <w:proofErr w:type="spellEnd"/>
+              <w:t>1 rpm</w:t>
+            </w:r>
           </w:p>
         </w:tc>
       </w:tr>
@@ -18418,23 +18183,7 @@
         <w:pStyle w:val="StandardWeb"/>
       </w:pPr>
       <w:r>
-        <w:t xml:space="preserve">Bis zum Empfang des ersten gültigen Statusframes besitzen die gespeicherten Motorwerte den Initialwert null. Wird die Kommunikation später unterbrochen, bleiben die zuletzt gültig empfangenen Werte im aktuellen Programm gespeichert. Die Displayanzeige allein zeigt deshalb nicht sicher an, ob weiterhin neue Frames empfangen werden. Zur Kontrolle müssen zusätzlich die Zähler </w:t>
-      </w:r>
-      <w:proofErr w:type="spellStart"/>
-      <w:r>
-        <w:t>valid_frames_A</w:t>
-      </w:r>
-      <w:proofErr w:type="spellEnd"/>
-      <w:r>
-        <w:t xml:space="preserve"> und </w:t>
-      </w:r>
-      <w:proofErr w:type="spellStart"/>
-      <w:r>
-        <w:t>valid_frames_B</w:t>
-      </w:r>
-      <w:proofErr w:type="spellEnd"/>
-      <w:r>
-        <w:t xml:space="preserve"> beobachtet werden. Diese müssen während einer funktionierenden Kommunikation kontinuierlich ansteigen.</w:t>
+        <w:t>Bis zum Empfang des ersten gültigen Statusframes besitzen die gespeicherten Motorwerte den Initialwert null. Wird die Kommunikation später unterbrochen, bleiben die zuletzt gültig empfangenen Werte im aktuellen Programm gespeichert. Die Displayanzeige allein zeigt deshalb nicht sicher an, ob weiterhin neue Frames empfangen werden. Zur Kontrolle müssen zusätzlich die Zähler valid_frames_A und valid_frames_B beobachtet werden. Diese müssen während einer funktionierenden Kommunikation kontinuierlich ansteigen.</w:t>
       </w:r>
     </w:p>
     <w:p>
@@ -18442,23 +18191,7 @@
         <w:pStyle w:val="StandardWeb"/>
       </w:pPr>
       <w:r>
-        <w:t xml:space="preserve">Die Variablen </w:t>
-      </w:r>
-      <w:proofErr w:type="spellStart"/>
-      <w:r>
-        <w:t>checksum_errors_A</w:t>
-      </w:r>
-      <w:proofErr w:type="spellEnd"/>
-      <w:r>
-        <w:t xml:space="preserve"> und </w:t>
-      </w:r>
-      <w:proofErr w:type="spellStart"/>
-      <w:r>
-        <w:t>checksum_errors_B</w:t>
-      </w:r>
-      <w:proofErr w:type="spellEnd"/>
-      <w:r>
-        <w:t xml:space="preserve"> zählen Frames mit fehlerhafter Prüfsumme. Steigen diese Werte an, deutet dies beispielsweise auf eine gestörte RS485-Übertragung, eine fehlerhafte Verdrahtung oder falsche Schnittstelleneinstellungen hin.</w:t>
+        <w:t>Die Variablen checksum_errors_A und checksum_errors_B zählen Frames mit fehlerhafter Prüfsumme. Steigen diese Werte an, deutet dies beispielsweise auf eine gestörte RS485-Übertragung, eine fehlerhafte Verdrahtung oder falsche Schnittstelleneinstellungen hin.</w:t>
       </w:r>
     </w:p>
     <w:p>
@@ -18521,15 +18254,7 @@
         <w:t>0x22</w:t>
       </w:r>
       <w:r>
-        <w:t xml:space="preserve"> wird auf einen Fehlerwert geprüft. Ein </w:t>
-      </w:r>
-      <w:proofErr w:type="gramStart"/>
-      <w:r>
-        <w:t>von null verschiedener Wert</w:t>
-      </w:r>
-      <w:proofErr w:type="gramEnd"/>
-      <w:r>
-        <w:t xml:space="preserve"> versetzt den entsprechenden Motor in den Zustand </w:t>
+        <w:t xml:space="preserve"> wird auf einen Fehlerwert geprüft. Ein von null verschiedener Wert versetzt den entsprechenden Motor in den Zustand </w:t>
       </w:r>
       <w:r>
         <w:rPr>
@@ -18868,15 +18593,7 @@
         <w:pStyle w:val="StandardWeb"/>
       </w:pPr>
       <w:r>
-        <w:t xml:space="preserve">Bei einem UART-Fehler wird der unvollständige Empfang verworfen, der Empfangsindex auf null gesetzt und der </w:t>
-      </w:r>
-      <w:proofErr w:type="spellStart"/>
-      <w:r>
-        <w:t>interruptgesteuerte</w:t>
-      </w:r>
-      <w:proofErr w:type="spellEnd"/>
-      <w:r>
-        <w:t xml:space="preserve"> Empfang neu gestartet. Frames mit fehlerhafter Prüfsumme werden ebenfalls verworfen.</w:t>
+        <w:t>Bei einem UART-Fehler wird der unvollständige Empfang verworfen, der Empfangsindex auf null gesetzt und der interruptgesteuerte Empfang neu gestartet. Frames mit fehlerhafter Prüfsumme werden ebenfalls verworfen.</w:t>
       </w:r>
     </w:p>
     <w:p>
@@ -18886,37 +18603,12 @@
       <w:r>
         <w:t xml:space="preserve">Tritt bereits während der Initialisierung einer Hardwarekomponente ein Fehler auf, wird </w:t>
       </w:r>
-      <w:proofErr w:type="spellStart"/>
       <w:r>
         <w:rPr>
           <w:rStyle w:val="HTMLCode"/>
           <w:rFonts w:ascii="Times New Roman" w:hAnsi="Times New Roman" w:cs="Times New Roman"/>
         </w:rPr>
-        <w:t>Error_</w:t>
-      </w:r>
-      <w:proofErr w:type="gramStart"/>
-      <w:r>
-        <w:rPr>
-          <w:rStyle w:val="HTMLCode"/>
-          <w:rFonts w:ascii="Times New Roman" w:hAnsi="Times New Roman" w:cs="Times New Roman"/>
-        </w:rPr>
-        <w:t>Handler</w:t>
-      </w:r>
-      <w:proofErr w:type="spellEnd"/>
-      <w:r>
-        <w:rPr>
-          <w:rStyle w:val="HTMLCode"/>
-          <w:rFonts w:ascii="Times New Roman" w:hAnsi="Times New Roman" w:cs="Times New Roman"/>
-        </w:rPr>
-        <w:t>(</w:t>
-      </w:r>
-      <w:proofErr w:type="gramEnd"/>
-      <w:r>
-        <w:rPr>
-          <w:rStyle w:val="HTMLCode"/>
-          <w:rFonts w:ascii="Times New Roman" w:hAnsi="Times New Roman" w:cs="Times New Roman"/>
-        </w:rPr>
-        <w:t>)</w:t>
+        <w:t>Error_Handler()</w:t>
       </w:r>
       <w:r>
         <w:t xml:space="preserve"> aufgerufen. Diese Funktion deaktiviert die Interrupts und hält das Programm in einer Endlosschleife an.</w:t>
@@ -18935,39 +18627,7 @@
         <w:pStyle w:val="StandardWeb"/>
       </w:pPr>
       <w:r>
-        <w:t xml:space="preserve">Bei einer Fehlerdiagnose werden zunächst </w:t>
-      </w:r>
-      <w:proofErr w:type="spellStart"/>
-      <w:r>
-        <w:t>motor_state_A</w:t>
-      </w:r>
-      <w:proofErr w:type="spellEnd"/>
-      <w:r>
-        <w:t xml:space="preserve"> beziehungsweise </w:t>
-      </w:r>
-      <w:proofErr w:type="spellStart"/>
-      <w:r>
-        <w:t>motor_state_B</w:t>
-      </w:r>
-      <w:proofErr w:type="spellEnd"/>
-      <w:r>
-        <w:t xml:space="preserve"> und anschließend </w:t>
-      </w:r>
-      <w:proofErr w:type="spellStart"/>
-      <w:r>
-        <w:t>motor_fault_A</w:t>
-      </w:r>
-      <w:proofErr w:type="spellEnd"/>
-      <w:r>
-        <w:t xml:space="preserve"> beziehungsweise </w:t>
-      </w:r>
-      <w:proofErr w:type="spellStart"/>
-      <w:r>
-        <w:t>motor_fault_B</w:t>
-      </w:r>
-      <w:proofErr w:type="spellEnd"/>
-      <w:r>
-        <w:t xml:space="preserve"> geprüft. Der Motorzustand zeigt, ob die Software einen Fehler erkannt hat. Der Fehlerwert enthält die vom Motor gemeldete Ursache.</w:t>
+        <w:t>Bei einer Fehlerdiagnose werden zunächst motor_state_A beziehungsweise motor_state_B und anschließend motor_fault_A beziehungsweise motor_fault_B geprüft. Der Motorzustand zeigt, ob die Software einen Fehler erkannt hat. Der Fehlerwert enthält die vom Motor gemeldete Ursache.</w:t>
       </w:r>
     </w:p>
     <w:p>
@@ -19033,15 +18693,7 @@
         <w:pStyle w:val="StandardWeb"/>
       </w:pPr>
       <w:r>
-        <w:t xml:space="preserve">Das I²C-Backpack überträgt die Displaydaten im 4-Bit-Modus. Jedes Byte wird deshalb in zwei Gruppen zu je vier Bit aufgeteilt. Über die </w:t>
-      </w:r>
-      <w:proofErr w:type="spellStart"/>
-      <w:r>
-        <w:t>Enable</w:t>
-      </w:r>
-      <w:proofErr w:type="spellEnd"/>
-      <w:r>
-        <w:t>-Leitung wird dem Display signalisiert, wann es die anliegenden Daten übernehmen soll.</w:t>
+        <w:t>Das I²C-Backpack überträgt die Displaydaten im 4-Bit-Modus. Jedes Byte wird deshalb in zwei Gruppen zu je vier Bit aufgeteilt. Über die Enable-Leitung wird dem Display signalisiert, wann es die anliegenden Daten übernehmen soll.</w:t>
       </w:r>
     </w:p>
     <w:p>
@@ -19059,37 +18711,12 @@
       <w:r>
         <w:t xml:space="preserve">Die Funktion </w:t>
       </w:r>
-      <w:proofErr w:type="spellStart"/>
       <w:r>
         <w:rPr>
           <w:rStyle w:val="HTMLCode"/>
           <w:rFonts w:ascii="Times New Roman" w:hAnsi="Times New Roman" w:cs="Times New Roman"/>
         </w:rPr>
-        <w:t>Display_</w:t>
-      </w:r>
-      <w:proofErr w:type="gramStart"/>
-      <w:r>
-        <w:rPr>
-          <w:rStyle w:val="HTMLCode"/>
-          <w:rFonts w:ascii="Times New Roman" w:hAnsi="Times New Roman" w:cs="Times New Roman"/>
-        </w:rPr>
-        <w:t>WriteLine</w:t>
-      </w:r>
-      <w:proofErr w:type="spellEnd"/>
-      <w:r>
-        <w:rPr>
-          <w:rStyle w:val="HTMLCode"/>
-          <w:rFonts w:ascii="Times New Roman" w:hAnsi="Times New Roman" w:cs="Times New Roman"/>
-        </w:rPr>
-        <w:t>(</w:t>
-      </w:r>
-      <w:proofErr w:type="gramEnd"/>
-      <w:r>
-        <w:rPr>
-          <w:rStyle w:val="HTMLCode"/>
-          <w:rFonts w:ascii="Times New Roman" w:hAnsi="Times New Roman" w:cs="Times New Roman"/>
-        </w:rPr>
-        <w:t>)</w:t>
+        <w:t>Display_WriteLine()</w:t>
       </w:r>
       <w:r>
         <w:t xml:space="preserve"> schreibt immer genau 20 Zeichen. Kürzere Texte werden mit Leerzeichen aufgefüllt und längere Texte nach 20 Zeichen abgeschnitten. Dadurch bleiben keine Zeichen eines vorherigen, längeren Textes auf dem Display stehen.</w:t>
@@ -19233,11 +18860,11 @@
                     </pic:cNvPicPr>
                   </pic:nvPicPr>
                   <pic:blipFill rotWithShape="1">
-                    <a:blip r:embed="rId25" cstate="print">
+                    <a:blip r:embed="rId30" cstate="print">
                       <a:extLst>
                         <a:ext uri="{BEBA8EAE-BF5A-486C-A8C5-ECC9F3942E4B}">
                           <a14:imgProps xmlns:a14="http://schemas.microsoft.com/office/drawing/2010/main">
-                            <a14:imgLayer r:embed="rId26">
+                            <a14:imgLayer r:embed="rId31">
                               <a14:imgEffect>
                                 <a14:backgroundRemoval t="6061" b="95520" l="4326" r="89992">
                                   <a14:foregroundMark x1="17557" y1="10277" x2="12723" y2="33992"/>
@@ -19322,7 +18949,15 @@
           <w:rFonts w:ascii="Times New Roman" w:hAnsi="Times New Roman" w:cs="Times New Roman"/>
           <w:lang w:val="en-GB"/>
         </w:rPr>
-        <w:t xml:space="preserve">     Motor A Motor B</w:t>
+        <w:t xml:space="preserve">     </w:t>
+      </w:r>
+      <w:r>
+        <w:rPr>
+          <w:rStyle w:val="HTMLCode"/>
+          <w:rFonts w:ascii="Times New Roman" w:hAnsi="Times New Roman" w:cs="Times New Roman"/>
+          <w:lang w:val="en-GB"/>
+        </w:rPr>
+        <w:t>Motor A Motor B</w:t>
       </w:r>
     </w:p>
     <w:p>
@@ -19570,7 +19205,7 @@
           <w:noProof/>
         </w:rPr>
         <w:drawing>
-          <wp:anchor distT="0" distB="0" distL="114300" distR="114300" simplePos="0" relativeHeight="251667456" behindDoc="0" locked="0" layoutInCell="1" allowOverlap="1" wp14:anchorId="53DFF821" wp14:editId="5FDBE2FD">
+          <wp:anchor distT="0" distB="0" distL="114300" distR="114300" simplePos="0" relativeHeight="251667456" behindDoc="0" locked="0" layoutInCell="1" allowOverlap="1" wp14:anchorId="53DFF821" wp14:editId="7FE39D9E">
             <wp:simplePos x="0" y="0"/>
             <wp:positionH relativeFrom="page">
               <wp:align>center</wp:align>
@@ -19595,11 +19230,11 @@
                     </pic:cNvPicPr>
                   </pic:nvPicPr>
                   <pic:blipFill rotWithShape="1">
-                    <a:blip r:embed="rId27" cstate="print">
+                    <a:blip r:embed="rId32" cstate="print">
                       <a:extLst>
                         <a:ext uri="{BEBA8EAE-BF5A-486C-A8C5-ECC9F3942E4B}">
                           <a14:imgProps xmlns:a14="http://schemas.microsoft.com/office/drawing/2010/main">
-                            <a14:imgLayer r:embed="rId28">
+                            <a14:imgLayer r:embed="rId33">
                               <a14:imgEffect>
                                 <a14:backgroundRemoval t="4573" b="92419" l="10000" r="90000">
                                   <a14:foregroundMark x1="38916" y1="10229" x2="52169" y2="32491"/>
@@ -19709,7 +19344,15 @@
           <w:rFonts w:ascii="Times New Roman" w:hAnsi="Times New Roman" w:cs="Times New Roman"/>
           <w:lang w:val="en-GB"/>
         </w:rPr>
-        <w:t xml:space="preserve">     Motor A Motor B</w:t>
+        <w:t xml:space="preserve">     </w:t>
+      </w:r>
+      <w:r>
+        <w:rPr>
+          <w:rStyle w:val="HTMLCode"/>
+          <w:rFonts w:ascii="Times New Roman" w:hAnsi="Times New Roman" w:cs="Times New Roman"/>
+          <w:lang w:val="en-GB"/>
+        </w:rPr>
+        <w:t>Motor A Motor B</w:t>
       </w:r>
     </w:p>
     <w:p>
@@ -19884,21 +19527,7 @@
         <w:rPr>
           <w:rFonts w:ascii="Times New Roman" w:hAnsi="Times New Roman" w:cs="Times New Roman"/>
         </w:rPr>
-        <w:t xml:space="preserve">4.10.3 </w:t>
-      </w:r>
-      <w:proofErr w:type="spellStart"/>
-      <w:r>
-        <w:rPr>
-          <w:rFonts w:ascii="Times New Roman" w:hAnsi="Times New Roman" w:cs="Times New Roman"/>
-        </w:rPr>
-        <w:t>Modusmeldung</w:t>
-      </w:r>
-      <w:proofErr w:type="spellEnd"/>
-      <w:r>
-        <w:rPr>
-          <w:rFonts w:ascii="Times New Roman" w:hAnsi="Times New Roman" w:cs="Times New Roman"/>
-        </w:rPr>
-        <w:t xml:space="preserve"> und Fehleranzeige</w:t>
+        <w:t>4.10.3 Modusmeldung und Fehleranzeige</w:t>
       </w:r>
       <w:bookmarkEnd w:id="39"/>
     </w:p>
@@ -19911,7 +19540,7 @@
           <w:noProof/>
         </w:rPr>
         <w:drawing>
-          <wp:anchor distT="0" distB="0" distL="114300" distR="114300" simplePos="0" relativeHeight="251668480" behindDoc="0" locked="0" layoutInCell="1" allowOverlap="1" wp14:anchorId="3F17B4D7" wp14:editId="2C5F520F">
+          <wp:anchor distT="0" distB="0" distL="114300" distR="114300" simplePos="0" relativeHeight="251668480" behindDoc="0" locked="0" layoutInCell="1" allowOverlap="1" wp14:anchorId="3F17B4D7" wp14:editId="21F99C08">
             <wp:simplePos x="0" y="0"/>
             <wp:positionH relativeFrom="margin">
               <wp:align>center</wp:align>
@@ -19936,11 +19565,11 @@
                     </pic:cNvPicPr>
                   </pic:nvPicPr>
                   <pic:blipFill rotWithShape="1">
-                    <a:blip r:embed="rId29" cstate="print">
+                    <a:blip r:embed="rId34" cstate="print">
                       <a:extLst>
                         <a:ext uri="{BEBA8EAE-BF5A-486C-A8C5-ECC9F3942E4B}">
                           <a14:imgProps xmlns:a14="http://schemas.microsoft.com/office/drawing/2010/main">
-                            <a14:imgLayer r:embed="rId30">
+                            <a14:imgLayer r:embed="rId35">
                               <a14:imgEffect>
                                 <a14:backgroundRemoval t="4756" b="95887" l="9924" r="89992">
                                   <a14:foregroundMark x1="41221" y1="10925" x2="29856" y2="30206"/>
@@ -20131,7 +19760,7 @@
           <w:noProof/>
         </w:rPr>
         <w:drawing>
-          <wp:anchor distT="0" distB="0" distL="114300" distR="114300" simplePos="0" relativeHeight="251669504" behindDoc="0" locked="0" layoutInCell="1" allowOverlap="1" wp14:anchorId="6C5DD0BD" wp14:editId="0321379E">
+          <wp:anchor distT="0" distB="0" distL="114300" distR="114300" simplePos="0" relativeHeight="251669504" behindDoc="0" locked="0" layoutInCell="1" allowOverlap="1" wp14:anchorId="6C5DD0BD" wp14:editId="53D809B7">
             <wp:simplePos x="0" y="0"/>
             <wp:positionH relativeFrom="margin">
               <wp:align>center</wp:align>
@@ -20156,11 +19785,11 @@
                     </pic:cNvPicPr>
                   </pic:nvPicPr>
                   <pic:blipFill rotWithShape="1">
-                    <a:blip r:embed="rId31" cstate="print">
+                    <a:blip r:embed="rId36" cstate="print">
                       <a:extLst>
                         <a:ext uri="{BEBA8EAE-BF5A-486C-A8C5-ECC9F3942E4B}">
                           <a14:imgProps xmlns:a14="http://schemas.microsoft.com/office/drawing/2010/main">
-                            <a14:imgLayer r:embed="rId32">
+                            <a14:imgLayer r:embed="rId37">
                               <a14:imgEffect>
                                 <a14:backgroundRemoval t="6250" b="95250" l="9846" r="89917">
                                   <a14:foregroundMark x1="37011" y1="12375" x2="19454" y2="29000"/>
@@ -20483,16 +20112,8 @@
               <w:rPr>
                 <w:rFonts w:ascii="Times New Roman" w:hAnsi="Times New Roman" w:cs="Times New Roman"/>
               </w:rPr>
-              <w:t xml:space="preserve">30 </w:t>
-            </w:r>
-            <w:proofErr w:type="spellStart"/>
-            <w:r>
-              <w:rPr>
-                <w:rFonts w:ascii="Times New Roman" w:hAnsi="Times New Roman" w:cs="Times New Roman"/>
-              </w:rPr>
-              <w:t>ms</w:t>
-            </w:r>
-            <w:proofErr w:type="spellEnd"/>
+              <w:t>30 ms</w:t>
+            </w:r>
           </w:p>
         </w:tc>
       </w:tr>
@@ -20534,16 +20155,8 @@
               <w:rPr>
                 <w:rFonts w:ascii="Times New Roman" w:hAnsi="Times New Roman" w:cs="Times New Roman"/>
               </w:rPr>
-              <w:t xml:space="preserve">30 </w:t>
-            </w:r>
-            <w:proofErr w:type="spellStart"/>
-            <w:r>
-              <w:rPr>
-                <w:rFonts w:ascii="Times New Roman" w:hAnsi="Times New Roman" w:cs="Times New Roman"/>
-              </w:rPr>
-              <w:t>ms</w:t>
-            </w:r>
-            <w:proofErr w:type="spellEnd"/>
+              <w:t>30 ms</w:t>
+            </w:r>
           </w:p>
         </w:tc>
       </w:tr>
@@ -20585,16 +20198,8 @@
               <w:rPr>
                 <w:rFonts w:ascii="Times New Roman" w:hAnsi="Times New Roman" w:cs="Times New Roman"/>
               </w:rPr>
-              <w:t xml:space="preserve">250 </w:t>
-            </w:r>
-            <w:proofErr w:type="spellStart"/>
-            <w:r>
-              <w:rPr>
-                <w:rFonts w:ascii="Times New Roman" w:hAnsi="Times New Roman" w:cs="Times New Roman"/>
-              </w:rPr>
-              <w:t>ms</w:t>
-            </w:r>
-            <w:proofErr w:type="spellEnd"/>
+              <w:t>250 ms</w:t>
+            </w:r>
           </w:p>
         </w:tc>
       </w:tr>
@@ -20617,16 +20222,8 @@
               <w:rPr>
                 <w:rFonts w:ascii="Times New Roman" w:hAnsi="Times New Roman" w:cs="Times New Roman"/>
               </w:rPr>
-              <w:t xml:space="preserve">Anzeige einer </w:t>
-            </w:r>
-            <w:proofErr w:type="spellStart"/>
-            <w:r>
-              <w:rPr>
-                <w:rFonts w:ascii="Times New Roman" w:hAnsi="Times New Roman" w:cs="Times New Roman"/>
-              </w:rPr>
-              <w:t>Modusmeldung</w:t>
-            </w:r>
-            <w:proofErr w:type="spellEnd"/>
+              <w:t>Anzeige einer Modusmeldung</w:t>
+            </w:r>
           </w:p>
         </w:tc>
         <w:tc>
@@ -20644,16 +20241,8 @@
               <w:rPr>
                 <w:rFonts w:ascii="Times New Roman" w:hAnsi="Times New Roman" w:cs="Times New Roman"/>
               </w:rPr>
-              <w:t xml:space="preserve">2000 </w:t>
-            </w:r>
-            <w:proofErr w:type="spellStart"/>
-            <w:r>
-              <w:rPr>
-                <w:rFonts w:ascii="Times New Roman" w:hAnsi="Times New Roman" w:cs="Times New Roman"/>
-              </w:rPr>
-              <w:t>ms</w:t>
-            </w:r>
-            <w:proofErr w:type="spellEnd"/>
+              <w:t>2000 ms</w:t>
+            </w:r>
           </w:p>
         </w:tc>
       </w:tr>
@@ -20672,19 +20261,11 @@
                 <w:rFonts w:ascii="Times New Roman" w:hAnsi="Times New Roman" w:cs="Times New Roman"/>
               </w:rPr>
             </w:pPr>
-            <w:proofErr w:type="spellStart"/>
             <w:r>
               <w:rPr>
                 <w:rFonts w:ascii="Times New Roman" w:hAnsi="Times New Roman" w:cs="Times New Roman"/>
               </w:rPr>
-              <w:t>Entprellzeit</w:t>
-            </w:r>
-            <w:proofErr w:type="spellEnd"/>
-            <w:r>
-              <w:rPr>
-                <w:rFonts w:ascii="Times New Roman" w:hAnsi="Times New Roman" w:cs="Times New Roman"/>
-              </w:rPr>
-              <w:t xml:space="preserve"> von Taster 2</w:t>
+              <w:t>Entprellzeit von Taster 2</w:t>
             </w:r>
           </w:p>
         </w:tc>
@@ -20704,16 +20285,8 @@
               <w:rPr>
                 <w:rFonts w:ascii="Times New Roman" w:hAnsi="Times New Roman" w:cs="Times New Roman"/>
               </w:rPr>
-              <w:t xml:space="preserve">150 </w:t>
-            </w:r>
-            <w:proofErr w:type="spellStart"/>
-            <w:r>
-              <w:rPr>
-                <w:rFonts w:ascii="Times New Roman" w:hAnsi="Times New Roman" w:cs="Times New Roman"/>
-              </w:rPr>
-              <w:t>ms</w:t>
-            </w:r>
-            <w:proofErr w:type="spellEnd"/>
+              <w:t>150 ms</w:t>
+            </w:r>
           </w:p>
         </w:tc>
       </w:tr>
@@ -20744,15 +20317,7 @@
         <w:pStyle w:val="StandardWeb"/>
       </w:pPr>
       <w:r>
-        <w:t xml:space="preserve">Der Empfang der Motorframes erfolgt unabhängig davon </w:t>
-      </w:r>
-      <w:proofErr w:type="spellStart"/>
-      <w:r>
-        <w:t>interruptgesteuert</w:t>
-      </w:r>
-      <w:proofErr w:type="spellEnd"/>
-      <w:r>
-        <w:t>. Die Auswertung eines vollständig empfangenen Frames wird bei jedem Durchlauf der Hauptschleife angestoßen und ist deshalb nicht auf das 30-ms-Steuerintervall beschränkt.</w:t>
+        <w:t>Der Empfang der Motorframes erfolgt unabhängig davon interruptgesteuert. Die Auswertung eines vollständig empfangenen Frames wird bei jedem Durchlauf der Hauptschleife angestoßen und ist deshalb nicht auf das 30-ms-Steuerintervall beschränkt.</w:t>
       </w:r>
     </w:p>
     <w:p>
@@ -21246,7 +20811,7 @@
                     </pic:cNvPicPr>
                   </pic:nvPicPr>
                   <pic:blipFill rotWithShape="1">
-                    <a:blip r:embed="rId33"/>
+                    <a:blip r:embed="rId38"/>
                     <a:srcRect r="14673" b="23306"/>
                     <a:stretch>
                       <a:fillRect/>
@@ -21316,7 +20881,7 @@
                     </pic:cNvPicPr>
                   </pic:nvPicPr>
                   <pic:blipFill rotWithShape="1">
-                    <a:blip r:embed="rId34"/>
+                    <a:blip r:embed="rId39"/>
                     <a:srcRect r="14673" b="23488"/>
                     <a:stretch>
                       <a:fillRect/>
@@ -21385,7 +20950,7 @@
                     </pic:cNvPicPr>
                   </pic:nvPicPr>
                   <pic:blipFill rotWithShape="1">
-                    <a:blip r:embed="rId35"/>
+                    <a:blip r:embed="rId40"/>
                     <a:srcRect r="13747" b="21126"/>
                     <a:stretch>
                       <a:fillRect/>
@@ -21454,7 +21019,7 @@
                     </pic:cNvPicPr>
                   </pic:nvPicPr>
                   <pic:blipFill rotWithShape="1">
-                    <a:blip r:embed="rId35"/>
+                    <a:blip r:embed="rId40"/>
                     <a:srcRect r="14011" b="21126"/>
                     <a:stretch>
                       <a:fillRect/>
@@ -21498,6 +21063,54 @@
         <w:t>Zusätzlich wurden die ADC-Rohwerte während des Debuggens beobachtet. In der Mittelstellung lagen die Werte ungefähr im Bereich von 1900. Bei einer Bewegung des Joysticks änderten sich die Messwerte entsprechend der jeweiligen Achse. Damit konnte bestätigt werden, dass die drei Analogsignale korrekt vom Mikrocontroller erfasst werden.</w:t>
       </w:r>
     </w:p>
+    <w:p>
+      <w:pPr>
+        <w:pStyle w:val="berschrift2"/>
+        <w:rPr>
+          <w:rFonts w:ascii="Times New Roman" w:hAnsi="Times New Roman" w:cs="Times New Roman"/>
+        </w:rPr>
+      </w:pPr>
+      <w:bookmarkStart w:id="43" w:name="_Toc238643485"/>
+      <w:r>
+        <w:rPr>
+          <w:rFonts w:ascii="Times New Roman" w:hAnsi="Times New Roman" w:cs="Times New Roman"/>
+        </w:rPr>
+        <w:t>Software- und Kommunikationstest</w:t>
+      </w:r>
+      <w:bookmarkEnd w:id="43"/>
+    </w:p>
+    <w:p>
+      <w:pPr>
+        <w:pStyle w:val="StandardWeb"/>
+      </w:pPr>
+      <w:r>
+        <w:t>Nach der Hardwareprüfung wurde die Verarbeitung der Joysticksignale getestet. Die gemessenen ADC-Rohwerte werden in der Software auf einen Wertebereich von −127 bis +127 umgerechnet. Die Mittelstellung entspricht dabei dem Wert 0. Eine Totzone verhindert, dass kleine Schwankungen um die mechanische Mittelstellung unbeabsichtigte Motorbefehle auslösen.</w:t>
+      </w:r>
+    </w:p>
+    <w:p>
+      <w:pPr>
+        <w:pStyle w:val="StandardWeb"/>
+      </w:pPr>
+      <w:r>
+        <w:t>Zur Überprüfung der RS485-Kommunikation wurde ein separates STM32-Testmodul verwendet. Dieses wurde zunächst in die bestehende Datenübertragung eingebunden, um die vom Motor gesendeten Frames mitzulesen. Anschließend wurde das Testprogramm erweitert, sodass es selbst Daten senden konnte. Dadurch konnten sowohl die Sende- als auch die Empfangsfunktion der beiden RS485-Kanäle unabhängig vom Betrieb auf dem Boot geprüft werden.</w:t>
+      </w:r>
+    </w:p>
+    <w:p>
+      <w:pPr>
+        <w:pStyle w:val="StandardWeb"/>
+      </w:pPr>
+      <w:r>
+        <w:t>Die Motorsteuerwerte werden zyklisch im Abstand von 30 ms übertragen. Beim Empfang wurden die Datenframes ausgewertet und die enthaltenen Motorinformationen den entsprechenden Variablen zugeordnet. Geprüft wurden insbesondere die Werte für Leistung, Geschwindigkeit, Akkustand, Drehzahl, Batteriespannung und Motortemperatur.</w:t>
+      </w:r>
+    </w:p>
+    <w:p>
+      <w:pPr>
+        <w:pStyle w:val="StandardWeb"/>
+      </w:pPr>
+      <w:r>
+        <w:t>Auch das Display und die beiden Taster wurden in diesem Zusammenhang getestet. In der Hauptansicht zeigt das Display für beide Motoren die Leistung, die Geschwindigkeit und den Akkustand an. Über einen Taster kann auf eine zweite Ansicht mit Drehzahl, Batteriespannung und Motortemperatur gewechselt werden. Der zweite Taster schaltet zwischen dem normalen Fahrmodus und dem Rotationsmodus um.</w:t>
+      </w:r>
+    </w:p>
     <w:p/>
     <w:p/>
     <w:p>
@@ -21525,91 +21138,6 @@
           <w:rFonts w:ascii="Times New Roman" w:hAnsi="Times New Roman" w:cs="Times New Roman"/>
         </w:rPr>
       </w:pPr>
-      <w:bookmarkStart w:id="43" w:name="_Toc238643485"/>
-      <w:r>
-        <w:rPr>
-          <w:rFonts w:ascii="Times New Roman" w:hAnsi="Times New Roman" w:cs="Times New Roman"/>
-        </w:rPr>
-        <w:lastRenderedPageBreak/>
-        <w:t>Software- und Kommunikationstest</w:t>
-      </w:r>
-      <w:bookmarkEnd w:id="43"/>
-    </w:p>
-    <w:p>
-      <w:pPr>
-        <w:pStyle w:val="StandardWeb"/>
-      </w:pPr>
-      <w:r>
-        <w:t xml:space="preserve">Nach der Hardwareprüfung wurde die Verarbeitung der Joysticksignale getestet. Die gemessenen ADC-Rohwerte werden in der Software auf einen Wertebereich von −127 bis +127 umgerechnet. Die Mittelstellung entspricht dabei dem Wert 0. Eine </w:t>
-      </w:r>
-      <w:proofErr w:type="spellStart"/>
-      <w:r>
-        <w:t>Totzone</w:t>
-      </w:r>
-      <w:proofErr w:type="spellEnd"/>
-      <w:r>
-        <w:t xml:space="preserve"> verhindert, dass kleine Schwankungen um die mechanische Mittelstellung unbeabsichtigte Motorbefehle auslösen.</w:t>
-      </w:r>
-    </w:p>
-    <w:p>
-      <w:pPr>
-        <w:pStyle w:val="StandardWeb"/>
-      </w:pPr>
-      <w:r>
-        <w:t>Zur Überprüfung der RS485-Kommunikation wurde ein separates STM32-Testmodul verwendet. Dieses wurde zunächst in die bestehende Datenübertragung eingebunden, um die vom Motor gesendeten Frames mitzulesen. Anschließend wurde das Testprogramm erweitert, sodass es selbst Daten senden konnte. Dadurch konnten sowohl die Sende- als auch die Empfangsfunktion der beiden RS485-Kanäle unabhängig vom Betrieb auf dem Boot geprüft werden.</w:t>
-      </w:r>
-    </w:p>
-    <w:p>
-      <w:pPr>
-        <w:pStyle w:val="StandardWeb"/>
-      </w:pPr>
-      <w:r>
-        <w:t xml:space="preserve">Die Motorsteuerwerte werden zyklisch im Abstand von 30 </w:t>
-      </w:r>
-      <w:proofErr w:type="spellStart"/>
-      <w:r>
-        <w:t>ms</w:t>
-      </w:r>
-      <w:proofErr w:type="spellEnd"/>
-      <w:r>
-        <w:t xml:space="preserve"> übertragen. Beim Empfang wurden die Datenframes ausgewertet und die enthaltenen Motorinformationen den entsprechenden Variablen zugeordnet. Geprüft wurden insbesondere die Werte für Leistung, Geschwindigkeit, Akkustand, Drehzahl, Batteriespannung und Motortemperatur.</w:t>
-      </w:r>
-    </w:p>
-    <w:p>
-      <w:pPr>
-        <w:pStyle w:val="StandardWeb"/>
-      </w:pPr>
-      <w:r>
-        <w:t>Auch das Display und die beiden Taster wurden in diesem Zusammenhang getestet. In der Hauptansicht zeigt das Display für beide Motoren die Leistung, die Geschwindigkeit und den Akkustand an. Über einen Taster kann auf eine zweite Ansicht mit Drehzahl, Batteriespannung und Motortemperatur gewechselt werden. Der zweite Taster schaltet zwischen dem normalen Fahrmodus und dem Rotationsmodus um.</w:t>
-      </w:r>
-    </w:p>
-    <w:p/>
-    <w:p/>
-    <w:p>
-      <w:pPr>
-        <w:spacing w:line="259" w:lineRule="auto"/>
-        <w:rPr>
-          <w:rFonts w:ascii="Times New Roman" w:eastAsiaTheme="majorEastAsia" w:hAnsi="Times New Roman" w:cs="Times New Roman"/>
-          <w:b/>
-          <w:color w:val="000000" w:themeColor="text1"/>
-          <w:sz w:val="32"/>
-          <w:szCs w:val="26"/>
-        </w:rPr>
-      </w:pPr>
-      <w:r>
-        <w:rPr>
-          <w:rFonts w:ascii="Times New Roman" w:hAnsi="Times New Roman" w:cs="Times New Roman"/>
-        </w:rPr>
-        <w:br w:type="page"/>
-      </w:r>
-    </w:p>
-    <w:p>
-      <w:pPr>
-        <w:pStyle w:val="berschrift2"/>
-        <w:rPr>
-          <w:rFonts w:ascii="Times New Roman" w:hAnsi="Times New Roman" w:cs="Times New Roman"/>
-        </w:rPr>
-      </w:pPr>
       <w:bookmarkStart w:id="44" w:name="_Toc238643486"/>
       <w:r>
         <w:rPr>
@@ -21641,7 +21169,13 @@
         <w:pStyle w:val="StandardWeb"/>
       </w:pPr>
       <w:r>
-        <w:t>Bei den Fahrversuchen zeigte sich außerdem, dass die Motoren bei hoher Leistung zu viel Luft ansaugten. Deshalb wurde eine Begrenzung des maximalen Motorsteuerwerts in der Software vorgesehen. Dadurch soll die verfügbare Leistung an den praktischen Aufbau des Bootes angepasst und ein ungünstiger Betrieb der Propeller verhindert werden.</w:t>
+        <w:t>Bei den Fahrversuchen zeigte sich außerdem, dass die Motoren bei hoher Leistung zu viel Luft ansaugten. Deshalb wurde eine Begrenzung des maximalen Motorsteuerwerts in der Software vorgesehen. Dadurch soll</w:t>
+      </w:r>
+      <w:r>
+        <w:t>te</w:t>
+      </w:r>
+      <w:r>
+        <w:t xml:space="preserve"> die verfügbare Leistung an den praktischen Aufbau des Bootes angepasst und ein ungünstiger Betrieb der Propeller verhindert werden.</w:t>
       </w:r>
     </w:p>
     <w:p>
@@ -21752,7 +21286,7 @@
       </w:pPr>
     </w:p>
     <w:sectPr>
-      <w:headerReference w:type="default" r:id="rId36"/>
+      <w:headerReference w:type="default" r:id="rId41"/>
       <w:pgSz w:w="11906" w:h="16838" w:code="9"/>
       <w:pgMar w:top="1418" w:right="1134" w:bottom="1134" w:left="1701" w:header="709" w:footer="709" w:gutter="0"/>
       <w:pgNumType w:fmt="upperRoman" w:start="2"/>

</xml_diff>

<commit_message>
Little last final change
</commit_message>
<xml_diff>
--- a/Dokumentation/Projektarbeit_Orange_Blue_Joystick_ma871cas_jo871sto.docx
+++ b/Dokumentation/Projektarbeit_Orange_Blue_Joystick_ma871cas_jo871sto.docx
@@ -10928,7 +10928,7 @@
           <w14:ligatures w14:val="standardContextual"/>
         </w:rPr>
       </w:pPr>
-      <w:hyperlink w:anchor="_Toc238840550" w:history="1">
+      <w:hyperlink w:anchor="_Toc238840676" w:history="1">
         <w:r>
           <w:rPr>
             <w:rStyle w:val="Hyperlink"/>
@@ -10956,7 +10956,7 @@
             <w:noProof/>
             <w:webHidden/>
           </w:rPr>
-          <w:instrText xml:space="preserve"> PAGEREF _Toc238840550 \h </w:instrText>
+          <w:instrText xml:space="preserve"> PAGEREF _Toc238840676 \h </w:instrText>
         </w:r>
         <w:r>
           <w:rPr>
@@ -11002,7 +11002,7 @@
           <w14:ligatures w14:val="standardContextual"/>
         </w:rPr>
       </w:pPr>
-      <w:hyperlink w:anchor="_Toc238840551" w:history="1">
+      <w:hyperlink w:anchor="_Toc238840677" w:history="1">
         <w:r>
           <w:rPr>
             <w:rStyle w:val="Hyperlink"/>
@@ -11030,7 +11030,7 @@
             <w:noProof/>
             <w:webHidden/>
           </w:rPr>
-          <w:instrText xml:space="preserve"> PAGEREF _Toc238840551 \h </w:instrText>
+          <w:instrText xml:space="preserve"> PAGEREF _Toc238840677 \h </w:instrText>
         </w:r>
         <w:r>
           <w:rPr>
@@ -11076,7 +11076,7 @@
           <w14:ligatures w14:val="standardContextual"/>
         </w:rPr>
       </w:pPr>
-      <w:hyperlink w:anchor="_Toc238840552" w:history="1">
+      <w:hyperlink w:anchor="_Toc238840678" w:history="1">
         <w:r>
           <w:rPr>
             <w:rStyle w:val="Hyperlink"/>
@@ -11104,7 +11104,7 @@
             <w:noProof/>
             <w:webHidden/>
           </w:rPr>
-          <w:instrText xml:space="preserve"> PAGEREF _Toc238840552 \h </w:instrText>
+          <w:instrText xml:space="preserve"> PAGEREF _Toc238840678 \h </w:instrText>
         </w:r>
         <w:r>
           <w:rPr>
@@ -11150,7 +11150,7 @@
           <w14:ligatures w14:val="standardContextual"/>
         </w:rPr>
       </w:pPr>
-      <w:hyperlink w:anchor="_Toc238840553" w:history="1">
+      <w:hyperlink w:anchor="_Toc238840679" w:history="1">
         <w:r>
           <w:rPr>
             <w:rStyle w:val="Hyperlink"/>
@@ -11178,7 +11178,7 @@
             <w:noProof/>
             <w:webHidden/>
           </w:rPr>
-          <w:instrText xml:space="preserve"> PAGEREF _Toc238840553 \h </w:instrText>
+          <w:instrText xml:space="preserve"> PAGEREF _Toc238840679 \h </w:instrText>
         </w:r>
         <w:r>
           <w:rPr>
@@ -11224,7 +11224,7 @@
           <w14:ligatures w14:val="standardContextual"/>
         </w:rPr>
       </w:pPr>
-      <w:hyperlink w:anchor="_Toc238840554" w:history="1">
+      <w:hyperlink w:anchor="_Toc238840680" w:history="1">
         <w:r>
           <w:rPr>
             <w:rStyle w:val="Hyperlink"/>
@@ -11252,7 +11252,7 @@
             <w:noProof/>
             <w:webHidden/>
           </w:rPr>
-          <w:instrText xml:space="preserve"> PAGEREF _Toc238840554 \h </w:instrText>
+          <w:instrText xml:space="preserve"> PAGEREF _Toc238840680 \h </w:instrText>
         </w:r>
         <w:r>
           <w:rPr>
@@ -11298,7 +11298,7 @@
           <w14:ligatures w14:val="standardContextual"/>
         </w:rPr>
       </w:pPr>
-      <w:hyperlink w:anchor="_Toc238840555" w:history="1">
+      <w:hyperlink w:anchor="_Toc238840681" w:history="1">
         <w:r>
           <w:rPr>
             <w:rStyle w:val="Hyperlink"/>
@@ -11326,7 +11326,7 @@
             <w:noProof/>
             <w:webHidden/>
           </w:rPr>
-          <w:instrText xml:space="preserve"> PAGEREF _Toc238840555 \h </w:instrText>
+          <w:instrText xml:space="preserve"> PAGEREF _Toc238840681 \h </w:instrText>
         </w:r>
         <w:r>
           <w:rPr>
@@ -11372,7 +11372,7 @@
           <w14:ligatures w14:val="standardContextual"/>
         </w:rPr>
       </w:pPr>
-      <w:hyperlink w:anchor="_Toc238840556" w:history="1">
+      <w:hyperlink w:anchor="_Toc238840682" w:history="1">
         <w:r>
           <w:rPr>
             <w:rStyle w:val="Hyperlink"/>
@@ -11400,7 +11400,7 @@
             <w:noProof/>
             <w:webHidden/>
           </w:rPr>
-          <w:instrText xml:space="preserve"> PAGEREF _Toc238840556 \h </w:instrText>
+          <w:instrText xml:space="preserve"> PAGEREF _Toc238840682 \h </w:instrText>
         </w:r>
         <w:r>
           <w:rPr>
@@ -11446,7 +11446,7 @@
           <w14:ligatures w14:val="standardContextual"/>
         </w:rPr>
       </w:pPr>
-      <w:hyperlink w:anchor="_Toc238840557" w:history="1">
+      <w:hyperlink w:anchor="_Toc238840683" w:history="1">
         <w:r>
           <w:rPr>
             <w:rStyle w:val="Hyperlink"/>
@@ -11474,7 +11474,7 @@
             <w:noProof/>
             <w:webHidden/>
           </w:rPr>
-          <w:instrText xml:space="preserve"> PAGEREF _Toc238840557 \h </w:instrText>
+          <w:instrText xml:space="preserve"> PAGEREF _Toc238840683 \h </w:instrText>
         </w:r>
         <w:r>
           <w:rPr>
@@ -11520,7 +11520,7 @@
           <w14:ligatures w14:val="standardContextual"/>
         </w:rPr>
       </w:pPr>
-      <w:hyperlink w:anchor="_Toc238840558" w:history="1">
+      <w:hyperlink w:anchor="_Toc238840684" w:history="1">
         <w:r>
           <w:rPr>
             <w:rStyle w:val="Hyperlink"/>
@@ -11548,7 +11548,7 @@
             <w:noProof/>
             <w:webHidden/>
           </w:rPr>
-          <w:instrText xml:space="preserve"> PAGEREF _Toc238840558 \h </w:instrText>
+          <w:instrText xml:space="preserve"> PAGEREF _Toc238840684 \h </w:instrText>
         </w:r>
         <w:r>
           <w:rPr>
@@ -11594,7 +11594,7 @@
           <w14:ligatures w14:val="standardContextual"/>
         </w:rPr>
       </w:pPr>
-      <w:hyperlink w:anchor="_Toc238840559" w:history="1">
+      <w:hyperlink w:anchor="_Toc238840685" w:history="1">
         <w:r>
           <w:rPr>
             <w:rStyle w:val="Hyperlink"/>
@@ -11622,7 +11622,7 @@
             <w:noProof/>
             <w:webHidden/>
           </w:rPr>
-          <w:instrText xml:space="preserve"> PAGEREF _Toc238840559 \h </w:instrText>
+          <w:instrText xml:space="preserve"> PAGEREF _Toc238840685 \h </w:instrText>
         </w:r>
         <w:r>
           <w:rPr>
@@ -11668,7 +11668,7 @@
           <w14:ligatures w14:val="standardContextual"/>
         </w:rPr>
       </w:pPr>
-      <w:hyperlink w:anchor="_Toc238840560" w:history="1">
+      <w:hyperlink w:anchor="_Toc238840686" w:history="1">
         <w:r>
           <w:rPr>
             <w:rStyle w:val="Hyperlink"/>
@@ -11696,7 +11696,7 @@
             <w:noProof/>
             <w:webHidden/>
           </w:rPr>
-          <w:instrText xml:space="preserve"> PAGEREF _Toc238840560 \h </w:instrText>
+          <w:instrText xml:space="preserve"> PAGEREF _Toc238840686 \h </w:instrText>
         </w:r>
         <w:r>
           <w:rPr>
@@ -11742,7 +11742,7 @@
           <w14:ligatures w14:val="standardContextual"/>
         </w:rPr>
       </w:pPr>
-      <w:hyperlink w:anchor="_Toc238840561" w:history="1">
+      <w:hyperlink w:anchor="_Toc238840687" w:history="1">
         <w:r>
           <w:rPr>
             <w:rStyle w:val="Hyperlink"/>
@@ -11770,7 +11770,7 @@
             <w:noProof/>
             <w:webHidden/>
           </w:rPr>
-          <w:instrText xml:space="preserve"> PAGEREF _Toc238840561 \h </w:instrText>
+          <w:instrText xml:space="preserve"> PAGEREF _Toc238840687 \h </w:instrText>
         </w:r>
         <w:r>
           <w:rPr>
@@ -11816,7 +11816,7 @@
           <w14:ligatures w14:val="standardContextual"/>
         </w:rPr>
       </w:pPr>
-      <w:hyperlink w:anchor="_Toc238840562" w:history="1">
+      <w:hyperlink w:anchor="_Toc238840688" w:history="1">
         <w:r>
           <w:rPr>
             <w:rStyle w:val="Hyperlink"/>
@@ -11844,7 +11844,7 @@
             <w:noProof/>
             <w:webHidden/>
           </w:rPr>
-          <w:instrText xml:space="preserve"> PAGEREF _Toc238840562 \h </w:instrText>
+          <w:instrText xml:space="preserve"> PAGEREF _Toc238840688 \h </w:instrText>
         </w:r>
         <w:r>
           <w:rPr>
@@ -11890,7 +11890,7 @@
           <w14:ligatures w14:val="standardContextual"/>
         </w:rPr>
       </w:pPr>
-      <w:hyperlink w:anchor="_Toc238840563" w:history="1">
+      <w:hyperlink w:anchor="_Toc238840689" w:history="1">
         <w:r>
           <w:rPr>
             <w:rStyle w:val="Hyperlink"/>
@@ -11919,7 +11919,7 @@
             <w:noProof/>
             <w:webHidden/>
           </w:rPr>
-          <w:instrText xml:space="preserve"> PAGEREF _Toc238840563 \h </w:instrText>
+          <w:instrText xml:space="preserve"> PAGEREF _Toc238840689 \h </w:instrText>
         </w:r>
         <w:r>
           <w:rPr>
@@ -11965,7 +11965,7 @@
           <w14:ligatures w14:val="standardContextual"/>
         </w:rPr>
       </w:pPr>
-      <w:hyperlink w:anchor="_Toc238840564" w:history="1">
+      <w:hyperlink w:anchor="_Toc238840690" w:history="1">
         <w:r>
           <w:rPr>
             <w:rStyle w:val="Hyperlink"/>
@@ -11993,7 +11993,7 @@
             <w:noProof/>
             <w:webHidden/>
           </w:rPr>
-          <w:instrText xml:space="preserve"> PAGEREF _Toc238840564 \h </w:instrText>
+          <w:instrText xml:space="preserve"> PAGEREF _Toc238840690 \h </w:instrText>
         </w:r>
         <w:r>
           <w:rPr>
@@ -12039,7 +12039,7 @@
           <w14:ligatures w14:val="standardContextual"/>
         </w:rPr>
       </w:pPr>
-      <w:hyperlink w:anchor="_Toc238840565" w:history="1">
+      <w:hyperlink w:anchor="_Toc238840691" w:history="1">
         <w:r>
           <w:rPr>
             <w:rStyle w:val="Hyperlink"/>
@@ -12067,7 +12067,7 @@
             <w:noProof/>
             <w:webHidden/>
           </w:rPr>
-          <w:instrText xml:space="preserve"> PAGEREF _Toc238840565 \h </w:instrText>
+          <w:instrText xml:space="preserve"> PAGEREF _Toc238840691 \h </w:instrText>
         </w:r>
         <w:r>
           <w:rPr>
@@ -12113,7 +12113,7 @@
           <w14:ligatures w14:val="standardContextual"/>
         </w:rPr>
       </w:pPr>
-      <w:hyperlink w:anchor="_Toc238840566" w:history="1">
+      <w:hyperlink w:anchor="_Toc238840692" w:history="1">
         <w:r>
           <w:rPr>
             <w:rStyle w:val="Hyperlink"/>
@@ -12141,7 +12141,7 @@
             <w:noProof/>
             <w:webHidden/>
           </w:rPr>
-          <w:instrText xml:space="preserve"> PAGEREF _Toc238840566 \h </w:instrText>
+          <w:instrText xml:space="preserve"> PAGEREF _Toc238840692 \h </w:instrText>
         </w:r>
         <w:r>
           <w:rPr>
@@ -12187,7 +12187,7 @@
           <w14:ligatures w14:val="standardContextual"/>
         </w:rPr>
       </w:pPr>
-      <w:hyperlink w:anchor="_Toc238840567" w:history="1">
+      <w:hyperlink w:anchor="_Toc238840693" w:history="1">
         <w:r>
           <w:rPr>
             <w:rStyle w:val="Hyperlink"/>
@@ -12215,7 +12215,7 @@
             <w:noProof/>
             <w:webHidden/>
           </w:rPr>
-          <w:instrText xml:space="preserve"> PAGEREF _Toc238840567 \h </w:instrText>
+          <w:instrText xml:space="preserve"> PAGEREF _Toc238840693 \h </w:instrText>
         </w:r>
         <w:r>
           <w:rPr>
@@ -12261,7 +12261,7 @@
           <w14:ligatures w14:val="standardContextual"/>
         </w:rPr>
       </w:pPr>
-      <w:hyperlink w:anchor="_Toc238840568" w:history="1">
+      <w:hyperlink w:anchor="_Toc238840694" w:history="1">
         <w:r>
           <w:rPr>
             <w:rStyle w:val="Hyperlink"/>
@@ -12290,7 +12290,7 @@
             <w:noProof/>
             <w:webHidden/>
           </w:rPr>
-          <w:instrText xml:space="preserve"> PAGEREF _Toc238840568 \h </w:instrText>
+          <w:instrText xml:space="preserve"> PAGEREF _Toc238840694 \h </w:instrText>
         </w:r>
         <w:r>
           <w:rPr>
@@ -12336,10 +12336,11 @@
           <w14:ligatures w14:val="standardContextual"/>
         </w:rPr>
       </w:pPr>
-      <w:hyperlink w:anchor="_Toc238840569" w:history="1">
+      <w:hyperlink w:anchor="_Toc238840695" w:history="1">
         <w:r>
           <w:rPr>
             <w:rStyle w:val="Hyperlink"/>
+            <w:rFonts w:ascii="Times New Roman" w:hAnsi="Times New Roman" w:cs="Times New Roman"/>
             <w:noProof/>
           </w:rPr>
           <w:t>Abbildung 20, Display Hauptseite</w:t>
@@ -12363,7 +12364,7 @@
             <w:noProof/>
             <w:webHidden/>
           </w:rPr>
-          <w:instrText xml:space="preserve"> PAGEREF _Toc238840569 \h </w:instrText>
+          <w:instrText xml:space="preserve"> PAGEREF _Toc238840695 \h </w:instrText>
         </w:r>
         <w:r>
           <w:rPr>
@@ -12409,10 +12410,11 @@
           <w14:ligatures w14:val="standardContextual"/>
         </w:rPr>
       </w:pPr>
-      <w:hyperlink w:anchor="_Toc238840570" w:history="1">
+      <w:hyperlink w:anchor="_Toc238840696" w:history="1">
         <w:r>
           <w:rPr>
             <w:rStyle w:val="Hyperlink"/>
+            <w:rFonts w:ascii="Times New Roman" w:hAnsi="Times New Roman" w:cs="Times New Roman"/>
             <w:noProof/>
           </w:rPr>
           <w:t>Abbildung 21, Display Detailseite</w:t>
@@ -12436,7 +12438,7 @@
             <w:noProof/>
             <w:webHidden/>
           </w:rPr>
-          <w:instrText xml:space="preserve"> PAGEREF _Toc238840570 \h </w:instrText>
+          <w:instrText xml:space="preserve"> PAGEREF _Toc238840696 \h </w:instrText>
         </w:r>
         <w:r>
           <w:rPr>
@@ -12482,10 +12484,11 @@
           <w14:ligatures w14:val="standardContextual"/>
         </w:rPr>
       </w:pPr>
-      <w:hyperlink w:anchor="_Toc238840571" w:history="1">
+      <w:hyperlink w:anchor="_Toc238840697" w:history="1">
         <w:r>
           <w:rPr>
             <w:rStyle w:val="Hyperlink"/>
+            <w:rFonts w:ascii="Times New Roman" w:hAnsi="Times New Roman" w:cs="Times New Roman"/>
             <w:noProof/>
           </w:rPr>
           <w:t>Abbildung 22, Anzeige Drehmodus</w:t>
@@ -12509,7 +12512,7 @@
             <w:noProof/>
             <w:webHidden/>
           </w:rPr>
-          <w:instrText xml:space="preserve"> PAGEREF _Toc238840571 \h </w:instrText>
+          <w:instrText xml:space="preserve"> PAGEREF _Toc238840697 \h </w:instrText>
         </w:r>
         <w:r>
           <w:rPr>
@@ -12555,7 +12558,7 @@
           <w14:ligatures w14:val="standardContextual"/>
         </w:rPr>
       </w:pPr>
-      <w:hyperlink w:anchor="_Toc238840572" w:history="1">
+      <w:hyperlink w:anchor="_Toc238840698" w:history="1">
         <w:r>
           <w:rPr>
             <w:rStyle w:val="Hyperlink"/>
@@ -12582,7 +12585,7 @@
             <w:noProof/>
             <w:webHidden/>
           </w:rPr>
-          <w:instrText xml:space="preserve"> PAGEREF _Toc238840572 \h </w:instrText>
+          <w:instrText xml:space="preserve"> PAGEREF _Toc238840698 \h </w:instrText>
         </w:r>
         <w:r>
           <w:rPr>
@@ -12628,7 +12631,7 @@
           <w14:ligatures w14:val="standardContextual"/>
         </w:rPr>
       </w:pPr>
-      <w:hyperlink w:anchor="_Toc238840573" w:history="1">
+      <w:hyperlink w:anchor="_Toc238840699" w:history="1">
         <w:r>
           <w:rPr>
             <w:rStyle w:val="Hyperlink"/>
@@ -12656,7 +12659,7 @@
             <w:noProof/>
             <w:webHidden/>
           </w:rPr>
-          <w:instrText xml:space="preserve"> PAGEREF _Toc238840573 \h </w:instrText>
+          <w:instrText xml:space="preserve"> PAGEREF _Toc238840699 \h </w:instrText>
         </w:r>
         <w:r>
           <w:rPr>
@@ -12702,7 +12705,7 @@
           <w14:ligatures w14:val="standardContextual"/>
         </w:rPr>
       </w:pPr>
-      <w:hyperlink w:anchor="_Toc238840574" w:history="1">
+      <w:hyperlink w:anchor="_Toc238840700" w:history="1">
         <w:r>
           <w:rPr>
             <w:rStyle w:val="Hyperlink"/>
@@ -12730,7 +12733,7 @@
             <w:noProof/>
             <w:webHidden/>
           </w:rPr>
-          <w:instrText xml:space="preserve"> PAGEREF _Toc238840574 \h </w:instrText>
+          <w:instrText xml:space="preserve"> PAGEREF _Toc238840700 \h </w:instrText>
         </w:r>
         <w:r>
           <w:rPr>
@@ -12776,7 +12779,7 @@
           <w14:ligatures w14:val="standardContextual"/>
         </w:rPr>
       </w:pPr>
-      <w:hyperlink w:anchor="_Toc238840575" w:history="1">
+      <w:hyperlink w:anchor="_Toc238840701" w:history="1">
         <w:r>
           <w:rPr>
             <w:rStyle w:val="Hyperlink"/>
@@ -12804,7 +12807,7 @@
             <w:noProof/>
             <w:webHidden/>
           </w:rPr>
-          <w:instrText xml:space="preserve"> PAGEREF _Toc238840575 \h </w:instrText>
+          <w:instrText xml:space="preserve"> PAGEREF _Toc238840701 \h </w:instrText>
         </w:r>
         <w:r>
           <w:rPr>
@@ -12850,7 +12853,7 @@
           <w14:ligatures w14:val="standardContextual"/>
         </w:rPr>
       </w:pPr>
-      <w:hyperlink w:anchor="_Toc238840576" w:history="1">
+      <w:hyperlink w:anchor="_Toc238840702" w:history="1">
         <w:r>
           <w:rPr>
             <w:rStyle w:val="Hyperlink"/>
@@ -12878,7 +12881,7 @@
             <w:noProof/>
             <w:webHidden/>
           </w:rPr>
-          <w:instrText xml:space="preserve"> PAGEREF _Toc238840576 \h </w:instrText>
+          <w:instrText xml:space="preserve"> PAGEREF _Toc238840702 \h </w:instrText>
         </w:r>
         <w:r>
           <w:rPr>
@@ -14688,7 +14691,7 @@
           <w:lang w:eastAsia="de-DE"/>
         </w:rPr>
       </w:pPr>
-      <w:bookmarkStart w:id="10" w:name="_Toc238840550"/>
+      <w:bookmarkStart w:id="10" w:name="_Toc238840676"/>
       <w:r>
         <w:rPr>
           <w:rFonts w:ascii="Times New Roman" w:hAnsi="Times New Roman" w:cs="Times New Roman"/>
@@ -15100,7 +15103,7 @@
           <w:rFonts w:ascii="Times New Roman" w:hAnsi="Times New Roman" w:cs="Times New Roman"/>
         </w:rPr>
       </w:pPr>
-      <w:bookmarkStart w:id="14" w:name="_Toc238840551"/>
+      <w:bookmarkStart w:id="14" w:name="_Toc238840677"/>
       <w:r>
         <w:rPr>
           <w:rFonts w:ascii="Times New Roman" w:hAnsi="Times New Roman" w:cs="Times New Roman"/>
@@ -15256,7 +15259,7 @@
           <w:rFonts w:ascii="Times New Roman" w:hAnsi="Times New Roman" w:cs="Times New Roman"/>
         </w:rPr>
       </w:pPr>
-      <w:bookmarkStart w:id="16" w:name="_Toc238840552"/>
+      <w:bookmarkStart w:id="16" w:name="_Toc238840678"/>
       <w:r>
         <w:rPr>
           <w:rFonts w:ascii="Times New Roman" w:hAnsi="Times New Roman" w:cs="Times New Roman"/>
@@ -15623,7 +15626,7 @@
           <w:rFonts w:ascii="Times New Roman" w:hAnsi="Times New Roman" w:cs="Times New Roman"/>
         </w:rPr>
       </w:pPr>
-      <w:bookmarkStart w:id="18" w:name="_Toc238840553"/>
+      <w:bookmarkStart w:id="18" w:name="_Toc238840679"/>
       <w:r>
         <w:rPr>
           <w:rFonts w:ascii="Times New Roman" w:hAnsi="Times New Roman" w:cs="Times New Roman"/>
@@ -15776,7 +15779,7 @@
           <w:sz w:val="24"/>
         </w:rPr>
       </w:pPr>
-      <w:bookmarkStart w:id="20" w:name="_Toc238840554"/>
+      <w:bookmarkStart w:id="20" w:name="_Toc238840680"/>
       <w:r>
         <w:rPr>
           <w:rFonts w:ascii="Times New Roman" w:hAnsi="Times New Roman" w:cs="Times New Roman"/>
@@ -16867,7 +16870,7 @@
           <w:rFonts w:ascii="Times New Roman" w:hAnsi="Times New Roman" w:cs="Times New Roman"/>
         </w:rPr>
       </w:pPr>
-      <w:bookmarkStart w:id="22" w:name="_Toc238840555"/>
+      <w:bookmarkStart w:id="22" w:name="_Toc238840681"/>
       <w:r>
         <w:rPr>
           <w:rFonts w:ascii="Times New Roman" w:hAnsi="Times New Roman" w:cs="Times New Roman"/>
@@ -17020,7 +17023,7 @@
           <w:rFonts w:ascii="Times New Roman" w:hAnsi="Times New Roman" w:cs="Times New Roman"/>
         </w:rPr>
       </w:pPr>
-      <w:bookmarkStart w:id="24" w:name="_Toc238840556"/>
+      <w:bookmarkStart w:id="24" w:name="_Toc238840682"/>
       <w:r>
         <w:rPr>
           <w:rFonts w:ascii="Times New Roman" w:hAnsi="Times New Roman" w:cs="Times New Roman"/>
@@ -17179,7 +17182,7 @@
           <w:rFonts w:ascii="Times New Roman" w:hAnsi="Times New Roman" w:cs="Times New Roman"/>
         </w:rPr>
       </w:pPr>
-      <w:bookmarkStart w:id="26" w:name="_Toc238840557"/>
+      <w:bookmarkStart w:id="26" w:name="_Toc238840683"/>
       <w:r>
         <w:rPr>
           <w:rFonts w:ascii="Times New Roman" w:hAnsi="Times New Roman" w:cs="Times New Roman"/>
@@ -17461,7 +17464,7 @@
           <w:rFonts w:ascii="Times New Roman" w:hAnsi="Times New Roman" w:cs="Times New Roman"/>
         </w:rPr>
       </w:pPr>
-      <w:bookmarkStart w:id="28" w:name="_Toc238840558"/>
+      <w:bookmarkStart w:id="28" w:name="_Toc238840684"/>
       <w:r>
         <w:rPr>
           <w:rFonts w:ascii="Times New Roman" w:hAnsi="Times New Roman" w:cs="Times New Roman"/>
@@ -17586,7 +17589,7 @@
           <w:rFonts w:ascii="Times New Roman" w:hAnsi="Times New Roman" w:cs="Times New Roman"/>
         </w:rPr>
       </w:pPr>
-      <w:bookmarkStart w:id="29" w:name="_Toc238840559"/>
+      <w:bookmarkStart w:id="29" w:name="_Toc238840685"/>
       <w:r>
         <w:rPr>
           <w:rFonts w:ascii="Times New Roman" w:hAnsi="Times New Roman" w:cs="Times New Roman"/>
@@ -17784,7 +17787,7 @@
           <w:rFonts w:ascii="Times New Roman" w:hAnsi="Times New Roman" w:cs="Times New Roman"/>
         </w:rPr>
       </w:pPr>
-      <w:bookmarkStart w:id="31" w:name="_Toc238840560"/>
+      <w:bookmarkStart w:id="31" w:name="_Toc238840686"/>
       <w:r>
         <w:rPr>
           <w:rFonts w:ascii="Times New Roman" w:hAnsi="Times New Roman" w:cs="Times New Roman"/>
@@ -18464,7 +18467,7 @@
           <w:rFonts w:ascii="Times New Roman" w:hAnsi="Times New Roman" w:cs="Times New Roman"/>
         </w:rPr>
       </w:pPr>
-      <w:bookmarkStart w:id="36" w:name="_Toc238840561"/>
+      <w:bookmarkStart w:id="36" w:name="_Toc238840687"/>
       <w:r>
         <w:rPr>
           <w:rFonts w:ascii="Times New Roman" w:hAnsi="Times New Roman" w:cs="Times New Roman"/>
@@ -18737,7 +18740,7 @@
           <w:rFonts w:ascii="Times New Roman" w:hAnsi="Times New Roman" w:cs="Times New Roman"/>
         </w:rPr>
       </w:pPr>
-      <w:bookmarkStart w:id="38" w:name="_Toc238840562"/>
+      <w:bookmarkStart w:id="38" w:name="_Toc238840688"/>
       <w:r>
         <w:rPr>
           <w:rFonts w:ascii="Times New Roman" w:hAnsi="Times New Roman" w:cs="Times New Roman"/>
@@ -19558,7 +19561,7 @@
           <w:lang w:val="en-GB"/>
         </w:rPr>
       </w:pPr>
-      <w:bookmarkStart w:id="42" w:name="_Toc238840563"/>
+      <w:bookmarkStart w:id="42" w:name="_Toc238840689"/>
       <w:proofErr w:type="spellStart"/>
       <w:r>
         <w:rPr>
@@ -19706,7 +19709,7 @@
           <w:rFonts w:ascii="Times New Roman" w:hAnsi="Times New Roman" w:cs="Times New Roman"/>
         </w:rPr>
       </w:pPr>
-      <w:bookmarkStart w:id="43" w:name="_Toc238840564"/>
+      <w:bookmarkStart w:id="43" w:name="_Toc238840690"/>
       <w:r>
         <w:rPr>
           <w:rFonts w:ascii="Times New Roman" w:hAnsi="Times New Roman" w:cs="Times New Roman"/>
@@ -19962,7 +19965,7 @@
           <w:rFonts w:ascii="Times New Roman" w:hAnsi="Times New Roman" w:cs="Times New Roman"/>
         </w:rPr>
       </w:pPr>
-      <w:bookmarkStart w:id="45" w:name="_Toc238840565"/>
+      <w:bookmarkStart w:id="45" w:name="_Toc238840691"/>
       <w:r>
         <w:rPr>
           <w:rFonts w:ascii="Times New Roman" w:hAnsi="Times New Roman" w:cs="Times New Roman"/>
@@ -21351,7 +21354,7 @@
           <w:rFonts w:ascii="Times New Roman" w:hAnsi="Times New Roman" w:cs="Times New Roman"/>
         </w:rPr>
       </w:pPr>
-      <w:bookmarkStart w:id="51" w:name="_Toc238840566"/>
+      <w:bookmarkStart w:id="51" w:name="_Toc238840692"/>
       <w:r>
         <w:rPr>
           <w:rFonts w:ascii="Times New Roman" w:hAnsi="Times New Roman" w:cs="Times New Roman"/>
@@ -21802,7 +21805,7 @@
           <w:rFonts w:ascii="Times New Roman" w:hAnsi="Times New Roman" w:cs="Times New Roman"/>
         </w:rPr>
       </w:pPr>
-      <w:bookmarkStart w:id="55" w:name="_Toc238840567"/>
+      <w:bookmarkStart w:id="55" w:name="_Toc238840693"/>
       <w:r>
         <w:rPr>
           <w:rFonts w:ascii="Times New Roman" w:hAnsi="Times New Roman" w:cs="Times New Roman"/>
@@ -22556,7 +22559,7 @@
           <w:lang w:val="en-GB"/>
         </w:rPr>
       </w:pPr>
-      <w:bookmarkStart w:id="59" w:name="_Toc238840568"/>
+      <w:bookmarkStart w:id="59" w:name="_Toc238840694"/>
       <w:proofErr w:type="spellStart"/>
       <w:r>
         <w:rPr>
@@ -24394,28 +24397,60 @@
                             <w:pPr>
                               <w:pStyle w:val="Beschriftung"/>
                               <w:rPr>
-                                <w:rFonts w:ascii="Courier New" w:eastAsia="Times New Roman" w:hAnsi="Courier New" w:cs="Courier New"/>
+                                <w:rFonts w:ascii="Times New Roman" w:eastAsia="Times New Roman" w:hAnsi="Times New Roman" w:cs="Times New Roman"/>
                                 <w:noProof/>
                                 <w:sz w:val="20"/>
                                 <w:szCs w:val="20"/>
                               </w:rPr>
                             </w:pPr>
-                            <w:bookmarkStart w:id="66" w:name="_Toc238840569"/>
+                            <w:bookmarkStart w:id="66" w:name="_Toc238840695"/>
                             <w:r>
+                              <w:rPr>
+                                <w:rFonts w:ascii="Times New Roman" w:hAnsi="Times New Roman" w:cs="Times New Roman"/>
+                              </w:rPr>
                               <w:t xml:space="preserve">Abbildung </w:t>
                             </w:r>
-                            <w:fldSimple w:instr=" SEQ Abbildung \* ARABIC ">
-                              <w:r>
-                                <w:rPr>
-                                  <w:noProof/>
-                                </w:rPr>
-                                <w:t>20</w:t>
-                              </w:r>
-                            </w:fldSimple>
                             <w:r>
+                              <w:rPr>
+                                <w:rFonts w:ascii="Times New Roman" w:hAnsi="Times New Roman" w:cs="Times New Roman"/>
+                              </w:rPr>
+                              <w:fldChar w:fldCharType="begin"/>
+                            </w:r>
+                            <w:r>
+                              <w:rPr>
+                                <w:rFonts w:ascii="Times New Roman" w:hAnsi="Times New Roman" w:cs="Times New Roman"/>
+                              </w:rPr>
+                              <w:instrText xml:space="preserve"> SEQ Abbildung \* ARABIC </w:instrText>
+                            </w:r>
+                            <w:r>
+                              <w:rPr>
+                                <w:rFonts w:ascii="Times New Roman" w:hAnsi="Times New Roman" w:cs="Times New Roman"/>
+                              </w:rPr>
+                              <w:fldChar w:fldCharType="separate"/>
+                            </w:r>
+                            <w:r>
+                              <w:rPr>
+                                <w:rFonts w:ascii="Times New Roman" w:hAnsi="Times New Roman" w:cs="Times New Roman"/>
+                                <w:noProof/>
+                              </w:rPr>
+                              <w:t>20</w:t>
+                            </w:r>
+                            <w:r>
+                              <w:rPr>
+                                <w:rFonts w:ascii="Times New Roman" w:hAnsi="Times New Roman" w:cs="Times New Roman"/>
+                              </w:rPr>
+                              <w:fldChar w:fldCharType="end"/>
+                            </w:r>
+                            <w:r>
+                              <w:rPr>
+                                <w:rFonts w:ascii="Times New Roman" w:hAnsi="Times New Roman" w:cs="Times New Roman"/>
+                              </w:rPr>
                               <w:t xml:space="preserve">, Display </w:t>
                             </w:r>
                             <w:r>
+                              <w:rPr>
+                                <w:rFonts w:ascii="Times New Roman" w:hAnsi="Times New Roman" w:cs="Times New Roman"/>
+                              </w:rPr>
                               <w:t>Hauptseite</w:t>
                             </w:r>
                             <w:bookmarkEnd w:id="66"/>
@@ -24446,28 +24481,60 @@
                       <w:pPr>
                         <w:pStyle w:val="Beschriftung"/>
                         <w:rPr>
-                          <w:rFonts w:ascii="Courier New" w:eastAsia="Times New Roman" w:hAnsi="Courier New" w:cs="Courier New"/>
+                          <w:rFonts w:ascii="Times New Roman" w:eastAsia="Times New Roman" w:hAnsi="Times New Roman" w:cs="Times New Roman"/>
                           <w:noProof/>
                           <w:sz w:val="20"/>
                           <w:szCs w:val="20"/>
                         </w:rPr>
                       </w:pPr>
-                      <w:bookmarkStart w:id="67" w:name="_Toc238840569"/>
+                      <w:bookmarkStart w:id="67" w:name="_Toc238840695"/>
                       <w:r>
+                        <w:rPr>
+                          <w:rFonts w:ascii="Times New Roman" w:hAnsi="Times New Roman" w:cs="Times New Roman"/>
+                        </w:rPr>
                         <w:t xml:space="preserve">Abbildung </w:t>
                       </w:r>
-                      <w:fldSimple w:instr=" SEQ Abbildung \* ARABIC ">
-                        <w:r>
-                          <w:rPr>
-                            <w:noProof/>
-                          </w:rPr>
-                          <w:t>20</w:t>
-                        </w:r>
-                      </w:fldSimple>
                       <w:r>
+                        <w:rPr>
+                          <w:rFonts w:ascii="Times New Roman" w:hAnsi="Times New Roman" w:cs="Times New Roman"/>
+                        </w:rPr>
+                        <w:fldChar w:fldCharType="begin"/>
+                      </w:r>
+                      <w:r>
+                        <w:rPr>
+                          <w:rFonts w:ascii="Times New Roman" w:hAnsi="Times New Roman" w:cs="Times New Roman"/>
+                        </w:rPr>
+                        <w:instrText xml:space="preserve"> SEQ Abbildung \* ARABIC </w:instrText>
+                      </w:r>
+                      <w:r>
+                        <w:rPr>
+                          <w:rFonts w:ascii="Times New Roman" w:hAnsi="Times New Roman" w:cs="Times New Roman"/>
+                        </w:rPr>
+                        <w:fldChar w:fldCharType="separate"/>
+                      </w:r>
+                      <w:r>
+                        <w:rPr>
+                          <w:rFonts w:ascii="Times New Roman" w:hAnsi="Times New Roman" w:cs="Times New Roman"/>
+                          <w:noProof/>
+                        </w:rPr>
+                        <w:t>20</w:t>
+                      </w:r>
+                      <w:r>
+                        <w:rPr>
+                          <w:rFonts w:ascii="Times New Roman" w:hAnsi="Times New Roman" w:cs="Times New Roman"/>
+                        </w:rPr>
+                        <w:fldChar w:fldCharType="end"/>
+                      </w:r>
+                      <w:r>
+                        <w:rPr>
+                          <w:rFonts w:ascii="Times New Roman" w:hAnsi="Times New Roman" w:cs="Times New Roman"/>
+                        </w:rPr>
                         <w:t xml:space="preserve">, Display </w:t>
                       </w:r>
                       <w:r>
+                        <w:rPr>
+                          <w:rFonts w:ascii="Times New Roman" w:hAnsi="Times New Roman" w:cs="Times New Roman"/>
+                        </w:rPr>
                         <w:t>Hauptseite</w:t>
                       </w:r>
                       <w:bookmarkEnd w:id="67"/>
@@ -24955,25 +25022,54 @@
                             <w:pPr>
                               <w:pStyle w:val="Beschriftung"/>
                               <w:rPr>
-                                <w:rFonts w:ascii="Courier New" w:eastAsia="Times New Roman" w:hAnsi="Courier New" w:cs="Courier New"/>
+                                <w:rFonts w:ascii="Times New Roman" w:eastAsia="Times New Roman" w:hAnsi="Times New Roman" w:cs="Times New Roman"/>
                                 <w:noProof/>
                                 <w:sz w:val="20"/>
                                 <w:szCs w:val="20"/>
                               </w:rPr>
                             </w:pPr>
-                            <w:bookmarkStart w:id="69" w:name="_Toc238840570"/>
+                            <w:bookmarkStart w:id="69" w:name="_Toc238840696"/>
                             <w:r>
+                              <w:rPr>
+                                <w:rFonts w:ascii="Times New Roman" w:hAnsi="Times New Roman" w:cs="Times New Roman"/>
+                              </w:rPr>
                               <w:t xml:space="preserve">Abbildung </w:t>
                             </w:r>
-                            <w:fldSimple w:instr=" SEQ Abbildung \* ARABIC ">
-                              <w:r>
-                                <w:rPr>
-                                  <w:noProof/>
-                                </w:rPr>
-                                <w:t>21</w:t>
-                              </w:r>
-                            </w:fldSimple>
                             <w:r>
+                              <w:rPr>
+                                <w:rFonts w:ascii="Times New Roman" w:hAnsi="Times New Roman" w:cs="Times New Roman"/>
+                              </w:rPr>
+                              <w:fldChar w:fldCharType="begin"/>
+                            </w:r>
+                            <w:r>
+                              <w:rPr>
+                                <w:rFonts w:ascii="Times New Roman" w:hAnsi="Times New Roman" w:cs="Times New Roman"/>
+                              </w:rPr>
+                              <w:instrText xml:space="preserve"> SEQ Abbildung \* ARABIC </w:instrText>
+                            </w:r>
+                            <w:r>
+                              <w:rPr>
+                                <w:rFonts w:ascii="Times New Roman" w:hAnsi="Times New Roman" w:cs="Times New Roman"/>
+                              </w:rPr>
+                              <w:fldChar w:fldCharType="separate"/>
+                            </w:r>
+                            <w:r>
+                              <w:rPr>
+                                <w:rFonts w:ascii="Times New Roman" w:hAnsi="Times New Roman" w:cs="Times New Roman"/>
+                                <w:noProof/>
+                              </w:rPr>
+                              <w:t>21</w:t>
+                            </w:r>
+                            <w:r>
+                              <w:rPr>
+                                <w:rFonts w:ascii="Times New Roman" w:hAnsi="Times New Roman" w:cs="Times New Roman"/>
+                              </w:rPr>
+                              <w:fldChar w:fldCharType="end"/>
+                            </w:r>
+                            <w:r>
+                              <w:rPr>
+                                <w:rFonts w:ascii="Times New Roman" w:hAnsi="Times New Roman" w:cs="Times New Roman"/>
+                              </w:rPr>
                               <w:t>, Display Detailseite</w:t>
                             </w:r>
                             <w:bookmarkEnd w:id="69"/>
@@ -25001,25 +25097,54 @@
                       <w:pPr>
                         <w:pStyle w:val="Beschriftung"/>
                         <w:rPr>
-                          <w:rFonts w:ascii="Courier New" w:eastAsia="Times New Roman" w:hAnsi="Courier New" w:cs="Courier New"/>
+                          <w:rFonts w:ascii="Times New Roman" w:eastAsia="Times New Roman" w:hAnsi="Times New Roman" w:cs="Times New Roman"/>
                           <w:noProof/>
                           <w:sz w:val="20"/>
                           <w:szCs w:val="20"/>
                         </w:rPr>
                       </w:pPr>
-                      <w:bookmarkStart w:id="70" w:name="_Toc238840570"/>
+                      <w:bookmarkStart w:id="70" w:name="_Toc238840696"/>
                       <w:r>
+                        <w:rPr>
+                          <w:rFonts w:ascii="Times New Roman" w:hAnsi="Times New Roman" w:cs="Times New Roman"/>
+                        </w:rPr>
                         <w:t xml:space="preserve">Abbildung </w:t>
                       </w:r>
-                      <w:fldSimple w:instr=" SEQ Abbildung \* ARABIC ">
-                        <w:r>
-                          <w:rPr>
-                            <w:noProof/>
-                          </w:rPr>
-                          <w:t>21</w:t>
-                        </w:r>
-                      </w:fldSimple>
                       <w:r>
+                        <w:rPr>
+                          <w:rFonts w:ascii="Times New Roman" w:hAnsi="Times New Roman" w:cs="Times New Roman"/>
+                        </w:rPr>
+                        <w:fldChar w:fldCharType="begin"/>
+                      </w:r>
+                      <w:r>
+                        <w:rPr>
+                          <w:rFonts w:ascii="Times New Roman" w:hAnsi="Times New Roman" w:cs="Times New Roman"/>
+                        </w:rPr>
+                        <w:instrText xml:space="preserve"> SEQ Abbildung \* ARABIC </w:instrText>
+                      </w:r>
+                      <w:r>
+                        <w:rPr>
+                          <w:rFonts w:ascii="Times New Roman" w:hAnsi="Times New Roman" w:cs="Times New Roman"/>
+                        </w:rPr>
+                        <w:fldChar w:fldCharType="separate"/>
+                      </w:r>
+                      <w:r>
+                        <w:rPr>
+                          <w:rFonts w:ascii="Times New Roman" w:hAnsi="Times New Roman" w:cs="Times New Roman"/>
+                          <w:noProof/>
+                        </w:rPr>
+                        <w:t>21</w:t>
+                      </w:r>
+                      <w:r>
+                        <w:rPr>
+                          <w:rFonts w:ascii="Times New Roman" w:hAnsi="Times New Roman" w:cs="Times New Roman"/>
+                        </w:rPr>
+                        <w:fldChar w:fldCharType="end"/>
+                      </w:r>
+                      <w:r>
+                        <w:rPr>
+                          <w:rFonts w:ascii="Times New Roman" w:hAnsi="Times New Roman" w:cs="Times New Roman"/>
+                        </w:rPr>
                         <w:t>, Display Detailseite</w:t>
                       </w:r>
                       <w:bookmarkEnd w:id="70"/>
@@ -25416,19 +25541,48 @@
                                 <w:noProof/>
                               </w:rPr>
                             </w:pPr>
-                            <w:bookmarkStart w:id="72" w:name="_Toc238840571"/>
+                            <w:bookmarkStart w:id="72" w:name="_Toc238840697"/>
                             <w:r>
+                              <w:rPr>
+                                <w:rFonts w:ascii="Times New Roman" w:hAnsi="Times New Roman" w:cs="Times New Roman"/>
+                              </w:rPr>
                               <w:t xml:space="preserve">Abbildung </w:t>
                             </w:r>
-                            <w:fldSimple w:instr=" SEQ Abbildung \* ARABIC ">
-                              <w:r>
-                                <w:rPr>
-                                  <w:noProof/>
-                                </w:rPr>
-                                <w:t>22</w:t>
-                              </w:r>
-                            </w:fldSimple>
                             <w:r>
+                              <w:rPr>
+                                <w:rFonts w:ascii="Times New Roman" w:hAnsi="Times New Roman" w:cs="Times New Roman"/>
+                              </w:rPr>
+                              <w:fldChar w:fldCharType="begin"/>
+                            </w:r>
+                            <w:r>
+                              <w:rPr>
+                                <w:rFonts w:ascii="Times New Roman" w:hAnsi="Times New Roman" w:cs="Times New Roman"/>
+                              </w:rPr>
+                              <w:instrText xml:space="preserve"> SEQ Abbildung \* ARABIC </w:instrText>
+                            </w:r>
+                            <w:r>
+                              <w:rPr>
+                                <w:rFonts w:ascii="Times New Roman" w:hAnsi="Times New Roman" w:cs="Times New Roman"/>
+                              </w:rPr>
+                              <w:fldChar w:fldCharType="separate"/>
+                            </w:r>
+                            <w:r>
+                              <w:rPr>
+                                <w:rFonts w:ascii="Times New Roman" w:hAnsi="Times New Roman" w:cs="Times New Roman"/>
+                                <w:noProof/>
+                              </w:rPr>
+                              <w:t>22</w:t>
+                            </w:r>
+                            <w:r>
+                              <w:rPr>
+                                <w:rFonts w:ascii="Times New Roman" w:hAnsi="Times New Roman" w:cs="Times New Roman"/>
+                              </w:rPr>
+                              <w:fldChar w:fldCharType="end"/>
+                            </w:r>
+                            <w:r>
+                              <w:rPr>
+                                <w:rFonts w:ascii="Times New Roman" w:hAnsi="Times New Roman" w:cs="Times New Roman"/>
+                              </w:rPr>
                               <w:t>, Anzeige Drehmodus</w:t>
                             </w:r>
                             <w:bookmarkEnd w:id="72"/>
@@ -25460,19 +25614,48 @@
                           <w:noProof/>
                         </w:rPr>
                       </w:pPr>
-                      <w:bookmarkStart w:id="73" w:name="_Toc238840571"/>
+                      <w:bookmarkStart w:id="73" w:name="_Toc238840697"/>
                       <w:r>
+                        <w:rPr>
+                          <w:rFonts w:ascii="Times New Roman" w:hAnsi="Times New Roman" w:cs="Times New Roman"/>
+                        </w:rPr>
                         <w:t xml:space="preserve">Abbildung </w:t>
                       </w:r>
-                      <w:fldSimple w:instr=" SEQ Abbildung \* ARABIC ">
-                        <w:r>
-                          <w:rPr>
-                            <w:noProof/>
-                          </w:rPr>
-                          <w:t>22</w:t>
-                        </w:r>
-                      </w:fldSimple>
                       <w:r>
+                        <w:rPr>
+                          <w:rFonts w:ascii="Times New Roman" w:hAnsi="Times New Roman" w:cs="Times New Roman"/>
+                        </w:rPr>
+                        <w:fldChar w:fldCharType="begin"/>
+                      </w:r>
+                      <w:r>
+                        <w:rPr>
+                          <w:rFonts w:ascii="Times New Roman" w:hAnsi="Times New Roman" w:cs="Times New Roman"/>
+                        </w:rPr>
+                        <w:instrText xml:space="preserve"> SEQ Abbildung \* ARABIC </w:instrText>
+                      </w:r>
+                      <w:r>
+                        <w:rPr>
+                          <w:rFonts w:ascii="Times New Roman" w:hAnsi="Times New Roman" w:cs="Times New Roman"/>
+                        </w:rPr>
+                        <w:fldChar w:fldCharType="separate"/>
+                      </w:r>
+                      <w:r>
+                        <w:rPr>
+                          <w:rFonts w:ascii="Times New Roman" w:hAnsi="Times New Roman" w:cs="Times New Roman"/>
+                          <w:noProof/>
+                        </w:rPr>
+                        <w:t>22</w:t>
+                      </w:r>
+                      <w:r>
+                        <w:rPr>
+                          <w:rFonts w:ascii="Times New Roman" w:hAnsi="Times New Roman" w:cs="Times New Roman"/>
+                        </w:rPr>
+                        <w:fldChar w:fldCharType="end"/>
+                      </w:r>
+                      <w:r>
+                        <w:rPr>
+                          <w:rFonts w:ascii="Times New Roman" w:hAnsi="Times New Roman" w:cs="Times New Roman"/>
+                        </w:rPr>
                         <w:t>, Anzeige Drehmodus</w:t>
                       </w:r>
                       <w:bookmarkEnd w:id="73"/>
@@ -25715,7 +25898,7 @@
                                 <w:noProof/>
                               </w:rPr>
                             </w:pPr>
-                            <w:bookmarkStart w:id="74" w:name="_Toc238840572"/>
+                            <w:bookmarkStart w:id="74" w:name="_Toc238840698"/>
                             <w:r>
                               <w:t xml:space="preserve">Abbildung </w:t>
                             </w:r>
@@ -25759,7 +25942,7 @@
                           <w:noProof/>
                         </w:rPr>
                       </w:pPr>
-                      <w:bookmarkStart w:id="75" w:name="_Toc238840572"/>
+                      <w:bookmarkStart w:id="75" w:name="_Toc238840698"/>
                       <w:r>
                         <w:t xml:space="preserve">Abbildung </w:t>
                       </w:r>
@@ -26845,7 +27028,7 @@
           <w:rFonts w:ascii="Times New Roman" w:hAnsi="Times New Roman" w:cs="Times New Roman"/>
         </w:rPr>
       </w:pPr>
-      <w:bookmarkStart w:id="80" w:name="_Toc238840573"/>
+      <w:bookmarkStart w:id="80" w:name="_Toc238840699"/>
       <w:r>
         <w:rPr>
           <w:rFonts w:ascii="Times New Roman" w:hAnsi="Times New Roman" w:cs="Times New Roman"/>
@@ -26970,7 +27153,7 @@
           <w:rFonts w:ascii="Times New Roman" w:hAnsi="Times New Roman" w:cs="Times New Roman"/>
         </w:rPr>
       </w:pPr>
-      <w:bookmarkStart w:id="81" w:name="_Toc238840574"/>
+      <w:bookmarkStart w:id="81" w:name="_Toc238840700"/>
       <w:r>
         <w:rPr>
           <w:rFonts w:ascii="Times New Roman" w:hAnsi="Times New Roman" w:cs="Times New Roman"/>
@@ -27221,7 +27404,7 @@
           <w:rFonts w:ascii="Times New Roman" w:hAnsi="Times New Roman" w:cs="Times New Roman"/>
         </w:rPr>
       </w:pPr>
-      <w:bookmarkStart w:id="83" w:name="_Toc238840575"/>
+      <w:bookmarkStart w:id="83" w:name="_Toc238840701"/>
       <w:r>
         <w:rPr>
           <w:rFonts w:ascii="Times New Roman" w:hAnsi="Times New Roman" w:cs="Times New Roman"/>
@@ -27515,7 +27698,7 @@
           <w:rFonts w:ascii="Times New Roman" w:hAnsi="Times New Roman" w:cs="Times New Roman"/>
         </w:rPr>
       </w:pPr>
-      <w:bookmarkStart w:id="85" w:name="_Toc238840576"/>
+      <w:bookmarkStart w:id="85" w:name="_Toc238840702"/>
       <w:r>
         <w:rPr>
           <w:rFonts w:ascii="Times New Roman" w:hAnsi="Times New Roman" w:cs="Times New Roman"/>

</xml_diff>